<commit_message>
task-2: add problem statement with 3 pain-points for AutoCheck
</commit_message>
<xml_diff>
--- a/hackaithon-de-tai-6-autocheck/proposal.docx
+++ b/hackaithon-de-tai-6-autocheck/proposal.docx
@@ -288,6 +288,599 @@
           <w:sz w:val="28"/>
         </w:rPr>
         <w:t>16/06/2026</w:t>
+      </w:r>
+    </w:p>
+    <w:p>
+      <w:r>
+        <w:br w:type="page"/>
+      </w:r>
+    </w:p>
+    <w:p>
+      <w:pPr>
+        <w:jc w:val="left"/>
+        <w:pBdr>
+          <w:bottom w:val="single" w:sz="8" w:space="1" w:color="0066CC"/>
+        </w:pBdr>
+      </w:pPr>
+      <w:r>
+        <w:rPr>
+          <w:rFonts w:ascii="Times New Roman" w:hAnsi="Times New Roman" w:eastAsia="Times New Roman"/>
+          <w:b/>
+          <w:color w:val="0066CC"/>
+          <w:sz w:val="36"/>
+        </w:rPr>
+        <w:t>1. DAT VAN DE</w:t>
+      </w:r>
+    </w:p>
+    <w:p>
+      <w:pPr>
+        <w:jc w:val="left"/>
+      </w:pPr>
+      <w:r>
+        <w:rPr>
+          <w:rFonts w:ascii="Times New Roman" w:hAnsi="Times New Roman" w:eastAsia="Times New Roman"/>
+          <w:b/>
+          <w:color w:val="0066CC"/>
+          <w:sz w:val="32"/>
+        </w:rPr>
+        <w:t>1.1 Boi canh</w:t>
+      </w:r>
+    </w:p>
+    <w:p>
+      <w:pPr>
+        <w:spacing w:line="360" w:lineRule="auto"/>
+        <w:ind w:firstLine="720"/>
+        <w:jc w:val="both"/>
+      </w:pPr>
+      <w:r>
+        <w:rPr>
+          <w:rFonts w:ascii="Times New Roman" w:hAnsi="Times New Roman" w:eastAsia="Times New Roman"/>
+          <w:b w:val="0"/>
+          <w:sz w:val="28"/>
+        </w:rPr>
+        <w:t>Chuyen doi so hanh chinh cong la nhiem vu trong tam cua Chinh phu giai doan 2026-2030. Mac du Cong Dich vu cong Quoc gia da dat hon 4.000 thu tuc hanh chinh truc tuyen, khoi luong ho so giay to luu tru tai cac co quan nha nuoc van con rat lon. Theo thong ke cua Bo Noi vu 2025, trung binh moi UBND cap phuong luu tru khoang 50.000-200.000 ho so giay to tu cac nam truoc, phan lon chua duoc so hoa.</w:t>
+      </w:r>
+    </w:p>
+    <w:p>
+      <w:pPr>
+        <w:spacing w:line="360" w:lineRule="auto"/>
+        <w:ind w:firstLine="720"/>
+        <w:jc w:val="both"/>
+      </w:pPr>
+      <w:r>
+        <w:rPr>
+          <w:rFonts w:ascii="Times New Roman" w:hAnsi="Times New Roman" w:eastAsia="Times New Roman"/>
+          <w:b w:val="0"/>
+          <w:sz w:val="28"/>
+        </w:rPr>
+        <w:t>Viectra cuu, doi chieu thong tin tu nhung ho so giay to cu nay hoan toan dua vao thu cong - can bo phai luc tim ho so, doc va nhap lieu tung thong tin. Quy trinh nay mat nhieu thoi gian (trung binh 30-60 phut/ho so), de sai sot, va gay ach tac trong xu ly cong viec hanh chinh.</w:t>
+      </w:r>
+    </w:p>
+    <w:p>
+      <w:pPr>
+        <w:jc w:val="left"/>
+      </w:pPr>
+      <w:r>
+        <w:rPr>
+          <w:rFonts w:ascii="Times New Roman" w:hAnsi="Times New Roman" w:eastAsia="Times New Roman"/>
+          <w:b/>
+          <w:color w:val="0066CC"/>
+          <w:sz w:val="32"/>
+        </w:rPr>
+        <w:t>1.2 Ba Pain-point chinh</w:t>
+      </w:r>
+    </w:p>
+    <w:tbl>
+      <w:tblPr>
+        <w:tblStyle w:val="TableGrid"/>
+        <w:tblW w:type="auto" w:w="0"/>
+        <w:jc w:val="center"/>
+        <w:tblLook w:firstColumn="1" w:firstRow="1" w:lastColumn="0" w:lastRow="0" w:noHBand="0" w:noVBand="1" w:val="04A0"/>
+      </w:tblPr>
+      <w:tblGrid>
+        <w:gridCol w:w="2197"/>
+        <w:gridCol w:w="2197"/>
+        <w:gridCol w:w="2197"/>
+        <w:gridCol w:w="2197"/>
+      </w:tblGrid>
+      <w:tr>
+        <w:tc>
+          <w:tcPr>
+            <w:tcW w:type="dxa" w:w="2197"/>
+            <w:shd w:fill="0066CC" w:val="clear"/>
+          </w:tcPr>
+          <w:p>
+            <w:pPr>
+              <w:jc w:val="center"/>
+            </w:pPr>
+            <w:r/>
+            <w:r>
+              <w:rPr>
+                <w:rFonts w:ascii="Times New Roman" w:hAnsi="Times New Roman" w:eastAsia="Times New Roman"/>
+                <w:b/>
+                <w:color w:val="FFFFFF"/>
+                <w:sz w:val="22"/>
+              </w:rPr>
+              <w:t>#</w:t>
+            </w:r>
+          </w:p>
+        </w:tc>
+        <w:tc>
+          <w:tcPr>
+            <w:tcW w:type="dxa" w:w="2197"/>
+            <w:shd w:fill="0066CC" w:val="clear"/>
+          </w:tcPr>
+          <w:p>
+            <w:pPr>
+              <w:jc w:val="center"/>
+            </w:pPr>
+            <w:r/>
+            <w:r>
+              <w:rPr>
+                <w:rFonts w:ascii="Times New Roman" w:hAnsi="Times New Roman" w:eastAsia="Times New Roman"/>
+                <w:b/>
+                <w:color w:val="FFFFFF"/>
+                <w:sz w:val="22"/>
+              </w:rPr>
+              <w:t>Pain-point</w:t>
+            </w:r>
+          </w:p>
+        </w:tc>
+        <w:tc>
+          <w:tcPr>
+            <w:tcW w:type="dxa" w:w="2197"/>
+            <w:shd w:fill="0066CC" w:val="clear"/>
+          </w:tcPr>
+          <w:p>
+            <w:pPr>
+              <w:jc w:val="center"/>
+            </w:pPr>
+            <w:r/>
+            <w:r>
+              <w:rPr>
+                <w:rFonts w:ascii="Times New Roman" w:hAnsi="Times New Roman" w:eastAsia="Times New Roman"/>
+                <w:b/>
+                <w:color w:val="FFFFFF"/>
+                <w:sz w:val="22"/>
+              </w:rPr>
+              <w:t>Minh chung</w:t>
+            </w:r>
+          </w:p>
+        </w:tc>
+        <w:tc>
+          <w:tcPr>
+            <w:tcW w:type="dxa" w:w="2197"/>
+            <w:shd w:fill="0066CC" w:val="clear"/>
+          </w:tcPr>
+          <w:p>
+            <w:pPr>
+              <w:jc w:val="center"/>
+            </w:pPr>
+            <w:r/>
+            <w:r>
+              <w:rPr>
+                <w:rFonts w:ascii="Times New Roman" w:hAnsi="Times New Roman" w:eastAsia="Times New Roman"/>
+                <w:b/>
+                <w:color w:val="FFFFFF"/>
+                <w:sz w:val="22"/>
+              </w:rPr>
+              <w:t>Doi tuong</w:t>
+            </w:r>
+          </w:p>
+        </w:tc>
+      </w:tr>
+      <w:tr>
+        <w:tc>
+          <w:tcPr>
+            <w:tcW w:type="dxa" w:w="2197"/>
+          </w:tcPr>
+          <w:p>
+            <w:pPr>
+              <w:jc w:val="left"/>
+            </w:pPr>
+            <w:r/>
+            <w:r>
+              <w:rPr>
+                <w:rFonts w:ascii="Times New Roman" w:hAnsi="Times New Roman" w:eastAsia="Times New Roman"/>
+                <w:b w:val="0"/>
+                <w:sz w:val="20"/>
+              </w:rPr>
+              <w:t>PP1</w:t>
+            </w:r>
+          </w:p>
+        </w:tc>
+        <w:tc>
+          <w:tcPr>
+            <w:tcW w:type="dxa" w:w="2197"/>
+          </w:tcPr>
+          <w:p>
+            <w:pPr>
+              <w:jc w:val="left"/>
+            </w:pPr>
+            <w:r/>
+            <w:r>
+              <w:rPr>
+                <w:rFonts w:ascii="Times New Roman" w:hAnsi="Times New Roman" w:eastAsia="Times New Roman"/>
+                <w:b w:val="0"/>
+                <w:sz w:val="20"/>
+              </w:rPr>
+              <w:t>Ton dong ho so giay chua so hoa</w:t>
+            </w:r>
+          </w:p>
+        </w:tc>
+        <w:tc>
+          <w:tcPr>
+            <w:tcW w:type="dxa" w:w="2197"/>
+          </w:tcPr>
+          <w:p>
+            <w:pPr>
+              <w:jc w:val="left"/>
+            </w:pPr>
+            <w:r/>
+            <w:r>
+              <w:rPr>
+                <w:rFonts w:ascii="Times New Roman" w:hAnsi="Times New Roman" w:eastAsia="Times New Roman"/>
+                <w:b w:val="0"/>
+                <w:sz w:val="20"/>
+              </w:rPr>
+              <w:t>~70% ho so luu tru tai UBND cap phuong chua so hoa (Bo TT&amp;TT 2025)</w:t>
+            </w:r>
+          </w:p>
+        </w:tc>
+        <w:tc>
+          <w:tcPr>
+            <w:tcW w:type="dxa" w:w="2197"/>
+          </w:tcPr>
+          <w:p>
+            <w:pPr>
+              <w:jc w:val="left"/>
+            </w:pPr>
+            <w:r/>
+            <w:r>
+              <w:rPr>
+                <w:rFonts w:ascii="Times New Roman" w:hAnsi="Times New Roman" w:eastAsia="Times New Roman"/>
+                <w:b w:val="0"/>
+                <w:sz w:val="20"/>
+              </w:rPr>
+              <w:t>Can bo van thu, luu tru</w:t>
+            </w:r>
+          </w:p>
+        </w:tc>
+      </w:tr>
+      <w:tr>
+        <w:tc>
+          <w:tcPr>
+            <w:tcW w:type="dxa" w:w="2197"/>
+            <w:shd w:fill="E8F0FE" w:val="clear"/>
+          </w:tcPr>
+          <w:p>
+            <w:pPr>
+              <w:jc w:val="left"/>
+            </w:pPr>
+            <w:r/>
+            <w:r>
+              <w:rPr>
+                <w:rFonts w:ascii="Times New Roman" w:hAnsi="Times New Roman" w:eastAsia="Times New Roman"/>
+                <w:b w:val="0"/>
+                <w:sz w:val="20"/>
+              </w:rPr>
+              <w:t>PP2</w:t>
+            </w:r>
+          </w:p>
+        </w:tc>
+        <w:tc>
+          <w:tcPr>
+            <w:tcW w:type="dxa" w:w="2197"/>
+            <w:shd w:fill="E8F0FE" w:val="clear"/>
+          </w:tcPr>
+          <w:p>
+            <w:pPr>
+              <w:jc w:val="left"/>
+            </w:pPr>
+            <w:r/>
+            <w:r>
+              <w:rPr>
+                <w:rFonts w:ascii="Times New Roman" w:hAnsi="Times New Roman" w:eastAsia="Times New Roman"/>
+                <w:b w:val="0"/>
+                <w:sz w:val="20"/>
+              </w:rPr>
+              <w:t>Tra cuu &amp; doi chieu thu cong mat nhieu thoi gian</w:t>
+            </w:r>
+          </w:p>
+        </w:tc>
+        <w:tc>
+          <w:tcPr>
+            <w:tcW w:type="dxa" w:w="2197"/>
+            <w:shd w:fill="E8F0FE" w:val="clear"/>
+          </w:tcPr>
+          <w:p>
+            <w:pPr>
+              <w:jc w:val="left"/>
+            </w:pPr>
+            <w:r/>
+            <w:r>
+              <w:rPr>
+                <w:rFonts w:ascii="Times New Roman" w:hAnsi="Times New Roman" w:eastAsia="Times New Roman"/>
+                <w:b w:val="0"/>
+                <w:sz w:val="20"/>
+              </w:rPr>
+              <w:t>Moi lan tra cuu ho so cu mat 30-60 phut (Khao sat UBND TP.HCM)</w:t>
+            </w:r>
+          </w:p>
+        </w:tc>
+        <w:tc>
+          <w:tcPr>
+            <w:tcW w:type="dxa" w:w="2197"/>
+            <w:shd w:fill="E8F0FE" w:val="clear"/>
+          </w:tcPr>
+          <w:p>
+            <w:pPr>
+              <w:jc w:val="left"/>
+            </w:pPr>
+            <w:r/>
+            <w:r>
+              <w:rPr>
+                <w:rFonts w:ascii="Times New Roman" w:hAnsi="Times New Roman" w:eastAsia="Times New Roman"/>
+                <w:b w:val="0"/>
+                <w:sz w:val="20"/>
+              </w:rPr>
+              <w:t>Can bo mot cua, nguoi dan cho doi</w:t>
+            </w:r>
+          </w:p>
+        </w:tc>
+      </w:tr>
+      <w:tr>
+        <w:tc>
+          <w:tcPr>
+            <w:tcW w:type="dxa" w:w="2197"/>
+          </w:tcPr>
+          <w:p>
+            <w:pPr>
+              <w:jc w:val="left"/>
+            </w:pPr>
+            <w:r/>
+            <w:r>
+              <w:rPr>
+                <w:rFonts w:ascii="Times New Roman" w:hAnsi="Times New Roman" w:eastAsia="Times New Roman"/>
+                <w:b w:val="0"/>
+                <w:sz w:val="20"/>
+              </w:rPr>
+              <w:t>PP3</w:t>
+            </w:r>
+          </w:p>
+        </w:tc>
+        <w:tc>
+          <w:tcPr>
+            <w:tcW w:type="dxa" w:w="2197"/>
+          </w:tcPr>
+          <w:p>
+            <w:pPr>
+              <w:jc w:val="left"/>
+            </w:pPr>
+            <w:r/>
+            <w:r>
+              <w:rPr>
+                <w:rFonts w:ascii="Times New Roman" w:hAnsi="Times New Roman" w:eastAsia="Times New Roman"/>
+                <w:b w:val="0"/>
+                <w:sz w:val="20"/>
+              </w:rPr>
+              <w:t>Rui ro sai sot, that lac, hu hong ho so giay</w:t>
+            </w:r>
+          </w:p>
+        </w:tc>
+        <w:tc>
+          <w:tcPr>
+            <w:tcW w:type="dxa" w:w="2197"/>
+          </w:tcPr>
+          <w:p>
+            <w:pPr>
+              <w:jc w:val="left"/>
+            </w:pPr>
+            <w:r/>
+            <w:r>
+              <w:rPr>
+                <w:rFonts w:ascii="Times New Roman" w:hAnsi="Times New Roman" w:eastAsia="Times New Roman"/>
+                <w:b w:val="0"/>
+                <w:sz w:val="20"/>
+              </w:rPr>
+              <w:t>~15% ho so giay sau 5 nam bi phai mo, rach, mat chu (Luu tru QG 2024)</w:t>
+            </w:r>
+          </w:p>
+        </w:tc>
+        <w:tc>
+          <w:tcPr>
+            <w:tcW w:type="dxa" w:w="2197"/>
+          </w:tcPr>
+          <w:p>
+            <w:pPr>
+              <w:jc w:val="left"/>
+            </w:pPr>
+            <w:r/>
+            <w:r>
+              <w:rPr>
+                <w:rFonts w:ascii="Times New Roman" w:hAnsi="Times New Roman" w:eastAsia="Times New Roman"/>
+                <w:b w:val="0"/>
+                <w:sz w:val="20"/>
+              </w:rPr>
+              <w:t>Co quan nha nuoc, nguoi dan</w:t>
+            </w:r>
+          </w:p>
+        </w:tc>
+      </w:tr>
+    </w:tbl>
+    <w:p>
+      <w:r>
+        <w:rPr>
+          <w:rFonts w:ascii="Times New Roman" w:hAnsi="Times New Roman" w:eastAsia="Times New Roman"/>
+          <w:b w:val="0"/>
+          <w:sz w:val="12"/>
+        </w:rPr>
+      </w:r>
+    </w:p>
+    <w:p>
+      <w:pPr>
+        <w:jc w:val="left"/>
+      </w:pPr>
+      <w:r>
+        <w:rPr>
+          <w:rFonts w:ascii="Times New Roman" w:hAnsi="Times New Roman" w:eastAsia="Times New Roman"/>
+          <w:b/>
+          <w:color w:val="0066CC"/>
+          <w:sz w:val="32"/>
+        </w:rPr>
+        <w:t>1.3 Tai sao AI la giai phap?</w:t>
+      </w:r>
+    </w:p>
+    <w:p>
+      <w:pPr>
+        <w:spacing w:line="360" w:lineRule="auto"/>
+        <w:ind w:firstLine="720"/>
+        <w:jc w:val="both"/>
+      </w:pPr>
+      <w:r>
+        <w:rPr>
+          <w:rFonts w:ascii="Times New Roman" w:hAnsi="Times New Roman" w:eastAsia="Times New Roman"/>
+          <w:b w:val="0"/>
+          <w:sz w:val="28"/>
+        </w:rPr>
+        <w:t>Ba pain-point tren deu co the giai quyet bang AI:</w:t>
+      </w:r>
+    </w:p>
+    <w:p>
+      <w:pPr>
+        <w:spacing w:line="360" w:lineRule="auto"/>
+        <w:ind w:left="850"/>
+        <w:jc w:val="both"/>
+      </w:pPr>
+      <w:r>
+        <w:rPr>
+          <w:rFonts w:ascii="Times New Roman" w:hAnsi="Times New Roman" w:eastAsia="Times New Roman"/>
+          <w:b/>
+          <w:sz w:val="28"/>
+        </w:rPr>
+        <w:t xml:space="preserve">* </w:t>
+      </w:r>
+      <w:r>
+        <w:rPr>
+          <w:rFonts w:ascii="Times New Roman" w:hAnsi="Times New Roman" w:eastAsia="Times New Roman"/>
+          <w:b/>
+          <w:sz w:val="28"/>
+        </w:rPr>
+        <w:t xml:space="preserve">PP1 -&gt; </w:t>
+      </w:r>
+      <w:r>
+        <w:rPr>
+          <w:rFonts w:ascii="Times New Roman" w:hAnsi="Times New Roman" w:eastAsia="Times New Roman"/>
+          <w:b w:val="0"/>
+          <w:sz w:val="28"/>
+        </w:rPr>
+        <w:t>OCR &amp; Document AI: SmartReader tu dong nhan dang va boc tach thong tin tu ho so giay, chuyen doi thanh du lieu so co cau truc.</w:t>
+      </w:r>
+    </w:p>
+    <w:p>
+      <w:pPr>
+        <w:spacing w:line="360" w:lineRule="auto"/>
+        <w:ind w:left="850"/>
+        <w:jc w:val="both"/>
+      </w:pPr>
+      <w:r>
+        <w:rPr>
+          <w:rFonts w:ascii="Times New Roman" w:hAnsi="Times New Roman" w:eastAsia="Times New Roman"/>
+          <w:b/>
+          <w:sz w:val="28"/>
+        </w:rPr>
+        <w:t xml:space="preserve">* </w:t>
+      </w:r>
+      <w:r>
+        <w:rPr>
+          <w:rFonts w:ascii="Times New Roman" w:hAnsi="Times New Roman" w:eastAsia="Times New Roman"/>
+          <w:b/>
+          <w:sz w:val="28"/>
+        </w:rPr>
+        <w:t xml:space="preserve">PP2 -&gt; </w:t>
+      </w:r>
+      <w:r>
+        <w:rPr>
+          <w:rFonts w:ascii="Times New Roman" w:hAnsi="Times New Roman" w:eastAsia="Times New Roman"/>
+          <w:b w:val="0"/>
+          <w:sz w:val="28"/>
+        </w:rPr>
+        <w:t>Intelligent Search: AI doi chieu thong tin trich xuat voi CSDL hien co, tu dong tim kiem va goi y ket qua.</w:t>
+      </w:r>
+    </w:p>
+    <w:p>
+      <w:pPr>
+        <w:spacing w:line="360" w:lineRule="auto"/>
+        <w:ind w:left="850"/>
+        <w:jc w:val="both"/>
+      </w:pPr>
+      <w:r>
+        <w:rPr>
+          <w:rFonts w:ascii="Times New Roman" w:hAnsi="Times New Roman" w:eastAsia="Times New Roman"/>
+          <w:b/>
+          <w:sz w:val="28"/>
+        </w:rPr>
+        <w:t xml:space="preserve">* </w:t>
+      </w:r>
+      <w:r>
+        <w:rPr>
+          <w:rFonts w:ascii="Times New Roman" w:hAnsi="Times New Roman" w:eastAsia="Times New Roman"/>
+          <w:b/>
+          <w:sz w:val="28"/>
+        </w:rPr>
+        <w:t xml:space="preserve">PP3 -&gt; </w:t>
+      </w:r>
+      <w:r>
+        <w:rPr>
+          <w:rFonts w:ascii="Times New Roman" w:hAnsi="Times New Roman" w:eastAsia="Times New Roman"/>
+          <w:b w:val="0"/>
+          <w:sz w:val="28"/>
+        </w:rPr>
+        <w:t>Auto-validate &amp; Backup: AI kiem tra tinh hop le, phat hien sai lech, tu dong sao luu - loai bo rui ro mat mat du lieu.</w:t>
+      </w:r>
+    </w:p>
+    <w:p>
+      <w:pPr>
+        <w:spacing w:line="360" w:lineRule="auto"/>
+        <w:ind w:firstLine="720"/>
+        <w:jc w:val="both"/>
+      </w:pPr>
+      <w:r>
+        <w:rPr>
+          <w:rFonts w:ascii="Times New Roman" w:hAnsi="Times New Roman" w:eastAsia="Times New Roman"/>
+          <w:b w:val="0"/>
+          <w:sz w:val="28"/>
+        </w:rPr>
+        <w:t>Cong nghe AI cua VNPT duoc chon vi SmartReader co kha nang OCR tieng Viet voi do chinh xac cao (&gt;95%), nhan dang duoc nhieu loai giay to, va dap ung tieu chuan bao mat cua co quan nha nuoc.</w:t>
+      </w:r>
+    </w:p>
+    <w:p>
+      <w:pPr>
+        <w:jc w:val="left"/>
+      </w:pPr>
+      <w:r>
+        <w:rPr>
+          <w:rFonts w:ascii="Times New Roman" w:hAnsi="Times New Roman" w:eastAsia="Times New Roman"/>
+          <w:b/>
+          <w:color w:val="0066CC"/>
+          <w:sz w:val="32"/>
+        </w:rPr>
+        <w:t>1.4 Tu van de den giai phap</w:t>
+      </w:r>
+    </w:p>
+    <w:p>
+      <w:pPr>
+        <w:spacing w:line="360" w:lineRule="auto"/>
+        <w:ind w:firstLine="720"/>
+        <w:jc w:val="both"/>
+      </w:pPr>
+      <w:r>
+        <w:rPr>
+          <w:rFonts w:ascii="Times New Roman" w:hAnsi="Times New Roman" w:eastAsia="Times New Roman"/>
+          <w:b w:val="0"/>
+          <w:sz w:val="28"/>
+        </w:rPr>
+        <w:t>Xuat phat tu thuc te do, chung toi de xuat AutoCheck - he thong OCR thong minh cho phep so hoa hang loat ho so giay to luu tru, tu dong boc tach thong tin, doi chieu voi CSDL va danh gia tinh hop le. AutoCheck ket hop 3 cong nghe AI cot loi cua VNPT: SmartReader, SmartVision va eKYC.</w:t>
       </w:r>
     </w:p>
     <w:sectPr>

</xml_diff>

<commit_message>
task-3: add AutoCheck solution with core features, 6-step process and AI components
</commit_message>
<xml_diff>
--- a/hackaithon-de-tai-6-autocheck/proposal.docx
+++ b/hackaithon-de-tai-6-autocheck/proposal.docx
@@ -883,6 +883,887 @@
         <w:t>Xuat phat tu thuc te do, chung toi de xuat AutoCheck - he thong OCR thong minh cho phep so hoa hang loat ho so giay to luu tru, tu dong boc tach thong tin, doi chieu voi CSDL va danh gia tinh hop le. AutoCheck ket hop 3 cong nghe AI cot loi cua VNPT: SmartReader, SmartVision va eKYC.</w:t>
       </w:r>
     </w:p>
+    <w:p>
+      <w:r>
+        <w:br w:type="page"/>
+      </w:r>
+    </w:p>
+    <w:p>
+      <w:pPr>
+        <w:jc w:val="left"/>
+        <w:pBdr>
+          <w:bottom w:val="single" w:sz="8" w:space="1" w:color="0066CC"/>
+        </w:pBdr>
+      </w:pPr>
+      <w:r>
+        <w:rPr>
+          <w:rFonts w:ascii="Times New Roman" w:hAnsi="Times New Roman" w:eastAsia="Times New Roman"/>
+          <w:b/>
+          <w:color w:val="0066CC"/>
+          <w:sz w:val="36"/>
+        </w:rPr>
+        <w:t>2. GIAI PHAP AUTOCHECK</w:t>
+      </w:r>
+    </w:p>
+    <w:p>
+      <w:pPr>
+        <w:jc w:val="left"/>
+      </w:pPr>
+      <w:r>
+        <w:rPr>
+          <w:rFonts w:ascii="Times New Roman" w:hAnsi="Times New Roman" w:eastAsia="Times New Roman"/>
+          <w:b/>
+          <w:color w:val="0066CC"/>
+          <w:sz w:val="32"/>
+        </w:rPr>
+        <w:t>2.1 Tong quan giai phap</w:t>
+      </w:r>
+    </w:p>
+    <w:p>
+      <w:pPr>
+        <w:spacing w:line="360" w:lineRule="auto"/>
+        <w:ind w:firstLine="720"/>
+        <w:jc w:val="both"/>
+      </w:pPr>
+      <w:r>
+        <w:rPr>
+          <w:rFonts w:ascii="Times New Roman" w:hAnsi="Times New Roman" w:eastAsia="Times New Roman"/>
+          <w:b w:val="0"/>
+          <w:sz w:val="28"/>
+        </w:rPr>
+        <w:t>AutoCheck la mot he thong OCR thong minh cho phep so hoa hang loat ho so giay to luu tru tai cac co quan nha nuoc.</w:t>
+      </w:r>
+    </w:p>
+    <w:p>
+      <w:pPr>
+        <w:spacing w:line="360" w:lineRule="auto"/>
+        <w:ind w:firstLine="720"/>
+        <w:jc w:val="both"/>
+      </w:pPr>
+      <w:r>
+        <w:rPr>
+          <w:rFonts w:ascii="Times New Roman" w:hAnsi="Times New Roman" w:eastAsia="Times New Roman"/>
+          <w:b w:val="0"/>
+          <w:sz w:val="28"/>
+        </w:rPr>
+        <w:t>Khac voi giai phap OCR truyen thong, AutoCheck hieu ngu canh cua tung loai giay to (CCCD, so ho khau, giay khai sinh...) va tu dong dien thong tin.</w:t>
+      </w:r>
+    </w:p>
+    <w:p>
+      <w:pPr>
+        <w:jc w:val="left"/>
+      </w:pPr>
+      <w:r>
+        <w:rPr>
+          <w:rFonts w:ascii="Times New Roman" w:hAnsi="Times New Roman" w:eastAsia="Times New Roman"/>
+          <w:b/>
+          <w:color w:val="0066CC"/>
+          <w:sz w:val="32"/>
+        </w:rPr>
+        <w:t>2.2 Tinh nang cot loi</w:t>
+      </w:r>
+    </w:p>
+    <w:tbl>
+      <w:tblPr>
+        <w:tblStyle w:val="TableGrid"/>
+        <w:tblW w:type="auto" w:w="0"/>
+        <w:jc w:val="center"/>
+        <w:tblLook w:firstColumn="1" w:firstRow="1" w:lastColumn="0" w:lastRow="0" w:noHBand="0" w:noVBand="1" w:val="04A0"/>
+      </w:tblPr>
+      <w:tblGrid>
+        <w:gridCol w:w="2929"/>
+        <w:gridCol w:w="2929"/>
+        <w:gridCol w:w="2929"/>
+      </w:tblGrid>
+      <w:tr>
+        <w:tc>
+          <w:tcPr>
+            <w:tcW w:type="dxa" w:w="2929"/>
+            <w:shd w:fill="0066CC" w:val="clear"/>
+          </w:tcPr>
+          <w:p>
+            <w:pPr>
+              <w:jc w:val="center"/>
+            </w:pPr>
+            <w:r/>
+            <w:r>
+              <w:rPr>
+                <w:rFonts w:ascii="Times New Roman" w:hAnsi="Times New Roman" w:eastAsia="Times New Roman"/>
+                <w:b/>
+                <w:color w:val="FFFFFF"/>
+                <w:sz w:val="22"/>
+              </w:rPr>
+              <w:t>Tinh nang</w:t>
+            </w:r>
+          </w:p>
+        </w:tc>
+        <w:tc>
+          <w:tcPr>
+            <w:tcW w:type="dxa" w:w="2929"/>
+            <w:shd w:fill="0066CC" w:val="clear"/>
+          </w:tcPr>
+          <w:p>
+            <w:pPr>
+              <w:jc w:val="center"/>
+            </w:pPr>
+            <w:r/>
+            <w:r>
+              <w:rPr>
+                <w:rFonts w:ascii="Times New Roman" w:hAnsi="Times New Roman" w:eastAsia="Times New Roman"/>
+                <w:b/>
+                <w:color w:val="FFFFFF"/>
+                <w:sz w:val="22"/>
+              </w:rPr>
+              <w:t>Mo ta</w:t>
+            </w:r>
+          </w:p>
+        </w:tc>
+        <w:tc>
+          <w:tcPr>
+            <w:tcW w:type="dxa" w:w="2929"/>
+            <w:shd w:fill="0066CC" w:val="clear"/>
+          </w:tcPr>
+          <w:p>
+            <w:pPr>
+              <w:jc w:val="center"/>
+            </w:pPr>
+            <w:r/>
+            <w:r>
+              <w:rPr>
+                <w:rFonts w:ascii="Times New Roman" w:hAnsi="Times New Roman" w:eastAsia="Times New Roman"/>
+                <w:b/>
+                <w:color w:val="FFFFFF"/>
+                <w:sz w:val="22"/>
+              </w:rPr>
+              <w:t>Cong nghe VNPT</w:t>
+            </w:r>
+          </w:p>
+        </w:tc>
+      </w:tr>
+      <w:tr>
+        <w:tc>
+          <w:tcPr>
+            <w:tcW w:type="dxa" w:w="2929"/>
+          </w:tcPr>
+          <w:p>
+            <w:pPr>
+              <w:jc w:val="left"/>
+            </w:pPr>
+            <w:r/>
+            <w:r>
+              <w:rPr>
+                <w:rFonts w:ascii="Times New Roman" w:hAnsi="Times New Roman" w:eastAsia="Times New Roman"/>
+                <w:b w:val="0"/>
+                <w:sz w:val="20"/>
+              </w:rPr>
+              <w:t>Scan &amp; OCR</w:t>
+            </w:r>
+          </w:p>
+        </w:tc>
+        <w:tc>
+          <w:tcPr>
+            <w:tcW w:type="dxa" w:w="2929"/>
+          </w:tcPr>
+          <w:p>
+            <w:pPr>
+              <w:jc w:val="left"/>
+            </w:pPr>
+            <w:r/>
+            <w:r>
+              <w:rPr>
+                <w:rFonts w:ascii="Times New Roman" w:hAnsi="Times New Roman" w:eastAsia="Times New Roman"/>
+                <w:b w:val="0"/>
+                <w:sz w:val="20"/>
+              </w:rPr>
+              <w:t>OCR nhan dang -&gt; xuat text co cau truc</w:t>
+            </w:r>
+          </w:p>
+        </w:tc>
+        <w:tc>
+          <w:tcPr>
+            <w:tcW w:type="dxa" w:w="2929"/>
+          </w:tcPr>
+          <w:p>
+            <w:pPr>
+              <w:jc w:val="left"/>
+            </w:pPr>
+            <w:r/>
+            <w:r>
+              <w:rPr>
+                <w:rFonts w:ascii="Times New Roman" w:hAnsi="Times New Roman" w:eastAsia="Times New Roman"/>
+                <w:b w:val="0"/>
+                <w:sz w:val="20"/>
+              </w:rPr>
+              <w:t>SmartReader (Doc AI)</w:t>
+            </w:r>
+          </w:p>
+        </w:tc>
+      </w:tr>
+      <w:tr>
+        <w:tc>
+          <w:tcPr>
+            <w:tcW w:type="dxa" w:w="2929"/>
+            <w:shd w:fill="E8F0FE" w:val="clear"/>
+          </w:tcPr>
+          <w:p>
+            <w:pPr>
+              <w:jc w:val="left"/>
+            </w:pPr>
+            <w:r/>
+            <w:r>
+              <w:rPr>
+                <w:rFonts w:ascii="Times New Roman" w:hAnsi="Times New Roman" w:eastAsia="Times New Roman"/>
+                <w:b w:val="0"/>
+                <w:sz w:val="20"/>
+              </w:rPr>
+              <w:t>Phan loai tu dong</w:t>
+            </w:r>
+          </w:p>
+        </w:tc>
+        <w:tc>
+          <w:tcPr>
+            <w:tcW w:type="dxa" w:w="2929"/>
+            <w:shd w:fill="E8F0FE" w:val="clear"/>
+          </w:tcPr>
+          <w:p>
+            <w:pPr>
+              <w:jc w:val="left"/>
+            </w:pPr>
+            <w:r/>
+            <w:r>
+              <w:rPr>
+                <w:rFonts w:ascii="Times New Roman" w:hAnsi="Times New Roman" w:eastAsia="Times New Roman"/>
+                <w:b w:val="0"/>
+                <w:sz w:val="20"/>
+              </w:rPr>
+              <w:t>AI nhan dien loai giay to</w:t>
+            </w:r>
+          </w:p>
+        </w:tc>
+        <w:tc>
+          <w:tcPr>
+            <w:tcW w:type="dxa" w:w="2929"/>
+            <w:shd w:fill="E8F0FE" w:val="clear"/>
+          </w:tcPr>
+          <w:p>
+            <w:pPr>
+              <w:jc w:val="left"/>
+            </w:pPr>
+            <w:r/>
+            <w:r>
+              <w:rPr>
+                <w:rFonts w:ascii="Times New Roman" w:hAnsi="Times New Roman" w:eastAsia="Times New Roman"/>
+                <w:b w:val="0"/>
+                <w:sz w:val="20"/>
+              </w:rPr>
+              <w:t>SmartVision</w:t>
+            </w:r>
+          </w:p>
+        </w:tc>
+      </w:tr>
+      <w:tr>
+        <w:tc>
+          <w:tcPr>
+            <w:tcW w:type="dxa" w:w="2929"/>
+          </w:tcPr>
+          <w:p>
+            <w:pPr>
+              <w:jc w:val="left"/>
+            </w:pPr>
+            <w:r/>
+            <w:r>
+              <w:rPr>
+                <w:rFonts w:ascii="Times New Roman" w:hAnsi="Times New Roman" w:eastAsia="Times New Roman"/>
+                <w:b w:val="0"/>
+                <w:sz w:val="20"/>
+              </w:rPr>
+              <w:t>Boc tach thong tin</w:t>
+            </w:r>
+          </w:p>
+        </w:tc>
+        <w:tc>
+          <w:tcPr>
+            <w:tcW w:type="dxa" w:w="2929"/>
+          </w:tcPr>
+          <w:p>
+            <w:pPr>
+              <w:jc w:val="left"/>
+            </w:pPr>
+            <w:r/>
+            <w:r>
+              <w:rPr>
+                <w:rFonts w:ascii="Times New Roman" w:hAnsi="Times New Roman" w:eastAsia="Times New Roman"/>
+                <w:b w:val="0"/>
+                <w:sz w:val="20"/>
+              </w:rPr>
+              <w:t>Trich xuat ho ten, CCCD, dia chi...</w:t>
+            </w:r>
+          </w:p>
+        </w:tc>
+        <w:tc>
+          <w:tcPr>
+            <w:tcW w:type="dxa" w:w="2929"/>
+          </w:tcPr>
+          <w:p>
+            <w:pPr>
+              <w:jc w:val="left"/>
+            </w:pPr>
+            <w:r/>
+            <w:r>
+              <w:rPr>
+                <w:rFonts w:ascii="Times New Roman" w:hAnsi="Times New Roman" w:eastAsia="Times New Roman"/>
+                <w:b w:val="0"/>
+                <w:sz w:val="20"/>
+              </w:rPr>
+              <w:t>SmartReader</w:t>
+            </w:r>
+          </w:p>
+        </w:tc>
+      </w:tr>
+      <w:tr>
+        <w:tc>
+          <w:tcPr>
+            <w:tcW w:type="dxa" w:w="2929"/>
+            <w:shd w:fill="E8F0FE" w:val="clear"/>
+          </w:tcPr>
+          <w:p>
+            <w:pPr>
+              <w:jc w:val="left"/>
+            </w:pPr>
+            <w:r/>
+            <w:r>
+              <w:rPr>
+                <w:rFonts w:ascii="Times New Roman" w:hAnsi="Times New Roman" w:eastAsia="Times New Roman"/>
+                <w:b w:val="0"/>
+                <w:sz w:val="20"/>
+              </w:rPr>
+              <w:t>Doi chieu &amp; Xac thuc</w:t>
+            </w:r>
+          </w:p>
+        </w:tc>
+        <w:tc>
+          <w:tcPr>
+            <w:tcW w:type="dxa" w:w="2929"/>
+            <w:shd w:fill="E8F0FE" w:val="clear"/>
+          </w:tcPr>
+          <w:p>
+            <w:pPr>
+              <w:jc w:val="left"/>
+            </w:pPr>
+            <w:r/>
+            <w:r>
+              <w:rPr>
+                <w:rFonts w:ascii="Times New Roman" w:hAnsi="Times New Roman" w:eastAsia="Times New Roman"/>
+                <w:b w:val="0"/>
+                <w:sz w:val="20"/>
+              </w:rPr>
+              <w:t>So sanh voi CSDL hien co</w:t>
+            </w:r>
+          </w:p>
+        </w:tc>
+        <w:tc>
+          <w:tcPr>
+            <w:tcW w:type="dxa" w:w="2929"/>
+            <w:shd w:fill="E8F0FE" w:val="clear"/>
+          </w:tcPr>
+          <w:p>
+            <w:pPr>
+              <w:jc w:val="left"/>
+            </w:pPr>
+            <w:r/>
+            <w:r>
+              <w:rPr>
+                <w:rFonts w:ascii="Times New Roman" w:hAnsi="Times New Roman" w:eastAsia="Times New Roman"/>
+                <w:b w:val="0"/>
+                <w:sz w:val="20"/>
+              </w:rPr>
+              <w:t>eKYC (Compare)</w:t>
+            </w:r>
+          </w:p>
+        </w:tc>
+      </w:tr>
+      <w:tr>
+        <w:tc>
+          <w:tcPr>
+            <w:tcW w:type="dxa" w:w="2929"/>
+          </w:tcPr>
+          <w:p>
+            <w:pPr>
+              <w:jc w:val="left"/>
+            </w:pPr>
+            <w:r/>
+            <w:r>
+              <w:rPr>
+                <w:rFonts w:ascii="Times New Roman" w:hAnsi="Times New Roman" w:eastAsia="Times New Roman"/>
+                <w:b w:val="0"/>
+                <w:sz w:val="20"/>
+              </w:rPr>
+              <w:t>Kiem tra hop le</w:t>
+            </w:r>
+          </w:p>
+        </w:tc>
+        <w:tc>
+          <w:tcPr>
+            <w:tcW w:type="dxa" w:w="2929"/>
+          </w:tcPr>
+          <w:p>
+            <w:pPr>
+              <w:jc w:val="left"/>
+            </w:pPr>
+            <w:r/>
+            <w:r>
+              <w:rPr>
+                <w:rFonts w:ascii="Times New Roman" w:hAnsi="Times New Roman" w:eastAsia="Times New Roman"/>
+                <w:b w:val="0"/>
+                <w:sz w:val="20"/>
+              </w:rPr>
+              <w:t>Phat hien sai lech, canh bao</w:t>
+            </w:r>
+          </w:p>
+        </w:tc>
+        <w:tc>
+          <w:tcPr>
+            <w:tcW w:type="dxa" w:w="2929"/>
+          </w:tcPr>
+          <w:p>
+            <w:pPr>
+              <w:jc w:val="left"/>
+            </w:pPr>
+            <w:r/>
+            <w:r>
+              <w:rPr>
+                <w:rFonts w:ascii="Times New Roman" w:hAnsi="Times New Roman" w:eastAsia="Times New Roman"/>
+                <w:b w:val="0"/>
+                <w:sz w:val="20"/>
+              </w:rPr>
+              <w:t>SmartReader + Rules</w:t>
+            </w:r>
+          </w:p>
+        </w:tc>
+      </w:tr>
+      <w:tr>
+        <w:tc>
+          <w:tcPr>
+            <w:tcW w:type="dxa" w:w="2929"/>
+            <w:shd w:fill="E8F0FE" w:val="clear"/>
+          </w:tcPr>
+          <w:p>
+            <w:pPr>
+              <w:jc w:val="left"/>
+            </w:pPr>
+            <w:r/>
+            <w:r>
+              <w:rPr>
+                <w:rFonts w:ascii="Times New Roman" w:hAnsi="Times New Roman" w:eastAsia="Times New Roman"/>
+                <w:b w:val="0"/>
+                <w:sz w:val="20"/>
+              </w:rPr>
+              <w:t>Xuat bao cao</w:t>
+            </w:r>
+          </w:p>
+        </w:tc>
+        <w:tc>
+          <w:tcPr>
+            <w:tcW w:type="dxa" w:w="2929"/>
+            <w:shd w:fill="E8F0FE" w:val="clear"/>
+          </w:tcPr>
+          <w:p>
+            <w:pPr>
+              <w:jc w:val="left"/>
+            </w:pPr>
+            <w:r/>
+            <w:r>
+              <w:rPr>
+                <w:rFonts w:ascii="Times New Roman" w:hAnsi="Times New Roman" w:eastAsia="Times New Roman"/>
+                <w:b w:val="0"/>
+                <w:sz w:val="20"/>
+              </w:rPr>
+              <w:t>Excel/JSON/CSV</w:t>
+            </w:r>
+          </w:p>
+        </w:tc>
+        <w:tc>
+          <w:tcPr>
+            <w:tcW w:type="dxa" w:w="2929"/>
+            <w:shd w:fill="E8F0FE" w:val="clear"/>
+          </w:tcPr>
+          <w:p>
+            <w:pPr>
+              <w:jc w:val="left"/>
+            </w:pPr>
+            <w:r/>
+            <w:r>
+              <w:rPr>
+                <w:rFonts w:ascii="Times New Roman" w:hAnsi="Times New Roman" w:eastAsia="Times New Roman"/>
+                <w:b w:val="0"/>
+                <w:sz w:val="20"/>
+              </w:rPr>
+              <w:t>-</w:t>
+            </w:r>
+          </w:p>
+        </w:tc>
+      </w:tr>
+    </w:tbl>
+    <w:p>
+      <w:r>
+        <w:rPr>
+          <w:rFonts w:ascii="Times New Roman" w:hAnsi="Times New Roman" w:eastAsia="Times New Roman"/>
+          <w:b w:val="0"/>
+          <w:sz w:val="12"/>
+        </w:rPr>
+      </w:r>
+    </w:p>
+    <w:p>
+      <w:pPr>
+        <w:jc w:val="left"/>
+      </w:pPr>
+      <w:r>
+        <w:rPr>
+          <w:rFonts w:ascii="Times New Roman" w:hAnsi="Times New Roman" w:eastAsia="Times New Roman"/>
+          <w:b/>
+          <w:color w:val="0066CC"/>
+          <w:sz w:val="32"/>
+        </w:rPr>
+        <w:t>2.3 Quy trinh xu ly 6 buoc</w:t>
+      </w:r>
+    </w:p>
+    <w:p>
+      <w:pPr>
+        <w:spacing w:line="360" w:lineRule="auto"/>
+        <w:ind w:firstLine="720"/>
+        <w:jc w:val="both"/>
+      </w:pPr>
+      <w:r>
+        <w:rPr>
+          <w:rFonts w:ascii="Times New Roman" w:hAnsi="Times New Roman" w:eastAsia="Times New Roman"/>
+          <w:b w:val="0"/>
+          <w:sz w:val="28"/>
+        </w:rPr>
+        <w:t>Quy trinh xu ly ho so gom 6 buoc:</w:t>
+      </w:r>
+    </w:p>
+    <w:p>
+      <w:pPr>
+        <w:spacing w:line="360" w:lineRule="auto"/>
+        <w:ind w:left="567"/>
+        <w:jc w:val="both"/>
+      </w:pPr>
+      <w:r>
+        <w:rPr>
+          <w:rFonts w:ascii="Times New Roman" w:hAnsi="Times New Roman" w:eastAsia="Times New Roman"/>
+          <w:b/>
+          <w:sz w:val="26"/>
+        </w:rPr>
+        <w:t>Buoc 1 - Nap ho so:</w:t>
+      </w:r>
+      <w:r>
+        <w:rPr>
+          <w:rFonts w:ascii="Times New Roman" w:hAnsi="Times New Roman" w:eastAsia="Times New Roman"/>
+          <w:b w:val="0"/>
+          <w:sz w:val="26"/>
+        </w:rPr>
+        <w:t xml:space="preserve"> Dua ho so giay vao may scan hoac upload file.</w:t>
+      </w:r>
+    </w:p>
+    <w:p>
+      <w:pPr>
+        <w:spacing w:line="360" w:lineRule="auto"/>
+        <w:ind w:left="567"/>
+        <w:jc w:val="both"/>
+      </w:pPr>
+      <w:r>
+        <w:rPr>
+          <w:rFonts w:ascii="Times New Roman" w:hAnsi="Times New Roman" w:eastAsia="Times New Roman"/>
+          <w:b/>
+          <w:sz w:val="26"/>
+        </w:rPr>
+        <w:t>Buoc 2 - Phan loai:</w:t>
+      </w:r>
+      <w:r>
+        <w:rPr>
+          <w:rFonts w:ascii="Times New Roman" w:hAnsi="Times New Roman" w:eastAsia="Times New Roman"/>
+          <w:b w:val="0"/>
+          <w:sz w:val="26"/>
+        </w:rPr>
+        <w:t xml:space="preserve"> SmartVision tu dong nhan dien loai giay to.</w:t>
+      </w:r>
+    </w:p>
+    <w:p>
+      <w:pPr>
+        <w:spacing w:line="360" w:lineRule="auto"/>
+        <w:ind w:left="567"/>
+        <w:jc w:val="both"/>
+      </w:pPr>
+      <w:r>
+        <w:rPr>
+          <w:rFonts w:ascii="Times New Roman" w:hAnsi="Times New Roman" w:eastAsia="Times New Roman"/>
+          <w:b/>
+          <w:sz w:val="26"/>
+        </w:rPr>
+        <w:t>Buoc 3 - OCR:</w:t>
+      </w:r>
+      <w:r>
+        <w:rPr>
+          <w:rFonts w:ascii="Times New Roman" w:hAnsi="Times New Roman" w:eastAsia="Times New Roman"/>
+          <w:b w:val="0"/>
+          <w:sz w:val="26"/>
+        </w:rPr>
+        <w:t xml:space="preserve"> SmartReader OCR nhan dang, trich xuat cac truong.</w:t>
+      </w:r>
+    </w:p>
+    <w:p>
+      <w:pPr>
+        <w:spacing w:line="360" w:lineRule="auto"/>
+        <w:ind w:left="567"/>
+        <w:jc w:val="both"/>
+      </w:pPr>
+      <w:r>
+        <w:rPr>
+          <w:rFonts w:ascii="Times New Roman" w:hAnsi="Times New Roman" w:eastAsia="Times New Roman"/>
+          <w:b/>
+          <w:sz w:val="26"/>
+        </w:rPr>
+        <w:t>Buoc 4 - Doi chieu:</w:t>
+      </w:r>
+      <w:r>
+        <w:rPr>
+          <w:rFonts w:ascii="Times New Roman" w:hAnsi="Times New Roman" w:eastAsia="Times New Roman"/>
+          <w:b w:val="0"/>
+          <w:sz w:val="26"/>
+        </w:rPr>
+        <w:t xml:space="preserve"> So sanh voi CSDL, danh dau sai lech.</w:t>
+      </w:r>
+    </w:p>
+    <w:p>
+      <w:pPr>
+        <w:spacing w:line="360" w:lineRule="auto"/>
+        <w:ind w:left="567"/>
+        <w:jc w:val="both"/>
+      </w:pPr>
+      <w:r>
+        <w:rPr>
+          <w:rFonts w:ascii="Times New Roman" w:hAnsi="Times New Roman" w:eastAsia="Times New Roman"/>
+          <w:b/>
+          <w:sz w:val="26"/>
+        </w:rPr>
+        <w:t>Buoc 5 - Kiem tra:</w:t>
+      </w:r>
+      <w:r>
+        <w:rPr>
+          <w:rFonts w:ascii="Times New Roman" w:hAnsi="Times New Roman" w:eastAsia="Times New Roman"/>
+          <w:b w:val="0"/>
+          <w:sz w:val="26"/>
+        </w:rPr>
+        <w:t xml:space="preserve"> Can bo xem dashboard, xac nhan ket qua.</w:t>
+      </w:r>
+    </w:p>
+    <w:p>
+      <w:pPr>
+        <w:spacing w:line="360" w:lineRule="auto"/>
+        <w:ind w:left="567"/>
+        <w:jc w:val="both"/>
+      </w:pPr>
+      <w:r>
+        <w:rPr>
+          <w:rFonts w:ascii="Times New Roman" w:hAnsi="Times New Roman" w:eastAsia="Times New Roman"/>
+          <w:b/>
+          <w:sz w:val="26"/>
+        </w:rPr>
+        <w:t>Buoc 6 - Xuat du lieu:</w:t>
+      </w:r>
+      <w:r>
+        <w:rPr>
+          <w:rFonts w:ascii="Times New Roman" w:hAnsi="Times New Roman" w:eastAsia="Times New Roman"/>
+          <w:b w:val="0"/>
+          <w:sz w:val="26"/>
+        </w:rPr>
+        <w:t xml:space="preserve"> Xuat ra CSDL, luu ban scan tren MinIO.</w:t>
+      </w:r>
+    </w:p>
+    <w:p>
+      <w:pPr>
+        <w:jc w:val="left"/>
+      </w:pPr>
+      <w:r>
+        <w:rPr>
+          <w:rFonts w:ascii="Times New Roman" w:hAnsi="Times New Roman" w:eastAsia="Times New Roman"/>
+          <w:b/>
+          <w:color w:val="0066CC"/>
+          <w:sz w:val="32"/>
+        </w:rPr>
+        <w:t>2.4 Vai tro cac thanh phan AI</w:t>
+      </w:r>
+    </w:p>
+    <w:p>
+      <w:pPr>
+        <w:spacing w:line="360" w:lineRule="auto"/>
+        <w:ind w:firstLine="720"/>
+        <w:jc w:val="both"/>
+      </w:pPr>
+      <w:r>
+        <w:rPr>
+          <w:rFonts w:ascii="Times New Roman" w:hAnsi="Times New Roman" w:eastAsia="Times New Roman"/>
+          <w:b w:val="0"/>
+          <w:sz w:val="28"/>
+        </w:rPr>
+        <w:t>AutoCheck su dung 5 thanh phan AI tu VNPT:</w:t>
+      </w:r>
+    </w:p>
+    <w:p>
+      <w:pPr>
+        <w:spacing w:line="360" w:lineRule="auto"/>
+        <w:ind w:left="850"/>
+        <w:jc w:val="both"/>
+      </w:pPr>
+      <w:r>
+        <w:rPr>
+          <w:rFonts w:ascii="Times New Roman" w:hAnsi="Times New Roman" w:eastAsia="Times New Roman"/>
+          <w:b w:val="0"/>
+          <w:sz w:val="26"/>
+        </w:rPr>
+        <w:t xml:space="preserve">* </w:t>
+      </w:r>
+      <w:r>
+        <w:rPr>
+          <w:rFonts w:ascii="Times New Roman" w:hAnsi="Times New Roman" w:eastAsia="Times New Roman"/>
+          <w:b/>
+          <w:sz w:val="26"/>
+        </w:rPr>
+        <w:t xml:space="preserve">SmartReader (OCR): </w:t>
+      </w:r>
+      <w:r>
+        <w:rPr>
+          <w:rFonts w:ascii="Times New Roman" w:hAnsi="Times New Roman" w:eastAsia="Times New Roman"/>
+          <w:b w:val="0"/>
+          <w:sz w:val="26"/>
+        </w:rPr>
+        <w:t>Nhan dang chu tieng Viet &gt;95% .</w:t>
+      </w:r>
+    </w:p>
+    <w:p>
+      <w:pPr>
+        <w:spacing w:line="360" w:lineRule="auto"/>
+        <w:ind w:left="850"/>
+        <w:jc w:val="both"/>
+      </w:pPr>
+      <w:r>
+        <w:rPr>
+          <w:rFonts w:ascii="Times New Roman" w:hAnsi="Times New Roman" w:eastAsia="Times New Roman"/>
+          <w:b w:val="0"/>
+          <w:sz w:val="26"/>
+        </w:rPr>
+        <w:t xml:space="preserve">* </w:t>
+      </w:r>
+      <w:r>
+        <w:rPr>
+          <w:rFonts w:ascii="Times New Roman" w:hAnsi="Times New Roman" w:eastAsia="Times New Roman"/>
+          <w:b/>
+          <w:sz w:val="26"/>
+        </w:rPr>
+        <w:t xml:space="preserve">SmartReader (Doc AI): </w:t>
+      </w:r>
+      <w:r>
+        <w:rPr>
+          <w:rFonts w:ascii="Times New Roman" w:hAnsi="Times New Roman" w:eastAsia="Times New Roman"/>
+          <w:b w:val="0"/>
+          <w:sz w:val="26"/>
+        </w:rPr>
+        <w:t>Boc tach thong tin co cau truc tu giay to.</w:t>
+      </w:r>
+    </w:p>
+    <w:p>
+      <w:pPr>
+        <w:spacing w:line="360" w:lineRule="auto"/>
+        <w:ind w:left="850"/>
+        <w:jc w:val="both"/>
+      </w:pPr>
+      <w:r>
+        <w:rPr>
+          <w:rFonts w:ascii="Times New Roman" w:hAnsi="Times New Roman" w:eastAsia="Times New Roman"/>
+          <w:b w:val="0"/>
+          <w:sz w:val="26"/>
+        </w:rPr>
+        <w:t xml:space="preserve">* </w:t>
+      </w:r>
+      <w:r>
+        <w:rPr>
+          <w:rFonts w:ascii="Times New Roman" w:hAnsi="Times New Roman" w:eastAsia="Times New Roman"/>
+          <w:b/>
+          <w:sz w:val="26"/>
+        </w:rPr>
+        <w:t xml:space="preserve">SmartVision: </w:t>
+      </w:r>
+      <w:r>
+        <w:rPr>
+          <w:rFonts w:ascii="Times New Roman" w:hAnsi="Times New Roman" w:eastAsia="Times New Roman"/>
+          <w:b w:val="0"/>
+          <w:sz w:val="26"/>
+        </w:rPr>
+        <w:t>Phan loai giay to theo chung loai.</w:t>
+      </w:r>
+    </w:p>
+    <w:p>
+      <w:pPr>
+        <w:spacing w:line="360" w:lineRule="auto"/>
+        <w:ind w:left="850"/>
+        <w:jc w:val="both"/>
+      </w:pPr>
+      <w:r>
+        <w:rPr>
+          <w:rFonts w:ascii="Times New Roman" w:hAnsi="Times New Roman" w:eastAsia="Times New Roman"/>
+          <w:b w:val="0"/>
+          <w:sz w:val="26"/>
+        </w:rPr>
+        <w:t xml:space="preserve">* </w:t>
+      </w:r>
+      <w:r>
+        <w:rPr>
+          <w:rFonts w:ascii="Times New Roman" w:hAnsi="Times New Roman" w:eastAsia="Times New Roman"/>
+          <w:b/>
+          <w:sz w:val="26"/>
+        </w:rPr>
+        <w:t xml:space="preserve">eKYC (Compare): </w:t>
+      </w:r>
+      <w:r>
+        <w:rPr>
+          <w:rFonts w:ascii="Times New Roman" w:hAnsi="Times New Roman" w:eastAsia="Times New Roman"/>
+          <w:b w:val="0"/>
+          <w:sz w:val="26"/>
+        </w:rPr>
+        <w:t>So sanh thong tin voi CSDL.</w:t>
+      </w:r>
+    </w:p>
+    <w:p>
+      <w:pPr>
+        <w:spacing w:line="360" w:lineRule="auto"/>
+        <w:ind w:left="850"/>
+        <w:jc w:val="both"/>
+      </w:pPr>
+      <w:r>
+        <w:rPr>
+          <w:rFonts w:ascii="Times New Roman" w:hAnsi="Times New Roman" w:eastAsia="Times New Roman"/>
+          <w:b w:val="0"/>
+          <w:sz w:val="26"/>
+        </w:rPr>
+        <w:t xml:space="preserve">* </w:t>
+      </w:r>
+      <w:r>
+        <w:rPr>
+          <w:rFonts w:ascii="Times New Roman" w:hAnsi="Times New Roman" w:eastAsia="Times New Roman"/>
+          <w:b/>
+          <w:sz w:val="26"/>
+        </w:rPr>
+        <w:t xml:space="preserve">eKYC (Liveness): </w:t>
+      </w:r>
+      <w:r>
+        <w:rPr>
+          <w:rFonts w:ascii="Times New Roman" w:hAnsi="Times New Roman" w:eastAsia="Times New Roman"/>
+          <w:b w:val="0"/>
+          <w:sz w:val="26"/>
+        </w:rPr>
+        <w:t>Kiem tra anh chan dung that/gia.</w:t>
+      </w:r>
+    </w:p>
     <w:sectPr>
       <w:pgSz w:w="11906" w:h="16838"/>
       <w:pgMar w:top="1417" w:right="1417" w:bottom="1417" w:left="1701" w:header="720" w:footer="720" w:gutter="0"/>

</xml_diff>

<commit_message>
task-4: add architecture diagram, user flow, wireframes and architecture section for AutoCheck
</commit_message>
<xml_diff>
--- a/hackaithon-de-tai-6-autocheck/proposal.docx
+++ b/hackaithon-de-tai-6-autocheck/proposal.docx
@@ -1764,6 +1764,442 @@
         <w:t>Kiem tra anh chan dung that/gia.</w:t>
       </w:r>
     </w:p>
+    <w:p>
+      <w:r>
+        <w:br w:type="page"/>
+      </w:r>
+    </w:p>
+    <w:p>
+      <w:pPr>
+        <w:jc w:val="left"/>
+        <w:pBdr>
+          <w:bottom w:val="single" w:sz="8" w:space="1" w:color="0066CC"/>
+        </w:pBdr>
+      </w:pPr>
+      <w:r>
+        <w:rPr>
+          <w:rFonts w:ascii="Times New Roman" w:hAnsi="Times New Roman" w:eastAsia="Times New Roman"/>
+          <w:b/>
+          <w:color w:val="0066CC"/>
+          <w:sz w:val="36"/>
+        </w:rPr>
+        <w:t>3. THIET KE TONG QUAN</w:t>
+      </w:r>
+    </w:p>
+    <w:p>
+      <w:pPr>
+        <w:jc w:val="left"/>
+      </w:pPr>
+      <w:r>
+        <w:rPr>
+          <w:rFonts w:ascii="Times New Roman" w:hAnsi="Times New Roman" w:eastAsia="Times New Roman"/>
+          <w:b/>
+          <w:color w:val="0066CC"/>
+          <w:sz w:val="32"/>
+        </w:rPr>
+        <w:t>3.1 Kien truc he thong</w:t>
+      </w:r>
+    </w:p>
+    <w:p>
+      <w:pPr>
+        <w:spacing w:line="360" w:lineRule="auto"/>
+        <w:ind w:firstLine="720"/>
+        <w:jc w:val="both"/>
+      </w:pPr>
+      <w:r>
+        <w:rPr>
+          <w:rFonts w:ascii="Times New Roman" w:hAnsi="Times New Roman" w:eastAsia="Times New Roman"/>
+          <w:b w:val="0"/>
+          <w:sz w:val="28"/>
+        </w:rPr>
+        <w:t>AutoCheck duoc thiet ke theo mo hinh 3 tang, toi uu cho viec xu ly hang loat ho so giay to luu tru.</w:t>
+      </w:r>
+    </w:p>
+    <w:p>
+      <w:pPr>
+        <w:spacing w:line="360" w:lineRule="auto"/>
+        <w:ind w:left="567"/>
+        <w:jc w:val="both"/>
+      </w:pPr>
+      <w:r>
+        <w:rPr>
+          <w:rFonts w:ascii="Times New Roman" w:hAnsi="Times New Roman" w:eastAsia="Times New Roman"/>
+          <w:b/>
+          <w:sz w:val="26"/>
+        </w:rPr>
+        <w:t>Tang 1 - Input Layer:</w:t>
+      </w:r>
+      <w:r>
+        <w:rPr>
+          <w:rFonts w:ascii="Times New Roman" w:hAnsi="Times New Roman" w:eastAsia="Times New Roman"/>
+          <w:b w:val="0"/>
+          <w:sz w:val="26"/>
+        </w:rPr>
+        <w:t xml:space="preserve"> Tiep nhan tu may scan, upload PDF/JPEG, camera.</w:t>
+      </w:r>
+    </w:p>
+    <w:p>
+      <w:pPr>
+        <w:spacing w:line="360" w:lineRule="auto"/>
+        <w:ind w:left="567"/>
+        <w:jc w:val="both"/>
+      </w:pPr>
+      <w:r>
+        <w:rPr>
+          <w:rFonts w:ascii="Times New Roman" w:hAnsi="Times New Roman" w:eastAsia="Times New Roman"/>
+          <w:b/>
+          <w:sz w:val="26"/>
+        </w:rPr>
+        <w:t>Tang 2 - AI Processing:</w:t>
+      </w:r>
+      <w:r>
+        <w:rPr>
+          <w:rFonts w:ascii="Times New Roman" w:hAnsi="Times New Roman" w:eastAsia="Times New Roman"/>
+          <w:b w:val="0"/>
+          <w:sz w:val="26"/>
+        </w:rPr>
+        <w:t xml:space="preserve"> SmartReader OCR, SmartVision, eKYC, AI Rules.</w:t>
+      </w:r>
+    </w:p>
+    <w:p>
+      <w:pPr>
+        <w:spacing w:line="360" w:lineRule="auto"/>
+        <w:ind w:left="567"/>
+        <w:jc w:val="both"/>
+      </w:pPr>
+      <w:r>
+        <w:rPr>
+          <w:rFonts w:ascii="Times New Roman" w:hAnsi="Times New Roman" w:eastAsia="Times New Roman"/>
+          <w:b/>
+          <w:sz w:val="26"/>
+        </w:rPr>
+        <w:t>Tang 3 - Output &amp; Storage:</w:t>
+      </w:r>
+      <w:r>
+        <w:rPr>
+          <w:rFonts w:ascii="Times New Roman" w:hAnsi="Times New Roman" w:eastAsia="Times New Roman"/>
+          <w:b w:val="0"/>
+          <w:sz w:val="26"/>
+        </w:rPr>
+        <w:t xml:space="preserve"> PostgreSQL, MinIO/S3, Redis.</w:t>
+      </w:r>
+    </w:p>
+    <w:p>
+      <w:pPr>
+        <w:jc w:val="center"/>
+      </w:pPr>
+      <w:r>
+        <w:drawing>
+          <wp:inline xmlns:a="http://schemas.openxmlformats.org/drawingml/2006/main" xmlns:pic="http://schemas.openxmlformats.org/drawingml/2006/picture">
+            <wp:extent cx="5760000" cy="2880000"/>
+            <wp:docPr id="2" name="Picture 2"/>
+            <wp:cNvGraphicFramePr>
+              <a:graphicFrameLocks noChangeAspect="1"/>
+            </wp:cNvGraphicFramePr>
+            <a:graphic>
+              <a:graphicData uri="http://schemas.openxmlformats.org/drawingml/2006/picture">
+                <pic:pic>
+                  <pic:nvPicPr>
+                    <pic:cNvPr id="0" name="architecture-diagram.png"/>
+                    <pic:cNvPicPr/>
+                  </pic:nvPicPr>
+                  <pic:blipFill>
+                    <a:blip r:embed="rId10"/>
+                    <a:stretch>
+                      <a:fillRect/>
+                    </a:stretch>
+                  </pic:blipFill>
+                  <pic:spPr>
+                    <a:xfrm>
+                      <a:off x="0" y="0"/>
+                      <a:ext cx="5760000" cy="2880000"/>
+                    </a:xfrm>
+                    <a:prstGeom prst="rect"/>
+                  </pic:spPr>
+                </pic:pic>
+              </a:graphicData>
+            </a:graphic>
+          </wp:inline>
+        </w:drawing>
+      </w:r>
+    </w:p>
+    <w:p>
+      <w:pPr>
+        <w:jc w:val="center"/>
+      </w:pPr>
+      <w:r>
+        <w:rPr>
+          <w:rFonts w:ascii="Times New Roman" w:hAnsi="Times New Roman" w:eastAsia="Times New Roman"/>
+          <w:b/>
+          <w:color w:val="666666"/>
+          <w:sz w:val="22"/>
+        </w:rPr>
+        <w:t>Figure 1: So do kien truc tong the AutoCheck</w:t>
+      </w:r>
+    </w:p>
+    <w:p>
+      <w:pPr>
+        <w:jc w:val="left"/>
+      </w:pPr>
+      <w:r>
+        <w:rPr>
+          <w:rFonts w:ascii="Times New Roman" w:hAnsi="Times New Roman" w:eastAsia="Times New Roman"/>
+          <w:b/>
+          <w:color w:val="0066CC"/>
+          <w:sz w:val="32"/>
+        </w:rPr>
+        <w:t>3.2 Giao dien nguoi dung</w:t>
+      </w:r>
+    </w:p>
+    <w:p>
+      <w:pPr>
+        <w:spacing w:line="360" w:lineRule="auto"/>
+        <w:ind w:firstLine="720"/>
+        <w:jc w:val="both"/>
+      </w:pPr>
+      <w:r>
+        <w:rPr>
+          <w:rFonts w:ascii="Times New Roman" w:hAnsi="Times New Roman" w:eastAsia="Times New Roman"/>
+          <w:b w:val="0"/>
+          <w:sz w:val="28"/>
+        </w:rPr>
+        <w:t>AutoCheck co 2 giao dien chinh: Man hinh Scan (nhap lieu) va Dashboard Kiem tra &amp; Xac thuc.</w:t>
+      </w:r>
+    </w:p>
+    <w:p>
+      <w:pPr>
+        <w:spacing w:line="360" w:lineRule="auto"/>
+        <w:ind w:left="850"/>
+        <w:jc w:val="both"/>
+      </w:pPr>
+      <w:r>
+        <w:rPr>
+          <w:rFonts w:ascii="Times New Roman" w:hAnsi="Times New Roman" w:eastAsia="Times New Roman"/>
+          <w:b w:val="0"/>
+          <w:sz w:val="26"/>
+        </w:rPr>
+        <w:t xml:space="preserve">* </w:t>
+      </w:r>
+      <w:r>
+        <w:rPr>
+          <w:rFonts w:ascii="Times New Roman" w:hAnsi="Times New Roman" w:eastAsia="Times New Roman"/>
+          <w:b w:val="0"/>
+          <w:sz w:val="26"/>
+        </w:rPr>
+        <w:t>Man hinh Scan: Keo tha file, chon nguon scan, cai dat, xem preview.</w:t>
+      </w:r>
+    </w:p>
+    <w:p>
+      <w:pPr>
+        <w:spacing w:line="360" w:lineRule="auto"/>
+        <w:ind w:left="850"/>
+        <w:jc w:val="both"/>
+      </w:pPr>
+      <w:r>
+        <w:rPr>
+          <w:rFonts w:ascii="Times New Roman" w:hAnsi="Times New Roman" w:eastAsia="Times New Roman"/>
+          <w:b w:val="0"/>
+          <w:sz w:val="26"/>
+        </w:rPr>
+        <w:t xml:space="preserve">* </w:t>
+      </w:r>
+      <w:r>
+        <w:rPr>
+          <w:rFonts w:ascii="Times New Roman" w:hAnsi="Times New Roman" w:eastAsia="Times New Roman"/>
+          <w:b w:val="0"/>
+          <w:sz w:val="26"/>
+        </w:rPr>
+        <w:t>Dashboard: Thong ke, danh sach ho so, chi tiet canh bao sai lech.</w:t>
+      </w:r>
+    </w:p>
+    <w:p>
+      <w:pPr>
+        <w:jc w:val="center"/>
+      </w:pPr>
+      <w:r>
+        <w:drawing>
+          <wp:inline xmlns:a="http://schemas.openxmlformats.org/drawingml/2006/main" xmlns:pic="http://schemas.openxmlformats.org/drawingml/2006/picture">
+            <wp:extent cx="5040000" cy="5796000"/>
+            <wp:docPr id="3" name="Picture 3"/>
+            <wp:cNvGraphicFramePr>
+              <a:graphicFrameLocks noChangeAspect="1"/>
+            </wp:cNvGraphicFramePr>
+            <a:graphic>
+              <a:graphicData uri="http://schemas.openxmlformats.org/drawingml/2006/picture">
+                <pic:pic>
+                  <pic:nvPicPr>
+                    <pic:cNvPr id="0" name="wireframe-scan-interface.png"/>
+                    <pic:cNvPicPr/>
+                  </pic:nvPicPr>
+                  <pic:blipFill>
+                    <a:blip r:embed="rId11"/>
+                    <a:stretch>
+                      <a:fillRect/>
+                    </a:stretch>
+                  </pic:blipFill>
+                  <pic:spPr>
+                    <a:xfrm>
+                      <a:off x="0" y="0"/>
+                      <a:ext cx="5040000" cy="5796000"/>
+                    </a:xfrm>
+                    <a:prstGeom prst="rect"/>
+                  </pic:spPr>
+                </pic:pic>
+              </a:graphicData>
+            </a:graphic>
+          </wp:inline>
+        </w:drawing>
+      </w:r>
+    </w:p>
+    <w:p>
+      <w:pPr>
+        <w:jc w:val="center"/>
+      </w:pPr>
+      <w:r>
+        <w:rPr>
+          <w:rFonts w:ascii="Times New Roman" w:hAnsi="Times New Roman" w:eastAsia="Times New Roman"/>
+          <w:b/>
+          <w:color w:val="666666"/>
+          <w:sz w:val="22"/>
+        </w:rPr>
+        <w:t>Figure 2: Giao dien Scan</w:t>
+      </w:r>
+    </w:p>
+    <w:p>
+      <w:pPr>
+        <w:jc w:val="center"/>
+      </w:pPr>
+      <w:r>
+        <w:drawing>
+          <wp:inline xmlns:a="http://schemas.openxmlformats.org/drawingml/2006/main" xmlns:pic="http://schemas.openxmlformats.org/drawingml/2006/picture">
+            <wp:extent cx="5760000" cy="3702857"/>
+            <wp:docPr id="4" name="Picture 4"/>
+            <wp:cNvGraphicFramePr>
+              <a:graphicFrameLocks noChangeAspect="1"/>
+            </wp:cNvGraphicFramePr>
+            <a:graphic>
+              <a:graphicData uri="http://schemas.openxmlformats.org/drawingml/2006/picture">
+                <pic:pic>
+                  <pic:nvPicPr>
+                    <pic:cNvPr id="0" name="user-flow.png"/>
+                    <pic:cNvPicPr/>
+                  </pic:nvPicPr>
+                  <pic:blipFill>
+                    <a:blip r:embed="rId12"/>
+                    <a:stretch>
+                      <a:fillRect/>
+                    </a:stretch>
+                  </pic:blipFill>
+                  <pic:spPr>
+                    <a:xfrm>
+                      <a:off x="0" y="0"/>
+                      <a:ext cx="5760000" cy="3702857"/>
+                    </a:xfrm>
+                    <a:prstGeom prst="rect"/>
+                  </pic:spPr>
+                </pic:pic>
+              </a:graphicData>
+            </a:graphic>
+          </wp:inline>
+        </w:drawing>
+      </w:r>
+    </w:p>
+    <w:p>
+      <w:pPr>
+        <w:jc w:val="center"/>
+      </w:pPr>
+      <w:r>
+        <w:rPr>
+          <w:rFonts w:ascii="Times New Roman" w:hAnsi="Times New Roman" w:eastAsia="Times New Roman"/>
+          <w:b/>
+          <w:color w:val="666666"/>
+          <w:sz w:val="22"/>
+        </w:rPr>
+        <w:t>Figure 3: Luong xu ly</w:t>
+      </w:r>
+    </w:p>
+    <w:p>
+      <w:pPr>
+        <w:jc w:val="center"/>
+      </w:pPr>
+      <w:r>
+        <w:drawing>
+          <wp:inline xmlns:a="http://schemas.openxmlformats.org/drawingml/2006/main" xmlns:pic="http://schemas.openxmlformats.org/drawingml/2006/picture">
+            <wp:extent cx="5760000" cy="3600000"/>
+            <wp:docPr id="5" name="Picture 5"/>
+            <wp:cNvGraphicFramePr>
+              <a:graphicFrameLocks noChangeAspect="1"/>
+            </wp:cNvGraphicFramePr>
+            <a:graphic>
+              <a:graphicData uri="http://schemas.openxmlformats.org/drawingml/2006/picture">
+                <pic:pic>
+                  <pic:nvPicPr>
+                    <pic:cNvPr id="0" name="wireframe-validation-dashboard.png"/>
+                    <pic:cNvPicPr/>
+                  </pic:nvPicPr>
+                  <pic:blipFill>
+                    <a:blip r:embed="rId13"/>
+                    <a:stretch>
+                      <a:fillRect/>
+                    </a:stretch>
+                  </pic:blipFill>
+                  <pic:spPr>
+                    <a:xfrm>
+                      <a:off x="0" y="0"/>
+                      <a:ext cx="5760000" cy="3600000"/>
+                    </a:xfrm>
+                    <a:prstGeom prst="rect"/>
+                  </pic:spPr>
+                </pic:pic>
+              </a:graphicData>
+            </a:graphic>
+          </wp:inline>
+        </w:drawing>
+      </w:r>
+    </w:p>
+    <w:p>
+      <w:pPr>
+        <w:jc w:val="center"/>
+      </w:pPr>
+      <w:r>
+        <w:rPr>
+          <w:rFonts w:ascii="Times New Roman" w:hAnsi="Times New Roman" w:eastAsia="Times New Roman"/>
+          <w:b/>
+          <w:color w:val="666666"/>
+          <w:sz w:val="22"/>
+        </w:rPr>
+        <w:t>Figure 4: Dashboard xac thuc</w:t>
+      </w:r>
+    </w:p>
+    <w:p>
+      <w:pPr>
+        <w:jc w:val="left"/>
+      </w:pPr>
+      <w:r>
+        <w:rPr>
+          <w:rFonts w:ascii="Times New Roman" w:hAnsi="Times New Roman" w:eastAsia="Times New Roman"/>
+          <w:b/>
+          <w:color w:val="0066CC"/>
+          <w:sz w:val="32"/>
+        </w:rPr>
+        <w:t>3.3 Quy trinh xu ly du lieu</w:t>
+      </w:r>
+    </w:p>
+    <w:p>
+      <w:pPr>
+        <w:spacing w:line="360" w:lineRule="auto"/>
+        <w:ind w:firstLine="720"/>
+        <w:jc w:val="both"/>
+      </w:pPr>
+      <w:r>
+        <w:rPr>
+          <w:rFonts w:ascii="Times New Roman" w:hAnsi="Times New Roman" w:eastAsia="Times New Roman"/>
+          <w:b w:val="0"/>
+          <w:sz w:val="28"/>
+        </w:rPr>
+        <w:t>Pipeline: Scan -&gt; Phan loai (SmartVision) -&gt; OCR &amp; Boc tach (SmartReader) -&gt; Doi chieu (eKYC) -&gt; Kiem tra (AI Rules) -&gt; Xuat du lieu.</w:t>
+      </w:r>
+    </w:p>
     <w:sectPr>
       <w:pgSz w:w="11906" w:h="16838"/>
       <w:pgMar w:top="1417" w:right="1417" w:bottom="1417" w:left="1701" w:header="720" w:footer="720" w:gutter="0"/>

</xml_diff>

<commit_message>
task-5-7: add feasibility, innovation and impact sections for AutoCheck
</commit_message>
<xml_diff>
--- a/hackaithon-de-tai-6-autocheck/proposal.docx
+++ b/hackaithon-de-tai-6-autocheck/proposal.docx
@@ -2200,6 +2200,3788 @@
         <w:t>Pipeline: Scan -&gt; Phan loai (SmartVision) -&gt; OCR &amp; Boc tach (SmartReader) -&gt; Doi chieu (eKYC) -&gt; Kiem tra (AI Rules) -&gt; Xuat du lieu.</w:t>
       </w:r>
     </w:p>
+    <w:p>
+      <w:r>
+        <w:br w:type="page"/>
+      </w:r>
+    </w:p>
+    <w:p>
+      <w:pPr>
+        <w:jc w:val="left"/>
+        <w:pBdr>
+          <w:bottom w:val="single" w:sz="8" w:space="1" w:color="0066CC"/>
+        </w:pBdr>
+      </w:pPr>
+      <w:r>
+        <w:rPr>
+          <w:rFonts w:ascii="Times New Roman" w:hAnsi="Times New Roman" w:eastAsia="Times New Roman"/>
+          <w:b/>
+          <w:color w:val="0066CC"/>
+          <w:sz w:val="36"/>
+        </w:rPr>
+        <w:t>4. TINH KHA THI</w:t>
+      </w:r>
+    </w:p>
+    <w:p>
+      <w:pPr>
+        <w:jc w:val="left"/>
+      </w:pPr>
+      <w:r>
+        <w:rPr>
+          <w:rFonts w:ascii="Times New Roman" w:hAnsi="Times New Roman" w:eastAsia="Times New Roman"/>
+          <w:b/>
+          <w:color w:val="0066CC"/>
+          <w:sz w:val="32"/>
+        </w:rPr>
+        <w:t>4.1 Nguon du lieu</w:t>
+      </w:r>
+    </w:p>
+    <w:p>
+      <w:pPr>
+        <w:spacing w:line="360" w:lineRule="auto"/>
+        <w:ind w:firstLine="720"/>
+        <w:jc w:val="both"/>
+      </w:pPr>
+      <w:r>
+        <w:rPr>
+          <w:rFonts w:ascii="Times New Roman" w:hAnsi="Times New Roman" w:eastAsia="Times New Roman"/>
+          <w:b w:val="0"/>
+          <w:sz w:val="28"/>
+        </w:rPr>
+        <w:t>AutoCheck su dung du lieu tu nhieu nguon:</w:t>
+      </w:r>
+    </w:p>
+    <w:tbl>
+      <w:tblPr>
+        <w:tblStyle w:val="TableGrid"/>
+        <w:tblW w:type="auto" w:w="0"/>
+        <w:jc w:val="center"/>
+        <w:tblLook w:firstColumn="1" w:firstRow="1" w:lastColumn="0" w:lastRow="0" w:noHBand="0" w:noVBand="1" w:val="04A0"/>
+      </w:tblPr>
+      <w:tblGrid>
+        <w:gridCol w:w="4394"/>
+        <w:gridCol w:w="4394"/>
+      </w:tblGrid>
+      <w:tr>
+        <w:tc>
+          <w:tcPr>
+            <w:tcW w:type="dxa" w:w="4394"/>
+            <w:shd w:fill="0066CC" w:val="clear"/>
+          </w:tcPr>
+          <w:p>
+            <w:pPr>
+              <w:jc w:val="center"/>
+            </w:pPr>
+            <w:r/>
+            <w:r>
+              <w:rPr>
+                <w:rFonts w:ascii="Times New Roman" w:hAnsi="Times New Roman" w:eastAsia="Times New Roman"/>
+                <w:b/>
+                <w:color w:val="FFFFFF"/>
+                <w:sz w:val="22"/>
+              </w:rPr>
+              <w:t>Yeu to</w:t>
+            </w:r>
+          </w:p>
+        </w:tc>
+        <w:tc>
+          <w:tcPr>
+            <w:tcW w:type="dxa" w:w="4394"/>
+            <w:shd w:fill="0066CC" w:val="clear"/>
+          </w:tcPr>
+          <w:p>
+            <w:pPr>
+              <w:jc w:val="center"/>
+            </w:pPr>
+            <w:r/>
+            <w:r>
+              <w:rPr>
+                <w:rFonts w:ascii="Times New Roman" w:hAnsi="Times New Roman" w:eastAsia="Times New Roman"/>
+                <w:b/>
+                <w:color w:val="FFFFFF"/>
+                <w:sz w:val="22"/>
+              </w:rPr>
+              <w:t>Mo ta</w:t>
+            </w:r>
+          </w:p>
+        </w:tc>
+      </w:tr>
+      <w:tr>
+        <w:tc>
+          <w:tcPr>
+            <w:tcW w:type="dxa" w:w="4394"/>
+          </w:tcPr>
+          <w:p>
+            <w:pPr>
+              <w:jc w:val="left"/>
+            </w:pPr>
+            <w:r/>
+            <w:r>
+              <w:rPr>
+                <w:rFonts w:ascii="Times New Roman" w:hAnsi="Times New Roman" w:eastAsia="Times New Roman"/>
+                <w:b w:val="0"/>
+                <w:sz w:val="20"/>
+              </w:rPr>
+              <w:t>Ho so giay luu tru</w:t>
+            </w:r>
+          </w:p>
+        </w:tc>
+        <w:tc>
+          <w:tcPr>
+            <w:tcW w:type="dxa" w:w="4394"/>
+          </w:tcPr>
+          <w:p>
+            <w:pPr>
+              <w:jc w:val="left"/>
+            </w:pPr>
+            <w:r/>
+            <w:r>
+              <w:rPr>
+                <w:rFonts w:ascii="Times New Roman" w:hAnsi="Times New Roman" w:eastAsia="Times New Roman"/>
+                <w:b w:val="0"/>
+                <w:sz w:val="20"/>
+              </w:rPr>
+              <w:t>Co san tai UBND, moi phuong ~50.000-200.000 ho so.</w:t>
+            </w:r>
+          </w:p>
+        </w:tc>
+      </w:tr>
+      <w:tr>
+        <w:tc>
+          <w:tcPr>
+            <w:tcW w:type="dxa" w:w="4394"/>
+            <w:shd w:fill="E8F0FE" w:val="clear"/>
+          </w:tcPr>
+          <w:p>
+            <w:pPr>
+              <w:jc w:val="left"/>
+            </w:pPr>
+            <w:r/>
+            <w:r>
+              <w:rPr>
+                <w:rFonts w:ascii="Times New Roman" w:hAnsi="Times New Roman" w:eastAsia="Times New Roman"/>
+                <w:b w:val="0"/>
+                <w:sz w:val="20"/>
+              </w:rPr>
+              <w:t>Du lieu huan luyen</w:t>
+            </w:r>
+          </w:p>
+        </w:tc>
+        <w:tc>
+          <w:tcPr>
+            <w:tcW w:type="dxa" w:w="4394"/>
+            <w:shd w:fill="E8F0FE" w:val="clear"/>
+          </w:tcPr>
+          <w:p>
+            <w:pPr>
+              <w:jc w:val="left"/>
+            </w:pPr>
+            <w:r/>
+            <w:r>
+              <w:rPr>
+                <w:rFonts w:ascii="Times New Roman" w:hAnsi="Times New Roman" w:eastAsia="Times New Roman"/>
+                <w:b w:val="0"/>
+                <w:sz w:val="20"/>
+              </w:rPr>
+              <w:t>VNPT SmartReader da huan luyen san tieng Viet.</w:t>
+            </w:r>
+          </w:p>
+        </w:tc>
+      </w:tr>
+      <w:tr>
+        <w:tc>
+          <w:tcPr>
+            <w:tcW w:type="dxa" w:w="4394"/>
+          </w:tcPr>
+          <w:p>
+            <w:pPr>
+              <w:jc w:val="left"/>
+            </w:pPr>
+            <w:r/>
+            <w:r>
+              <w:rPr>
+                <w:rFonts w:ascii="Times New Roman" w:hAnsi="Times New Roman" w:eastAsia="Times New Roman"/>
+                <w:b w:val="0"/>
+                <w:sz w:val="20"/>
+              </w:rPr>
+              <w:t>CSDL doi chieu</w:t>
+            </w:r>
+          </w:p>
+        </w:tc>
+        <w:tc>
+          <w:tcPr>
+            <w:tcW w:type="dxa" w:w="4394"/>
+          </w:tcPr>
+          <w:p>
+            <w:pPr>
+              <w:jc w:val="left"/>
+            </w:pPr>
+            <w:r/>
+            <w:r>
+              <w:rPr>
+                <w:rFonts w:ascii="Times New Roman" w:hAnsi="Times New Roman" w:eastAsia="Times New Roman"/>
+                <w:b w:val="0"/>
+                <w:sz w:val="20"/>
+              </w:rPr>
+              <w:t>Cong DVC Quoc gia, CSDL Quoc gia ve dan cu.</w:t>
+            </w:r>
+          </w:p>
+        </w:tc>
+      </w:tr>
+    </w:tbl>
+    <w:p>
+      <w:r>
+        <w:rPr>
+          <w:rFonts w:ascii="Times New Roman" w:hAnsi="Times New Roman" w:eastAsia="Times New Roman"/>
+          <w:b w:val="0"/>
+          <w:sz w:val="12"/>
+        </w:rPr>
+      </w:r>
+    </w:p>
+    <w:p>
+      <w:pPr>
+        <w:jc w:val="left"/>
+      </w:pPr>
+      <w:r>
+        <w:rPr>
+          <w:rFonts w:ascii="Times New Roman" w:hAnsi="Times New Roman" w:eastAsia="Times New Roman"/>
+          <w:b/>
+          <w:color w:val="0066CC"/>
+          <w:sz w:val="32"/>
+        </w:rPr>
+        <w:t>4.2 Nhan luc</w:t>
+      </w:r>
+    </w:p>
+    <w:tbl>
+      <w:tblPr>
+        <w:tblStyle w:val="TableGrid"/>
+        <w:tblW w:type="auto" w:w="0"/>
+        <w:jc w:val="center"/>
+        <w:tblLook w:firstColumn="1" w:firstRow="1" w:lastColumn="0" w:lastRow="0" w:noHBand="0" w:noVBand="1" w:val="04A0"/>
+      </w:tblPr>
+      <w:tblGrid>
+        <w:gridCol w:w="2929"/>
+        <w:gridCol w:w="2929"/>
+        <w:gridCol w:w="2929"/>
+      </w:tblGrid>
+      <w:tr>
+        <w:tc>
+          <w:tcPr>
+            <w:tcW w:type="dxa" w:w="2929"/>
+            <w:shd w:fill="0066CC" w:val="clear"/>
+          </w:tcPr>
+          <w:p>
+            <w:pPr>
+              <w:jc w:val="center"/>
+            </w:pPr>
+            <w:r/>
+            <w:r>
+              <w:rPr>
+                <w:rFonts w:ascii="Times New Roman" w:hAnsi="Times New Roman" w:eastAsia="Times New Roman"/>
+                <w:b/>
+                <w:color w:val="FFFFFF"/>
+                <w:sz w:val="22"/>
+              </w:rPr>
+              <w:t>Vai tro</w:t>
+            </w:r>
+          </w:p>
+        </w:tc>
+        <w:tc>
+          <w:tcPr>
+            <w:tcW w:type="dxa" w:w="2929"/>
+            <w:shd w:fill="0066CC" w:val="clear"/>
+          </w:tcPr>
+          <w:p>
+            <w:pPr>
+              <w:jc w:val="center"/>
+            </w:pPr>
+            <w:r/>
+            <w:r>
+              <w:rPr>
+                <w:rFonts w:ascii="Times New Roman" w:hAnsi="Times New Roman" w:eastAsia="Times New Roman"/>
+                <w:b/>
+                <w:color w:val="FFFFFF"/>
+                <w:sz w:val="22"/>
+              </w:rPr>
+              <w:t>SL</w:t>
+            </w:r>
+          </w:p>
+        </w:tc>
+        <w:tc>
+          <w:tcPr>
+            <w:tcW w:type="dxa" w:w="2929"/>
+            <w:shd w:fill="0066CC" w:val="clear"/>
+          </w:tcPr>
+          <w:p>
+            <w:pPr>
+              <w:jc w:val="center"/>
+            </w:pPr>
+            <w:r/>
+            <w:r>
+              <w:rPr>
+                <w:rFonts w:ascii="Times New Roman" w:hAnsi="Times New Roman" w:eastAsia="Times New Roman"/>
+                <w:b/>
+                <w:color w:val="FFFFFF"/>
+                <w:sz w:val="22"/>
+              </w:rPr>
+              <w:t>Ky nang chinh</w:t>
+            </w:r>
+          </w:p>
+        </w:tc>
+      </w:tr>
+      <w:tr>
+        <w:tc>
+          <w:tcPr>
+            <w:tcW w:type="dxa" w:w="2929"/>
+          </w:tcPr>
+          <w:p>
+            <w:pPr>
+              <w:jc w:val="left"/>
+            </w:pPr>
+            <w:r/>
+            <w:r>
+              <w:rPr>
+                <w:rFonts w:ascii="Times New Roman" w:hAnsi="Times New Roman" w:eastAsia="Times New Roman"/>
+                <w:b w:val="0"/>
+                <w:sz w:val="20"/>
+              </w:rPr>
+              <w:t>Project Manager</w:t>
+            </w:r>
+          </w:p>
+        </w:tc>
+        <w:tc>
+          <w:tcPr>
+            <w:tcW w:type="dxa" w:w="2929"/>
+          </w:tcPr>
+          <w:p>
+            <w:pPr>
+              <w:jc w:val="left"/>
+            </w:pPr>
+            <w:r/>
+            <w:r>
+              <w:rPr>
+                <w:rFonts w:ascii="Times New Roman" w:hAnsi="Times New Roman" w:eastAsia="Times New Roman"/>
+                <w:b w:val="0"/>
+                <w:sz w:val="20"/>
+              </w:rPr>
+              <w:t>1</w:t>
+            </w:r>
+          </w:p>
+        </w:tc>
+        <w:tc>
+          <w:tcPr>
+            <w:tcW w:type="dxa" w:w="2929"/>
+          </w:tcPr>
+          <w:p>
+            <w:pPr>
+              <w:jc w:val="left"/>
+            </w:pPr>
+            <w:r/>
+            <w:r>
+              <w:rPr>
+                <w:rFonts w:ascii="Times New Roman" w:hAnsi="Times New Roman" w:eastAsia="Times New Roman"/>
+                <w:b w:val="0"/>
+                <w:sz w:val="20"/>
+              </w:rPr>
+              <w:t>Agile/Scrum</w:t>
+            </w:r>
+          </w:p>
+        </w:tc>
+      </w:tr>
+      <w:tr>
+        <w:tc>
+          <w:tcPr>
+            <w:tcW w:type="dxa" w:w="2929"/>
+            <w:shd w:fill="E8F0FE" w:val="clear"/>
+          </w:tcPr>
+          <w:p>
+            <w:pPr>
+              <w:jc w:val="left"/>
+            </w:pPr>
+            <w:r/>
+            <w:r>
+              <w:rPr>
+                <w:rFonts w:ascii="Times New Roman" w:hAnsi="Times New Roman" w:eastAsia="Times New Roman"/>
+                <w:b w:val="0"/>
+                <w:sz w:val="20"/>
+              </w:rPr>
+              <w:t>AI/OCR Developer</w:t>
+            </w:r>
+          </w:p>
+        </w:tc>
+        <w:tc>
+          <w:tcPr>
+            <w:tcW w:type="dxa" w:w="2929"/>
+            <w:shd w:fill="E8F0FE" w:val="clear"/>
+          </w:tcPr>
+          <w:p>
+            <w:pPr>
+              <w:jc w:val="left"/>
+            </w:pPr>
+            <w:r/>
+            <w:r>
+              <w:rPr>
+                <w:rFonts w:ascii="Times New Roman" w:hAnsi="Times New Roman" w:eastAsia="Times New Roman"/>
+                <w:b w:val="0"/>
+                <w:sz w:val="20"/>
+              </w:rPr>
+              <w:t>2</w:t>
+            </w:r>
+          </w:p>
+        </w:tc>
+        <w:tc>
+          <w:tcPr>
+            <w:tcW w:type="dxa" w:w="2929"/>
+            <w:shd w:fill="E8F0FE" w:val="clear"/>
+          </w:tcPr>
+          <w:p>
+            <w:pPr>
+              <w:jc w:val="left"/>
+            </w:pPr>
+            <w:r/>
+            <w:r>
+              <w:rPr>
+                <w:rFonts w:ascii="Times New Roman" w:hAnsi="Times New Roman" w:eastAsia="Times New Roman"/>
+                <w:b w:val="0"/>
+                <w:sz w:val="20"/>
+              </w:rPr>
+              <w:t>Python, OCR, Xu ly anh</w:t>
+            </w:r>
+          </w:p>
+        </w:tc>
+      </w:tr>
+      <w:tr>
+        <w:tc>
+          <w:tcPr>
+            <w:tcW w:type="dxa" w:w="2929"/>
+          </w:tcPr>
+          <w:p>
+            <w:pPr>
+              <w:jc w:val="left"/>
+            </w:pPr>
+            <w:r/>
+            <w:r>
+              <w:rPr>
+                <w:rFonts w:ascii="Times New Roman" w:hAnsi="Times New Roman" w:eastAsia="Times New Roman"/>
+                <w:b w:val="0"/>
+                <w:sz w:val="20"/>
+              </w:rPr>
+              <w:t>Fullstack Developer</w:t>
+            </w:r>
+          </w:p>
+        </w:tc>
+        <w:tc>
+          <w:tcPr>
+            <w:tcW w:type="dxa" w:w="2929"/>
+          </w:tcPr>
+          <w:p>
+            <w:pPr>
+              <w:jc w:val="left"/>
+            </w:pPr>
+            <w:r/>
+            <w:r>
+              <w:rPr>
+                <w:rFonts w:ascii="Times New Roman" w:hAnsi="Times New Roman" w:eastAsia="Times New Roman"/>
+                <w:b w:val="0"/>
+                <w:sz w:val="20"/>
+              </w:rPr>
+              <w:t>1</w:t>
+            </w:r>
+          </w:p>
+        </w:tc>
+        <w:tc>
+          <w:tcPr>
+            <w:tcW w:type="dxa" w:w="2929"/>
+          </w:tcPr>
+          <w:p>
+            <w:pPr>
+              <w:jc w:val="left"/>
+            </w:pPr>
+            <w:r/>
+            <w:r>
+              <w:rPr>
+                <w:rFonts w:ascii="Times New Roman" w:hAnsi="Times New Roman" w:eastAsia="Times New Roman"/>
+                <w:b w:val="0"/>
+                <w:sz w:val="20"/>
+              </w:rPr>
+              <w:t>React, FastAPI, PostgreSQL</w:t>
+            </w:r>
+          </w:p>
+        </w:tc>
+      </w:tr>
+      <w:tr>
+        <w:tc>
+          <w:tcPr>
+            <w:tcW w:type="dxa" w:w="2929"/>
+            <w:shd w:fill="E8F0FE" w:val="clear"/>
+          </w:tcPr>
+          <w:p>
+            <w:pPr>
+              <w:jc w:val="left"/>
+            </w:pPr>
+            <w:r/>
+            <w:r>
+              <w:rPr>
+                <w:rFonts w:ascii="Times New Roman" w:hAnsi="Times New Roman" w:eastAsia="Times New Roman"/>
+                <w:b w:val="0"/>
+                <w:sz w:val="20"/>
+              </w:rPr>
+              <w:t>UI/UX Designer</w:t>
+            </w:r>
+          </w:p>
+        </w:tc>
+        <w:tc>
+          <w:tcPr>
+            <w:tcW w:type="dxa" w:w="2929"/>
+            <w:shd w:fill="E8F0FE" w:val="clear"/>
+          </w:tcPr>
+          <w:p>
+            <w:pPr>
+              <w:jc w:val="left"/>
+            </w:pPr>
+            <w:r/>
+            <w:r>
+              <w:rPr>
+                <w:rFonts w:ascii="Times New Roman" w:hAnsi="Times New Roman" w:eastAsia="Times New Roman"/>
+                <w:b w:val="0"/>
+                <w:sz w:val="20"/>
+              </w:rPr>
+              <w:t>1</w:t>
+            </w:r>
+          </w:p>
+        </w:tc>
+        <w:tc>
+          <w:tcPr>
+            <w:tcW w:type="dxa" w:w="2929"/>
+            <w:shd w:fill="E8F0FE" w:val="clear"/>
+          </w:tcPr>
+          <w:p>
+            <w:pPr>
+              <w:jc w:val="left"/>
+            </w:pPr>
+            <w:r/>
+            <w:r>
+              <w:rPr>
+                <w:rFonts w:ascii="Times New Roman" w:hAnsi="Times New Roman" w:eastAsia="Times New Roman"/>
+                <w:b w:val="0"/>
+                <w:sz w:val="20"/>
+              </w:rPr>
+              <w:t>Figma</w:t>
+            </w:r>
+          </w:p>
+        </w:tc>
+      </w:tr>
+      <w:tr>
+        <w:tc>
+          <w:tcPr>
+            <w:tcW w:type="dxa" w:w="2929"/>
+          </w:tcPr>
+          <w:p>
+            <w:pPr>
+              <w:jc w:val="left"/>
+            </w:pPr>
+            <w:r/>
+            <w:r>
+              <w:rPr>
+                <w:rFonts w:ascii="Times New Roman" w:hAnsi="Times New Roman" w:eastAsia="Times New Roman"/>
+                <w:b w:val="0"/>
+                <w:sz w:val="20"/>
+              </w:rPr>
+              <w:t>BA</w:t>
+            </w:r>
+          </w:p>
+        </w:tc>
+        <w:tc>
+          <w:tcPr>
+            <w:tcW w:type="dxa" w:w="2929"/>
+          </w:tcPr>
+          <w:p>
+            <w:pPr>
+              <w:jc w:val="left"/>
+            </w:pPr>
+            <w:r/>
+            <w:r>
+              <w:rPr>
+                <w:rFonts w:ascii="Times New Roman" w:hAnsi="Times New Roman" w:eastAsia="Times New Roman"/>
+                <w:b w:val="0"/>
+                <w:sz w:val="20"/>
+              </w:rPr>
+              <w:t>1</w:t>
+            </w:r>
+          </w:p>
+        </w:tc>
+        <w:tc>
+          <w:tcPr>
+            <w:tcW w:type="dxa" w:w="2929"/>
+          </w:tcPr>
+          <w:p>
+            <w:pPr>
+              <w:jc w:val="left"/>
+            </w:pPr>
+            <w:r/>
+            <w:r>
+              <w:rPr>
+                <w:rFonts w:ascii="Times New Roman" w:hAnsi="Times New Roman" w:eastAsia="Times New Roman"/>
+                <w:b w:val="0"/>
+                <w:sz w:val="20"/>
+              </w:rPr>
+              <w:t>Nghiep vu luu tru, mot cua</w:t>
+            </w:r>
+          </w:p>
+        </w:tc>
+      </w:tr>
+    </w:tbl>
+    <w:p>
+      <w:r>
+        <w:rPr>
+          <w:rFonts w:ascii="Times New Roman" w:hAnsi="Times New Roman" w:eastAsia="Times New Roman"/>
+          <w:b w:val="0"/>
+          <w:sz w:val="12"/>
+        </w:rPr>
+      </w:r>
+    </w:p>
+    <w:p>
+      <w:pPr>
+        <w:jc w:val="left"/>
+      </w:pPr>
+      <w:r>
+        <w:rPr>
+          <w:rFonts w:ascii="Times New Roman" w:hAnsi="Times New Roman" w:eastAsia="Times New Roman"/>
+          <w:b/>
+          <w:color w:val="0066CC"/>
+          <w:sz w:val="32"/>
+        </w:rPr>
+        <w:t>4.3 Kien truc ky thuat</w:t>
+      </w:r>
+    </w:p>
+    <w:p>
+      <w:pPr>
+        <w:spacing w:line="360" w:lineRule="auto"/>
+        <w:ind w:firstLine="720"/>
+        <w:jc w:val="both"/>
+      </w:pPr>
+      <w:r>
+        <w:rPr>
+          <w:rFonts w:ascii="Times New Roman" w:hAnsi="Times New Roman" w:eastAsia="Times New Roman"/>
+          <w:b w:val="0"/>
+          <w:sz w:val="28"/>
+        </w:rPr>
+        <w:t>Frontend: React + TypeScript. Backend: Python FastAPI. AI: VNPT API. Database: PostgreSQL, MinIO/S3, Redis. DevOps: Docker, CI/CD.</w:t>
+      </w:r>
+    </w:p>
+    <w:p>
+      <w:pPr>
+        <w:jc w:val="left"/>
+      </w:pPr>
+      <w:r>
+        <w:rPr>
+          <w:rFonts w:ascii="Times New Roman" w:hAnsi="Times New Roman" w:eastAsia="Times New Roman"/>
+          <w:b/>
+          <w:color w:val="0066CC"/>
+          <w:sz w:val="32"/>
+        </w:rPr>
+        <w:t>4.4 Ke hoach MVP 7 ngay (Vong 2)</w:t>
+      </w:r>
+    </w:p>
+    <w:tbl>
+      <w:tblPr>
+        <w:tblStyle w:val="TableGrid"/>
+        <w:tblW w:type="auto" w:w="0"/>
+        <w:jc w:val="center"/>
+        <w:tblLook w:firstColumn="1" w:firstRow="1" w:lastColumn="0" w:lastRow="0" w:noHBand="0" w:noVBand="1" w:val="04A0"/>
+      </w:tblPr>
+      <w:tblGrid>
+        <w:gridCol w:w="2929"/>
+        <w:gridCol w:w="2929"/>
+        <w:gridCol w:w="2929"/>
+      </w:tblGrid>
+      <w:tr>
+        <w:tc>
+          <w:tcPr>
+            <w:tcW w:type="dxa" w:w="2929"/>
+            <w:shd w:fill="0066CC" w:val="clear"/>
+          </w:tcPr>
+          <w:p>
+            <w:pPr>
+              <w:jc w:val="center"/>
+            </w:pPr>
+            <w:r/>
+            <w:r>
+              <w:rPr>
+                <w:rFonts w:ascii="Times New Roman" w:hAnsi="Times New Roman" w:eastAsia="Times New Roman"/>
+                <w:b/>
+                <w:color w:val="FFFFFF"/>
+                <w:sz w:val="22"/>
+              </w:rPr>
+              <w:t>Ngay</w:t>
+            </w:r>
+          </w:p>
+        </w:tc>
+        <w:tc>
+          <w:tcPr>
+            <w:tcW w:type="dxa" w:w="2929"/>
+            <w:shd w:fill="0066CC" w:val="clear"/>
+          </w:tcPr>
+          <w:p>
+            <w:pPr>
+              <w:jc w:val="center"/>
+            </w:pPr>
+            <w:r/>
+            <w:r>
+              <w:rPr>
+                <w:rFonts w:ascii="Times New Roman" w:hAnsi="Times New Roman" w:eastAsia="Times New Roman"/>
+                <w:b/>
+                <w:color w:val="FFFFFF"/>
+                <w:sz w:val="22"/>
+              </w:rPr>
+              <w:t>Cong viec</w:t>
+            </w:r>
+          </w:p>
+        </w:tc>
+        <w:tc>
+          <w:tcPr>
+            <w:tcW w:type="dxa" w:w="2929"/>
+            <w:shd w:fill="0066CC" w:val="clear"/>
+          </w:tcPr>
+          <w:p>
+            <w:pPr>
+              <w:jc w:val="center"/>
+            </w:pPr>
+            <w:r/>
+            <w:r>
+              <w:rPr>
+                <w:rFonts w:ascii="Times New Roman" w:hAnsi="Times New Roman" w:eastAsia="Times New Roman"/>
+                <w:b/>
+                <w:color w:val="FFFFFF"/>
+                <w:sz w:val="22"/>
+              </w:rPr>
+              <w:t>Ket qua</w:t>
+            </w:r>
+          </w:p>
+        </w:tc>
+      </w:tr>
+      <w:tr>
+        <w:tc>
+          <w:tcPr>
+            <w:tcW w:type="dxa" w:w="2929"/>
+          </w:tcPr>
+          <w:p>
+            <w:pPr>
+              <w:jc w:val="left"/>
+            </w:pPr>
+            <w:r/>
+            <w:r>
+              <w:rPr>
+                <w:rFonts w:ascii="Times New Roman" w:hAnsi="Times New Roman" w:eastAsia="Times New Roman"/>
+                <w:b w:val="0"/>
+                <w:sz w:val="20"/>
+              </w:rPr>
+              <w:t>1-2</w:t>
+            </w:r>
+          </w:p>
+        </w:tc>
+        <w:tc>
+          <w:tcPr>
+            <w:tcW w:type="dxa" w:w="2929"/>
+          </w:tcPr>
+          <w:p>
+            <w:pPr>
+              <w:jc w:val="left"/>
+            </w:pPr>
+            <w:r/>
+            <w:r>
+              <w:rPr>
+                <w:rFonts w:ascii="Times New Roman" w:hAnsi="Times New Roman" w:eastAsia="Times New Roman"/>
+                <w:b w:val="0"/>
+                <w:sz w:val="20"/>
+              </w:rPr>
+              <w:t>Setup + SmartReader OCR</w:t>
+            </w:r>
+          </w:p>
+        </w:tc>
+        <w:tc>
+          <w:tcPr>
+            <w:tcW w:type="dxa" w:w="2929"/>
+          </w:tcPr>
+          <w:p>
+            <w:pPr>
+              <w:jc w:val="left"/>
+            </w:pPr>
+            <w:r/>
+            <w:r>
+              <w:rPr>
+                <w:rFonts w:ascii="Times New Roman" w:hAnsi="Times New Roman" w:eastAsia="Times New Roman"/>
+                <w:b w:val="0"/>
+                <w:sz w:val="20"/>
+              </w:rPr>
+              <w:t>OCR anh -&gt; text</w:t>
+            </w:r>
+          </w:p>
+        </w:tc>
+      </w:tr>
+      <w:tr>
+        <w:tc>
+          <w:tcPr>
+            <w:tcW w:type="dxa" w:w="2929"/>
+            <w:shd w:fill="E8F0FE" w:val="clear"/>
+          </w:tcPr>
+          <w:p>
+            <w:pPr>
+              <w:jc w:val="left"/>
+            </w:pPr>
+            <w:r/>
+            <w:r>
+              <w:rPr>
+                <w:rFonts w:ascii="Times New Roman" w:hAnsi="Times New Roman" w:eastAsia="Times New Roman"/>
+                <w:b w:val="0"/>
+                <w:sz w:val="20"/>
+              </w:rPr>
+              <w:t>3-4</w:t>
+            </w:r>
+          </w:p>
+        </w:tc>
+        <w:tc>
+          <w:tcPr>
+            <w:tcW w:type="dxa" w:w="2929"/>
+            <w:shd w:fill="E8F0FE" w:val="clear"/>
+          </w:tcPr>
+          <w:p>
+            <w:pPr>
+              <w:jc w:val="left"/>
+            </w:pPr>
+            <w:r/>
+            <w:r>
+              <w:rPr>
+                <w:rFonts w:ascii="Times New Roman" w:hAnsi="Times New Roman" w:eastAsia="Times New Roman"/>
+                <w:b w:val="0"/>
+                <w:sz w:val="20"/>
+              </w:rPr>
+              <w:t>SmartVision + eKYC</w:t>
+            </w:r>
+          </w:p>
+        </w:tc>
+        <w:tc>
+          <w:tcPr>
+            <w:tcW w:type="dxa" w:w="2929"/>
+            <w:shd w:fill="E8F0FE" w:val="clear"/>
+          </w:tcPr>
+          <w:p>
+            <w:pPr>
+              <w:jc w:val="left"/>
+            </w:pPr>
+            <w:r/>
+            <w:r>
+              <w:rPr>
+                <w:rFonts w:ascii="Times New Roman" w:hAnsi="Times New Roman" w:eastAsia="Times New Roman"/>
+                <w:b w:val="0"/>
+                <w:sz w:val="20"/>
+              </w:rPr>
+              <w:t>Phan loai + doi chieu</w:t>
+            </w:r>
+          </w:p>
+        </w:tc>
+      </w:tr>
+      <w:tr>
+        <w:tc>
+          <w:tcPr>
+            <w:tcW w:type="dxa" w:w="2929"/>
+          </w:tcPr>
+          <w:p>
+            <w:pPr>
+              <w:jc w:val="left"/>
+            </w:pPr>
+            <w:r/>
+            <w:r>
+              <w:rPr>
+                <w:rFonts w:ascii="Times New Roman" w:hAnsi="Times New Roman" w:eastAsia="Times New Roman"/>
+                <w:b w:val="0"/>
+                <w:sz w:val="20"/>
+              </w:rPr>
+              <w:t>5-6</w:t>
+            </w:r>
+          </w:p>
+        </w:tc>
+        <w:tc>
+          <w:tcPr>
+            <w:tcW w:type="dxa" w:w="2929"/>
+          </w:tcPr>
+          <w:p>
+            <w:pPr>
+              <w:jc w:val="left"/>
+            </w:pPr>
+            <w:r/>
+            <w:r>
+              <w:rPr>
+                <w:rFonts w:ascii="Times New Roman" w:hAnsi="Times New Roman" w:eastAsia="Times New Roman"/>
+                <w:b w:val="0"/>
+                <w:sz w:val="20"/>
+              </w:rPr>
+              <w:t>UI Scan + Dashboard</w:t>
+            </w:r>
+          </w:p>
+        </w:tc>
+        <w:tc>
+          <w:tcPr>
+            <w:tcW w:type="dxa" w:w="2929"/>
+          </w:tcPr>
+          <w:p>
+            <w:pPr>
+              <w:jc w:val="left"/>
+            </w:pPr>
+            <w:r/>
+            <w:r>
+              <w:rPr>
+                <w:rFonts w:ascii="Times New Roman" w:hAnsi="Times New Roman" w:eastAsia="Times New Roman"/>
+                <w:b w:val="0"/>
+                <w:sz w:val="20"/>
+              </w:rPr>
+              <w:t>Giao dien hoan chinh</w:t>
+            </w:r>
+          </w:p>
+        </w:tc>
+      </w:tr>
+      <w:tr>
+        <w:tc>
+          <w:tcPr>
+            <w:tcW w:type="dxa" w:w="2929"/>
+            <w:shd w:fill="E8F0FE" w:val="clear"/>
+          </w:tcPr>
+          <w:p>
+            <w:pPr>
+              <w:jc w:val="left"/>
+            </w:pPr>
+            <w:r/>
+            <w:r>
+              <w:rPr>
+                <w:rFonts w:ascii="Times New Roman" w:hAnsi="Times New Roman" w:eastAsia="Times New Roman"/>
+                <w:b w:val="0"/>
+                <w:sz w:val="20"/>
+              </w:rPr>
+              <w:t>7</w:t>
+            </w:r>
+          </w:p>
+        </w:tc>
+        <w:tc>
+          <w:tcPr>
+            <w:tcW w:type="dxa" w:w="2929"/>
+            <w:shd w:fill="E8F0FE" w:val="clear"/>
+          </w:tcPr>
+          <w:p>
+            <w:pPr>
+              <w:jc w:val="left"/>
+            </w:pPr>
+            <w:r/>
+            <w:r>
+              <w:rPr>
+                <w:rFonts w:ascii="Times New Roman" w:hAnsi="Times New Roman" w:eastAsia="Times New Roman"/>
+                <w:b w:val="0"/>
+                <w:sz w:val="20"/>
+              </w:rPr>
+              <w:t>E2E test + Fix + Dong goi</w:t>
+            </w:r>
+          </w:p>
+        </w:tc>
+        <w:tc>
+          <w:tcPr>
+            <w:tcW w:type="dxa" w:w="2929"/>
+            <w:shd w:fill="E8F0FE" w:val="clear"/>
+          </w:tcPr>
+          <w:p>
+            <w:pPr>
+              <w:jc w:val="left"/>
+            </w:pPr>
+            <w:r/>
+            <w:r>
+              <w:rPr>
+                <w:rFonts w:ascii="Times New Roman" w:hAnsi="Times New Roman" w:eastAsia="Times New Roman"/>
+                <w:b w:val="0"/>
+                <w:sz w:val="20"/>
+              </w:rPr>
+              <w:t>MVP deploy duoc</w:t>
+            </w:r>
+          </w:p>
+        </w:tc>
+      </w:tr>
+    </w:tbl>
+    <w:p>
+      <w:r>
+        <w:rPr>
+          <w:rFonts w:ascii="Times New Roman" w:hAnsi="Times New Roman" w:eastAsia="Times New Roman"/>
+          <w:b w:val="0"/>
+          <w:sz w:val="12"/>
+        </w:rPr>
+      </w:r>
+    </w:p>
+    <w:p>
+      <w:pPr>
+        <w:jc w:val="left"/>
+      </w:pPr>
+      <w:r>
+        <w:rPr>
+          <w:rFonts w:ascii="Times New Roman" w:hAnsi="Times New Roman" w:eastAsia="Times New Roman"/>
+          <w:b/>
+          <w:color w:val="0066CC"/>
+          <w:sz w:val="32"/>
+        </w:rPr>
+        <w:t>4.5 Chi phi van hanh</w:t>
+      </w:r>
+    </w:p>
+    <w:tbl>
+      <w:tblPr>
+        <w:tblStyle w:val="TableGrid"/>
+        <w:tblW w:type="auto" w:w="0"/>
+        <w:jc w:val="center"/>
+        <w:tblLook w:firstColumn="1" w:firstRow="1" w:lastColumn="0" w:lastRow="0" w:noHBand="0" w:noVBand="1" w:val="04A0"/>
+      </w:tblPr>
+      <w:tblGrid>
+        <w:gridCol w:w="2929"/>
+        <w:gridCol w:w="2929"/>
+        <w:gridCol w:w="2929"/>
+      </w:tblGrid>
+      <w:tr>
+        <w:tc>
+          <w:tcPr>
+            <w:tcW w:type="dxa" w:w="2929"/>
+            <w:shd w:fill="0066CC" w:val="clear"/>
+          </w:tcPr>
+          <w:p>
+            <w:pPr>
+              <w:jc w:val="center"/>
+            </w:pPr>
+            <w:r/>
+            <w:r>
+              <w:rPr>
+                <w:rFonts w:ascii="Times New Roman" w:hAnsi="Times New Roman" w:eastAsia="Times New Roman"/>
+                <w:b/>
+                <w:color w:val="FFFFFF"/>
+                <w:sz w:val="22"/>
+              </w:rPr>
+              <w:t>Hang muc</w:t>
+            </w:r>
+          </w:p>
+        </w:tc>
+        <w:tc>
+          <w:tcPr>
+            <w:tcW w:type="dxa" w:w="2929"/>
+            <w:shd w:fill="0066CC" w:val="clear"/>
+          </w:tcPr>
+          <w:p>
+            <w:pPr>
+              <w:jc w:val="center"/>
+            </w:pPr>
+            <w:r/>
+            <w:r>
+              <w:rPr>
+                <w:rFonts w:ascii="Times New Roman" w:hAnsi="Times New Roman" w:eastAsia="Times New Roman"/>
+                <w:b/>
+                <w:color w:val="FFFFFF"/>
+                <w:sz w:val="22"/>
+              </w:rPr>
+              <w:t>VNĐ/thang</w:t>
+            </w:r>
+          </w:p>
+        </w:tc>
+        <w:tc>
+          <w:tcPr>
+            <w:tcW w:type="dxa" w:w="2929"/>
+            <w:shd w:fill="0066CC" w:val="clear"/>
+          </w:tcPr>
+          <w:p>
+            <w:pPr>
+              <w:jc w:val="center"/>
+            </w:pPr>
+            <w:r/>
+            <w:r>
+              <w:rPr>
+                <w:rFonts w:ascii="Times New Roman" w:hAnsi="Times New Roman" w:eastAsia="Times New Roman"/>
+                <w:b/>
+                <w:color w:val="FFFFFF"/>
+                <w:sz w:val="22"/>
+              </w:rPr>
+              <w:t>Ghi chu</w:t>
+            </w:r>
+          </w:p>
+        </w:tc>
+      </w:tr>
+      <w:tr>
+        <w:tc>
+          <w:tcPr>
+            <w:tcW w:type="dxa" w:w="2929"/>
+          </w:tcPr>
+          <w:p>
+            <w:pPr>
+              <w:jc w:val="left"/>
+            </w:pPr>
+            <w:r/>
+            <w:r>
+              <w:rPr>
+                <w:rFonts w:ascii="Times New Roman" w:hAnsi="Times New Roman" w:eastAsia="Times New Roman"/>
+                <w:b w:val="0"/>
+                <w:sz w:val="20"/>
+              </w:rPr>
+              <w:t>Server (2 VPS 8GB)</w:t>
+            </w:r>
+          </w:p>
+        </w:tc>
+        <w:tc>
+          <w:tcPr>
+            <w:tcW w:type="dxa" w:w="2929"/>
+          </w:tcPr>
+          <w:p>
+            <w:pPr>
+              <w:jc w:val="left"/>
+            </w:pPr>
+            <w:r/>
+            <w:r>
+              <w:rPr>
+                <w:rFonts w:ascii="Times New Roman" w:hAnsi="Times New Roman" w:eastAsia="Times New Roman"/>
+                <w:b w:val="0"/>
+                <w:sz w:val="20"/>
+              </w:rPr>
+              <w:t>~2.000.000</w:t>
+            </w:r>
+          </w:p>
+        </w:tc>
+        <w:tc>
+          <w:tcPr>
+            <w:tcW w:type="dxa" w:w="2929"/>
+          </w:tcPr>
+          <w:p>
+            <w:pPr>
+              <w:jc w:val="left"/>
+            </w:pPr>
+            <w:r/>
+            <w:r>
+              <w:rPr>
+                <w:rFonts w:ascii="Times New Roman" w:hAnsi="Times New Roman" w:eastAsia="Times New Roman"/>
+                <w:b w:val="0"/>
+                <w:sz w:val="20"/>
+              </w:rPr>
+              <w:t>AWS/VNPT Cloud</w:t>
+            </w:r>
+          </w:p>
+        </w:tc>
+      </w:tr>
+      <w:tr>
+        <w:tc>
+          <w:tcPr>
+            <w:tcW w:type="dxa" w:w="2929"/>
+            <w:shd w:fill="E8F0FE" w:val="clear"/>
+          </w:tcPr>
+          <w:p>
+            <w:pPr>
+              <w:jc w:val="left"/>
+            </w:pPr>
+            <w:r/>
+            <w:r>
+              <w:rPr>
+                <w:rFonts w:ascii="Times New Roman" w:hAnsi="Times New Roman" w:eastAsia="Times New Roman"/>
+                <w:b w:val="0"/>
+                <w:sz w:val="20"/>
+              </w:rPr>
+              <w:t>API VNPT</w:t>
+            </w:r>
+          </w:p>
+        </w:tc>
+        <w:tc>
+          <w:tcPr>
+            <w:tcW w:type="dxa" w:w="2929"/>
+            <w:shd w:fill="E8F0FE" w:val="clear"/>
+          </w:tcPr>
+          <w:p>
+            <w:pPr>
+              <w:jc w:val="left"/>
+            </w:pPr>
+            <w:r/>
+            <w:r>
+              <w:rPr>
+                <w:rFonts w:ascii="Times New Roman" w:hAnsi="Times New Roman" w:eastAsia="Times New Roman"/>
+                <w:b w:val="0"/>
+                <w:sz w:val="20"/>
+              </w:rPr>
+              <w:t>~1.000.000-3.000.000</w:t>
+            </w:r>
+          </w:p>
+        </w:tc>
+        <w:tc>
+          <w:tcPr>
+            <w:tcW w:type="dxa" w:w="2929"/>
+            <w:shd w:fill="E8F0FE" w:val="clear"/>
+          </w:tcPr>
+          <w:p>
+            <w:pPr>
+              <w:jc w:val="left"/>
+            </w:pPr>
+            <w:r/>
+            <w:r>
+              <w:rPr>
+                <w:rFonts w:ascii="Times New Roman" w:hAnsi="Times New Roman" w:eastAsia="Times New Roman"/>
+                <w:b w:val="0"/>
+                <w:sz w:val="20"/>
+              </w:rPr>
+              <w:t>Tuy so luong ho so</w:t>
+            </w:r>
+          </w:p>
+        </w:tc>
+      </w:tr>
+      <w:tr>
+        <w:tc>
+          <w:tcPr>
+            <w:tcW w:type="dxa" w:w="2929"/>
+          </w:tcPr>
+          <w:p>
+            <w:pPr>
+              <w:jc w:val="left"/>
+            </w:pPr>
+            <w:r/>
+            <w:r>
+              <w:rPr>
+                <w:rFonts w:ascii="Times New Roman" w:hAnsi="Times New Roman" w:eastAsia="Times New Roman"/>
+                <w:b w:val="0"/>
+                <w:sz w:val="20"/>
+              </w:rPr>
+              <w:t>MinIO/S3 Storage</w:t>
+            </w:r>
+          </w:p>
+        </w:tc>
+        <w:tc>
+          <w:tcPr>
+            <w:tcW w:type="dxa" w:w="2929"/>
+          </w:tcPr>
+          <w:p>
+            <w:pPr>
+              <w:jc w:val="left"/>
+            </w:pPr>
+            <w:r/>
+            <w:r>
+              <w:rPr>
+                <w:rFonts w:ascii="Times New Roman" w:hAnsi="Times New Roman" w:eastAsia="Times New Roman"/>
+                <w:b w:val="0"/>
+                <w:sz w:val="20"/>
+              </w:rPr>
+              <w:t>~500.000</w:t>
+            </w:r>
+          </w:p>
+        </w:tc>
+        <w:tc>
+          <w:tcPr>
+            <w:tcW w:type="dxa" w:w="2929"/>
+          </w:tcPr>
+          <w:p>
+            <w:pPr>
+              <w:jc w:val="left"/>
+            </w:pPr>
+            <w:r/>
+            <w:r>
+              <w:rPr>
+                <w:rFonts w:ascii="Times New Roman" w:hAnsi="Times New Roman" w:eastAsia="Times New Roman"/>
+                <w:b w:val="0"/>
+                <w:sz w:val="20"/>
+              </w:rPr>
+              <w:t>Luu scan + du lieu</w:t>
+            </w:r>
+          </w:p>
+        </w:tc>
+      </w:tr>
+      <w:tr>
+        <w:tc>
+          <w:tcPr>
+            <w:tcW w:type="dxa" w:w="2929"/>
+            <w:shd w:fill="E8F0FE" w:val="clear"/>
+          </w:tcPr>
+          <w:p>
+            <w:pPr>
+              <w:jc w:val="left"/>
+            </w:pPr>
+            <w:r/>
+            <w:r>
+              <w:rPr>
+                <w:rFonts w:ascii="Times New Roman" w:hAnsi="Times New Roman" w:eastAsia="Times New Roman"/>
+                <w:b w:val="0"/>
+                <w:sz w:val="20"/>
+              </w:rPr>
+              <w:t>Domain + SSL</w:t>
+            </w:r>
+          </w:p>
+        </w:tc>
+        <w:tc>
+          <w:tcPr>
+            <w:tcW w:type="dxa" w:w="2929"/>
+            <w:shd w:fill="E8F0FE" w:val="clear"/>
+          </w:tcPr>
+          <w:p>
+            <w:pPr>
+              <w:jc w:val="left"/>
+            </w:pPr>
+            <w:r/>
+            <w:r>
+              <w:rPr>
+                <w:rFonts w:ascii="Times New Roman" w:hAnsi="Times New Roman" w:eastAsia="Times New Roman"/>
+                <w:b w:val="0"/>
+                <w:sz w:val="20"/>
+              </w:rPr>
+              <w:t>~200.000</w:t>
+            </w:r>
+          </w:p>
+        </w:tc>
+        <w:tc>
+          <w:tcPr>
+            <w:tcW w:type="dxa" w:w="2929"/>
+            <w:shd w:fill="E8F0FE" w:val="clear"/>
+          </w:tcPr>
+          <w:p>
+            <w:pPr>
+              <w:jc w:val="left"/>
+            </w:pPr>
+            <w:r/>
+            <w:r>
+              <w:rPr>
+                <w:rFonts w:ascii="Times New Roman" w:hAnsi="Times New Roman" w:eastAsia="Times New Roman"/>
+                <w:b w:val="0"/>
+                <w:sz w:val="20"/>
+              </w:rPr>
+              <w:t>.gov.vn</w:t>
+            </w:r>
+          </w:p>
+        </w:tc>
+      </w:tr>
+      <w:tr>
+        <w:tc>
+          <w:tcPr>
+            <w:tcW w:type="dxa" w:w="2929"/>
+          </w:tcPr>
+          <w:p>
+            <w:pPr>
+              <w:jc w:val="left"/>
+            </w:pPr>
+            <w:r/>
+            <w:r>
+              <w:rPr>
+                <w:rFonts w:ascii="Times New Roman" w:hAnsi="Times New Roman" w:eastAsia="Times New Roman"/>
+                <w:b w:val="0"/>
+                <w:sz w:val="20"/>
+              </w:rPr>
+              <w:t>DevOps tools</w:t>
+            </w:r>
+          </w:p>
+        </w:tc>
+        <w:tc>
+          <w:tcPr>
+            <w:tcW w:type="dxa" w:w="2929"/>
+          </w:tcPr>
+          <w:p>
+            <w:pPr>
+              <w:jc w:val="left"/>
+            </w:pPr>
+            <w:r/>
+            <w:r>
+              <w:rPr>
+                <w:rFonts w:ascii="Times New Roman" w:hAnsi="Times New Roman" w:eastAsia="Times New Roman"/>
+                <w:b w:val="0"/>
+                <w:sz w:val="20"/>
+              </w:rPr>
+              <w:t>Mien phi</w:t>
+            </w:r>
+          </w:p>
+        </w:tc>
+        <w:tc>
+          <w:tcPr>
+            <w:tcW w:type="dxa" w:w="2929"/>
+          </w:tcPr>
+          <w:p>
+            <w:pPr>
+              <w:jc w:val="left"/>
+            </w:pPr>
+            <w:r/>
+            <w:r>
+              <w:rPr>
+                <w:rFonts w:ascii="Times New Roman" w:hAnsi="Times New Roman" w:eastAsia="Times New Roman"/>
+                <w:b w:val="0"/>
+                <w:sz w:val="20"/>
+              </w:rPr>
+              <w:t>GitHub/Docker Free</w:t>
+            </w:r>
+          </w:p>
+        </w:tc>
+      </w:tr>
+      <w:tr>
+        <w:tc>
+          <w:tcPr>
+            <w:tcW w:type="dxa" w:w="2929"/>
+            <w:shd w:fill="E8F0FE" w:val="clear"/>
+          </w:tcPr>
+          <w:p>
+            <w:pPr>
+              <w:jc w:val="left"/>
+            </w:pPr>
+            <w:r/>
+            <w:r>
+              <w:rPr>
+                <w:rFonts w:ascii="Times New Roman" w:hAnsi="Times New Roman" w:eastAsia="Times New Roman"/>
+                <w:b w:val="0"/>
+                <w:sz w:val="20"/>
+              </w:rPr>
+              <w:t>Tong</w:t>
+            </w:r>
+          </w:p>
+        </w:tc>
+        <w:tc>
+          <w:tcPr>
+            <w:tcW w:type="dxa" w:w="2929"/>
+            <w:shd w:fill="E8F0FE" w:val="clear"/>
+          </w:tcPr>
+          <w:p>
+            <w:pPr>
+              <w:jc w:val="left"/>
+            </w:pPr>
+            <w:r/>
+            <w:r>
+              <w:rPr>
+                <w:rFonts w:ascii="Times New Roman" w:hAnsi="Times New Roman" w:eastAsia="Times New Roman"/>
+                <w:b w:val="0"/>
+                <w:sz w:val="20"/>
+              </w:rPr>
+              <w:t>~3.700.000-5.700.000</w:t>
+            </w:r>
+          </w:p>
+        </w:tc>
+        <w:tc>
+          <w:tcPr>
+            <w:tcW w:type="dxa" w:w="2929"/>
+            <w:shd w:fill="E8F0FE" w:val="clear"/>
+          </w:tcPr>
+          <w:p>
+            <w:pPr>
+              <w:jc w:val="left"/>
+            </w:pPr>
+            <w:r/>
+            <w:r>
+              <w:rPr>
+                <w:rFonts w:ascii="Times New Roman" w:hAnsi="Times New Roman" w:eastAsia="Times New Roman"/>
+                <w:b w:val="0"/>
+                <w:sz w:val="20"/>
+              </w:rPr>
+              <w:t>~$150-230/thang</w:t>
+            </w:r>
+          </w:p>
+        </w:tc>
+      </w:tr>
+    </w:tbl>
+    <w:p>
+      <w:pPr>
+        <w:spacing w:line="360" w:lineRule="auto"/>
+        <w:ind w:firstLine="720"/>
+        <w:jc w:val="both"/>
+      </w:pPr>
+      <w:r>
+        <w:rPr>
+          <w:rFonts w:ascii="Times New Roman" w:hAnsi="Times New Roman" w:eastAsia="Times New Roman"/>
+          <w:b w:val="0"/>
+          <w:sz w:val="28"/>
+        </w:rPr>
+        <w:t>Chi phi setup: 20-30 trieu (may scan ong). Tiet kiem ~60% so voi nhan cong.</w:t>
+      </w:r>
+    </w:p>
+    <w:p>
+      <w:pPr>
+        <w:jc w:val="left"/>
+      </w:pPr>
+      <w:r>
+        <w:rPr>
+          <w:rFonts w:ascii="Times New Roman" w:hAnsi="Times New Roman" w:eastAsia="Times New Roman"/>
+          <w:b/>
+          <w:color w:val="0066CC"/>
+          <w:sz w:val="32"/>
+        </w:rPr>
+        <w:t>4.6 An toan bao mat &amp; Phap ly</w:t>
+      </w:r>
+    </w:p>
+    <w:tbl>
+      <w:tblPr>
+        <w:tblStyle w:val="TableGrid"/>
+        <w:tblW w:type="auto" w:w="0"/>
+        <w:jc w:val="center"/>
+        <w:tblLook w:firstColumn="1" w:firstRow="1" w:lastColumn="0" w:lastRow="0" w:noHBand="0" w:noVBand="1" w:val="04A0"/>
+      </w:tblPr>
+      <w:tblGrid>
+        <w:gridCol w:w="4394"/>
+        <w:gridCol w:w="4394"/>
+      </w:tblGrid>
+      <w:tr>
+        <w:tc>
+          <w:tcPr>
+            <w:tcW w:type="dxa" w:w="4394"/>
+            <w:shd w:fill="0066CC" w:val="clear"/>
+          </w:tcPr>
+          <w:p>
+            <w:pPr>
+              <w:jc w:val="center"/>
+            </w:pPr>
+            <w:r/>
+            <w:r>
+              <w:rPr>
+                <w:rFonts w:ascii="Times New Roman" w:hAnsi="Times New Roman" w:eastAsia="Times New Roman"/>
+                <w:b/>
+                <w:color w:val="FFFFFF"/>
+                <w:sz w:val="22"/>
+              </w:rPr>
+              <w:t>Yeu cau</w:t>
+            </w:r>
+          </w:p>
+        </w:tc>
+        <w:tc>
+          <w:tcPr>
+            <w:tcW w:type="dxa" w:w="4394"/>
+            <w:shd w:fill="0066CC" w:val="clear"/>
+          </w:tcPr>
+          <w:p>
+            <w:pPr>
+              <w:jc w:val="center"/>
+            </w:pPr>
+            <w:r/>
+            <w:r>
+              <w:rPr>
+                <w:rFonts w:ascii="Times New Roman" w:hAnsi="Times New Roman" w:eastAsia="Times New Roman"/>
+                <w:b/>
+                <w:color w:val="FFFFFF"/>
+                <w:sz w:val="22"/>
+              </w:rPr>
+              <w:t>Giai phap</w:t>
+            </w:r>
+          </w:p>
+        </w:tc>
+      </w:tr>
+      <w:tr>
+        <w:tc>
+          <w:tcPr>
+            <w:tcW w:type="dxa" w:w="4394"/>
+          </w:tcPr>
+          <w:p>
+            <w:pPr>
+              <w:jc w:val="left"/>
+            </w:pPr>
+            <w:r/>
+            <w:r>
+              <w:rPr>
+                <w:rFonts w:ascii="Times New Roman" w:hAnsi="Times New Roman" w:eastAsia="Times New Roman"/>
+                <w:b w:val="0"/>
+                <w:sz w:val="20"/>
+              </w:rPr>
+              <w:t>Bao ve du lieu CN</w:t>
+            </w:r>
+          </w:p>
+        </w:tc>
+        <w:tc>
+          <w:tcPr>
+            <w:tcW w:type="dxa" w:w="4394"/>
+          </w:tcPr>
+          <w:p>
+            <w:pPr>
+              <w:jc w:val="left"/>
+            </w:pPr>
+            <w:r/>
+            <w:r>
+              <w:rPr>
+                <w:rFonts w:ascii="Times New Roman" w:hAnsi="Times New Roman" w:eastAsia="Times New Roman"/>
+                <w:b w:val="0"/>
+                <w:sz w:val="20"/>
+              </w:rPr>
+              <w:t>Nghi dinh 13/2023 - AES-256, TLS 1.3</w:t>
+            </w:r>
+          </w:p>
+        </w:tc>
+      </w:tr>
+      <w:tr>
+        <w:tc>
+          <w:tcPr>
+            <w:tcW w:type="dxa" w:w="4394"/>
+            <w:shd w:fill="E8F0FE" w:val="clear"/>
+          </w:tcPr>
+          <w:p>
+            <w:pPr>
+              <w:jc w:val="left"/>
+            </w:pPr>
+            <w:r/>
+            <w:r>
+              <w:rPr>
+                <w:rFonts w:ascii="Times New Roman" w:hAnsi="Times New Roman" w:eastAsia="Times New Roman"/>
+                <w:b w:val="0"/>
+                <w:sz w:val="20"/>
+              </w:rPr>
+              <w:t>So hoa tai lieu</w:t>
+            </w:r>
+          </w:p>
+        </w:tc>
+        <w:tc>
+          <w:tcPr>
+            <w:tcW w:type="dxa" w:w="4394"/>
+            <w:shd w:fill="E8F0FE" w:val="clear"/>
+          </w:tcPr>
+          <w:p>
+            <w:pPr>
+              <w:jc w:val="left"/>
+            </w:pPr>
+            <w:r/>
+            <w:r>
+              <w:rPr>
+                <w:rFonts w:ascii="Times New Roman" w:hAnsi="Times New Roman" w:eastAsia="Times New Roman"/>
+                <w:b w:val="0"/>
+                <w:sz w:val="20"/>
+              </w:rPr>
+              <w:t>Thong tu 01/2019/TT-BNV</w:t>
+            </w:r>
+          </w:p>
+        </w:tc>
+      </w:tr>
+      <w:tr>
+        <w:tc>
+          <w:tcPr>
+            <w:tcW w:type="dxa" w:w="4394"/>
+          </w:tcPr>
+          <w:p>
+            <w:pPr>
+              <w:jc w:val="left"/>
+            </w:pPr>
+            <w:r/>
+            <w:r>
+              <w:rPr>
+                <w:rFonts w:ascii="Times New Roman" w:hAnsi="Times New Roman" w:eastAsia="Times New Roman"/>
+                <w:b w:val="0"/>
+                <w:sz w:val="20"/>
+              </w:rPr>
+              <w:t>An toan TT</w:t>
+            </w:r>
+          </w:p>
+        </w:tc>
+        <w:tc>
+          <w:tcPr>
+            <w:tcW w:type="dxa" w:w="4394"/>
+          </w:tcPr>
+          <w:p>
+            <w:pPr>
+              <w:jc w:val="left"/>
+            </w:pPr>
+            <w:r/>
+            <w:r>
+              <w:rPr>
+                <w:rFonts w:ascii="Times New Roman" w:hAnsi="Times New Roman" w:eastAsia="Times New Roman"/>
+                <w:b w:val="0"/>
+                <w:sz w:val="20"/>
+              </w:rPr>
+              <w:t>Luat ATTT 2015 - Audit log</w:t>
+            </w:r>
+          </w:p>
+        </w:tc>
+      </w:tr>
+      <w:tr>
+        <w:tc>
+          <w:tcPr>
+            <w:tcW w:type="dxa" w:w="4394"/>
+            <w:shd w:fill="E8F0FE" w:val="clear"/>
+          </w:tcPr>
+          <w:p>
+            <w:pPr>
+              <w:jc w:val="left"/>
+            </w:pPr>
+            <w:r/>
+            <w:r>
+              <w:rPr>
+                <w:rFonts w:ascii="Times New Roman" w:hAnsi="Times New Roman" w:eastAsia="Times New Roman"/>
+                <w:b w:val="0"/>
+                <w:sz w:val="20"/>
+              </w:rPr>
+              <w:t>Luu tru so</w:t>
+            </w:r>
+          </w:p>
+        </w:tc>
+        <w:tc>
+          <w:tcPr>
+            <w:tcW w:type="dxa" w:w="4394"/>
+            <w:shd w:fill="E8F0FE" w:val="clear"/>
+          </w:tcPr>
+          <w:p>
+            <w:pPr>
+              <w:jc w:val="left"/>
+            </w:pPr>
+            <w:r/>
+            <w:r>
+              <w:rPr>
+                <w:rFonts w:ascii="Times New Roman" w:hAnsi="Times New Roman" w:eastAsia="Times New Roman"/>
+                <w:b w:val="0"/>
+                <w:sz w:val="20"/>
+              </w:rPr>
+              <w:t>Luat Luu tru 2011</w:t>
+            </w:r>
+          </w:p>
+        </w:tc>
+      </w:tr>
+    </w:tbl>
+    <w:p>
+      <w:r>
+        <w:rPr>
+          <w:rFonts w:ascii="Times New Roman" w:hAnsi="Times New Roman" w:eastAsia="Times New Roman"/>
+          <w:b w:val="0"/>
+          <w:sz w:val="12"/>
+        </w:rPr>
+      </w:r>
+    </w:p>
+    <w:p>
+      <w:pPr>
+        <w:jc w:val="left"/>
+      </w:pPr>
+      <w:r>
+        <w:rPr>
+          <w:rFonts w:ascii="Times New Roman" w:hAnsi="Times New Roman" w:eastAsia="Times New Roman"/>
+          <w:b/>
+          <w:color w:val="0066CC"/>
+          <w:sz w:val="32"/>
+        </w:rPr>
+        <w:t>4.7 Lo trinh phat trien</w:t>
+      </w:r>
+    </w:p>
+    <w:p>
+      <w:pPr>
+        <w:spacing w:line="360" w:lineRule="auto"/>
+        <w:ind w:left="567"/>
+        <w:jc w:val="left"/>
+      </w:pPr>
+      <w:r>
+        <w:rPr>
+          <w:rFonts w:ascii="Times New Roman" w:hAnsi="Times New Roman" w:eastAsia="Times New Roman"/>
+          <w:b/>
+          <w:sz w:val="26"/>
+        </w:rPr>
+        <w:t>Thang 1-2:</w:t>
+      </w:r>
+      <w:r>
+        <w:rPr>
+          <w:rFonts w:ascii="Times New Roman" w:hAnsi="Times New Roman" w:eastAsia="Times New Roman"/>
+          <w:b w:val="0"/>
+          <w:sz w:val="26"/>
+        </w:rPr>
+        <w:t xml:space="preserve"> MVP -&gt; Pilot 1 phuong, 5.000 ho so</w:t>
+      </w:r>
+    </w:p>
+    <w:p>
+      <w:pPr>
+        <w:spacing w:line="360" w:lineRule="auto"/>
+        <w:ind w:left="567"/>
+        <w:jc w:val="left"/>
+      </w:pPr>
+      <w:r>
+        <w:rPr>
+          <w:rFonts w:ascii="Times New Roman" w:hAnsi="Times New Roman" w:eastAsia="Times New Roman"/>
+          <w:b/>
+          <w:sz w:val="26"/>
+        </w:rPr>
+        <w:t>Thang 3-4:</w:t>
+      </w:r>
+      <w:r>
+        <w:rPr>
+          <w:rFonts w:ascii="Times New Roman" w:hAnsi="Times New Roman" w:eastAsia="Times New Roman"/>
+          <w:b w:val="0"/>
+          <w:sz w:val="26"/>
+        </w:rPr>
+        <w:t xml:space="preserve"> Feedback -&gt; Scale 5-10 quan/huyen</w:t>
+      </w:r>
+    </w:p>
+    <w:p>
+      <w:pPr>
+        <w:spacing w:line="360" w:lineRule="auto"/>
+        <w:ind w:left="567"/>
+        <w:jc w:val="left"/>
+      </w:pPr>
+      <w:r>
+        <w:rPr>
+          <w:rFonts w:ascii="Times New Roman" w:hAnsi="Times New Roman" w:eastAsia="Times New Roman"/>
+          <w:b/>
+          <w:sz w:val="26"/>
+        </w:rPr>
+        <w:t>Thang 5-6:</w:t>
+      </w:r>
+      <w:r>
+        <w:rPr>
+          <w:rFonts w:ascii="Times New Roman" w:hAnsi="Times New Roman" w:eastAsia="Times New Roman"/>
+          <w:b w:val="0"/>
+          <w:sz w:val="26"/>
+        </w:rPr>
+        <w:t xml:space="preserve"> Tich hop CSDL QG -&gt; Mo rong loai giay to</w:t>
+      </w:r>
+    </w:p>
+    <w:p>
+      <w:pPr>
+        <w:spacing w:line="360" w:lineRule="auto"/>
+        <w:ind w:left="567"/>
+        <w:jc w:val="left"/>
+      </w:pPr>
+      <w:r>
+        <w:rPr>
+          <w:rFonts w:ascii="Times New Roman" w:hAnsi="Times New Roman" w:eastAsia="Times New Roman"/>
+          <w:b/>
+          <w:sz w:val="26"/>
+        </w:rPr>
+        <w:t>Thang 7-12:</w:t>
+      </w:r>
+      <w:r>
+        <w:rPr>
+          <w:rFonts w:ascii="Times New Roman" w:hAnsi="Times New Roman" w:eastAsia="Times New Roman"/>
+          <w:b w:val="0"/>
+          <w:sz w:val="26"/>
+        </w:rPr>
+        <w:t xml:space="preserve"> Trieu khai dien rong -&gt; Hop tac VNPT</w:t>
+      </w:r>
+    </w:p>
+    <w:p>
+      <w:r>
+        <w:br w:type="page"/>
+      </w:r>
+    </w:p>
+    <w:p>
+      <w:pPr>
+        <w:jc w:val="left"/>
+        <w:pBdr>
+          <w:bottom w:val="single" w:sz="8" w:space="1" w:color="0066CC"/>
+        </w:pBdr>
+      </w:pPr>
+      <w:r>
+        <w:rPr>
+          <w:rFonts w:ascii="Times New Roman" w:hAnsi="Times New Roman" w:eastAsia="Times New Roman"/>
+          <w:b/>
+          <w:color w:val="0066CC"/>
+          <w:sz w:val="36"/>
+        </w:rPr>
+        <w:t>5. TINH DOI MOI &amp; KHAC BIET</w:t>
+      </w:r>
+    </w:p>
+    <w:p>
+      <w:pPr>
+        <w:jc w:val="left"/>
+      </w:pPr>
+      <w:r>
+        <w:rPr>
+          <w:rFonts w:ascii="Times New Roman" w:hAnsi="Times New Roman" w:eastAsia="Times New Roman"/>
+          <w:b/>
+          <w:color w:val="0066CC"/>
+          <w:sz w:val="32"/>
+        </w:rPr>
+        <w:t>5.1 So sanh voi giai phap hien tai</w:t>
+      </w:r>
+    </w:p>
+    <w:p>
+      <w:pPr>
+        <w:spacing w:line="360" w:lineRule="auto"/>
+        <w:ind w:firstLine="720"/>
+        <w:jc w:val="both"/>
+      </w:pPr>
+      <w:r>
+        <w:rPr>
+          <w:rFonts w:ascii="Times New Roman" w:hAnsi="Times New Roman" w:eastAsia="Times New Roman"/>
+          <w:b w:val="0"/>
+          <w:sz w:val="28"/>
+        </w:rPr>
+        <w:t>So sanh AutoCheck voi cac giai phap so hoa tai lieu hien co:</w:t>
+      </w:r>
+    </w:p>
+    <w:tbl>
+      <w:tblPr>
+        <w:tblStyle w:val="TableGrid"/>
+        <w:tblW w:type="auto" w:w="0"/>
+        <w:jc w:val="center"/>
+        <w:tblLook w:firstColumn="1" w:firstRow="1" w:lastColumn="0" w:lastRow="0" w:noHBand="0" w:noVBand="1" w:val="04A0"/>
+      </w:tblPr>
+      <w:tblGrid>
+        <w:gridCol w:w="2929"/>
+        <w:gridCol w:w="2929"/>
+        <w:gridCol w:w="2929"/>
+      </w:tblGrid>
+      <w:tr>
+        <w:tc>
+          <w:tcPr>
+            <w:tcW w:type="dxa" w:w="2929"/>
+            <w:shd w:fill="0066CC" w:val="clear"/>
+          </w:tcPr>
+          <w:p>
+            <w:pPr>
+              <w:jc w:val="center"/>
+            </w:pPr>
+            <w:r/>
+            <w:r>
+              <w:rPr>
+                <w:rFonts w:ascii="Times New Roman" w:hAnsi="Times New Roman" w:eastAsia="Times New Roman"/>
+                <w:b/>
+                <w:color w:val="FFFFFF"/>
+                <w:sz w:val="22"/>
+              </w:rPr>
+              <w:t>Tieu chi</w:t>
+            </w:r>
+          </w:p>
+        </w:tc>
+        <w:tc>
+          <w:tcPr>
+            <w:tcW w:type="dxa" w:w="2929"/>
+            <w:shd w:fill="0066CC" w:val="clear"/>
+          </w:tcPr>
+          <w:p>
+            <w:pPr>
+              <w:jc w:val="center"/>
+            </w:pPr>
+            <w:r/>
+            <w:r>
+              <w:rPr>
+                <w:rFonts w:ascii="Times New Roman" w:hAnsi="Times New Roman" w:eastAsia="Times New Roman"/>
+                <w:b/>
+                <w:color w:val="FFFFFF"/>
+                <w:sz w:val="22"/>
+              </w:rPr>
+              <w:t>Giai phap hien tai</w:t>
+            </w:r>
+          </w:p>
+        </w:tc>
+        <w:tc>
+          <w:tcPr>
+            <w:tcW w:type="dxa" w:w="2929"/>
+            <w:shd w:fill="0066CC" w:val="clear"/>
+          </w:tcPr>
+          <w:p>
+            <w:pPr>
+              <w:jc w:val="center"/>
+            </w:pPr>
+            <w:r/>
+            <w:r>
+              <w:rPr>
+                <w:rFonts w:ascii="Times New Roman" w:hAnsi="Times New Roman" w:eastAsia="Times New Roman"/>
+                <w:b/>
+                <w:color w:val="FFFFFF"/>
+                <w:sz w:val="22"/>
+              </w:rPr>
+              <w:t>AutoCheck</w:t>
+            </w:r>
+          </w:p>
+        </w:tc>
+      </w:tr>
+      <w:tr>
+        <w:tc>
+          <w:tcPr>
+            <w:tcW w:type="dxa" w:w="2929"/>
+          </w:tcPr>
+          <w:p>
+            <w:pPr>
+              <w:jc w:val="left"/>
+            </w:pPr>
+            <w:r/>
+            <w:r>
+              <w:rPr>
+                <w:rFonts w:ascii="Times New Roman" w:hAnsi="Times New Roman" w:eastAsia="Times New Roman"/>
+                <w:b w:val="0"/>
+                <w:sz w:val="20"/>
+              </w:rPr>
+              <w:t>Toc do xu ly</w:t>
+            </w:r>
+          </w:p>
+        </w:tc>
+        <w:tc>
+          <w:tcPr>
+            <w:tcW w:type="dxa" w:w="2929"/>
+          </w:tcPr>
+          <w:p>
+            <w:pPr>
+              <w:jc w:val="left"/>
+            </w:pPr>
+            <w:r/>
+            <w:r>
+              <w:rPr>
+                <w:rFonts w:ascii="Times New Roman" w:hAnsi="Times New Roman" w:eastAsia="Times New Roman"/>
+                <w:b w:val="0"/>
+                <w:sz w:val="20"/>
+              </w:rPr>
+              <w:t>30-60 phut/ho so</w:t>
+            </w:r>
+          </w:p>
+        </w:tc>
+        <w:tc>
+          <w:tcPr>
+            <w:tcW w:type="dxa" w:w="2929"/>
+          </w:tcPr>
+          <w:p>
+            <w:pPr>
+              <w:jc w:val="left"/>
+            </w:pPr>
+            <w:r/>
+            <w:r>
+              <w:rPr>
+                <w:rFonts w:ascii="Times New Roman" w:hAnsi="Times New Roman" w:eastAsia="Times New Roman"/>
+                <w:b w:val="0"/>
+                <w:sz w:val="20"/>
+              </w:rPr>
+              <w:t>2-5 phut (nhanh 10-15x)</w:t>
+            </w:r>
+          </w:p>
+        </w:tc>
+      </w:tr>
+      <w:tr>
+        <w:tc>
+          <w:tcPr>
+            <w:tcW w:type="dxa" w:w="2929"/>
+            <w:shd w:fill="E8F0FE" w:val="clear"/>
+          </w:tcPr>
+          <w:p>
+            <w:pPr>
+              <w:jc w:val="left"/>
+            </w:pPr>
+            <w:r/>
+            <w:r>
+              <w:rPr>
+                <w:rFonts w:ascii="Times New Roman" w:hAnsi="Times New Roman" w:eastAsia="Times New Roman"/>
+                <w:b w:val="0"/>
+                <w:sz w:val="20"/>
+              </w:rPr>
+              <w:t>Do chinh xac</w:t>
+            </w:r>
+          </w:p>
+        </w:tc>
+        <w:tc>
+          <w:tcPr>
+            <w:tcW w:type="dxa" w:w="2929"/>
+            <w:shd w:fill="E8F0FE" w:val="clear"/>
+          </w:tcPr>
+          <w:p>
+            <w:pPr>
+              <w:jc w:val="left"/>
+            </w:pPr>
+            <w:r/>
+            <w:r>
+              <w:rPr>
+                <w:rFonts w:ascii="Times New Roman" w:hAnsi="Times New Roman" w:eastAsia="Times New Roman"/>
+                <w:b w:val="0"/>
+                <w:sz w:val="20"/>
+              </w:rPr>
+              <w:t>Phu thuoc tay nghe</w:t>
+            </w:r>
+          </w:p>
+        </w:tc>
+        <w:tc>
+          <w:tcPr>
+            <w:tcW w:type="dxa" w:w="2929"/>
+            <w:shd w:fill="E8F0FE" w:val="clear"/>
+          </w:tcPr>
+          <w:p>
+            <w:pPr>
+              <w:jc w:val="left"/>
+            </w:pPr>
+            <w:r/>
+            <w:r>
+              <w:rPr>
+                <w:rFonts w:ascii="Times New Roman" w:hAnsi="Times New Roman" w:eastAsia="Times New Roman"/>
+                <w:b w:val="0"/>
+                <w:sz w:val="20"/>
+              </w:rPr>
+              <w:t>&gt;95% (AI OCR + doi chieu)</w:t>
+            </w:r>
+          </w:p>
+        </w:tc>
+      </w:tr>
+      <w:tr>
+        <w:tc>
+          <w:tcPr>
+            <w:tcW w:type="dxa" w:w="2929"/>
+          </w:tcPr>
+          <w:p>
+            <w:pPr>
+              <w:jc w:val="left"/>
+            </w:pPr>
+            <w:r/>
+            <w:r>
+              <w:rPr>
+                <w:rFonts w:ascii="Times New Roman" w:hAnsi="Times New Roman" w:eastAsia="Times New Roman"/>
+                <w:b w:val="0"/>
+                <w:sz w:val="20"/>
+              </w:rPr>
+              <w:t>Phan loai</w:t>
+            </w:r>
+          </w:p>
+        </w:tc>
+        <w:tc>
+          <w:tcPr>
+            <w:tcW w:type="dxa" w:w="2929"/>
+          </w:tcPr>
+          <w:p>
+            <w:pPr>
+              <w:jc w:val="left"/>
+            </w:pPr>
+            <w:r/>
+            <w:r>
+              <w:rPr>
+                <w:rFonts w:ascii="Times New Roman" w:hAnsi="Times New Roman" w:eastAsia="Times New Roman"/>
+                <w:b w:val="0"/>
+                <w:sz w:val="20"/>
+              </w:rPr>
+              <w:t>Thu cong</w:t>
+            </w:r>
+          </w:p>
+        </w:tc>
+        <w:tc>
+          <w:tcPr>
+            <w:tcW w:type="dxa" w:w="2929"/>
+          </w:tcPr>
+          <w:p>
+            <w:pPr>
+              <w:jc w:val="left"/>
+            </w:pPr>
+            <w:r/>
+            <w:r>
+              <w:rPr>
+                <w:rFonts w:ascii="Times New Roman" w:hAnsi="Times New Roman" w:eastAsia="Times New Roman"/>
+                <w:b w:val="0"/>
+                <w:sz w:val="20"/>
+              </w:rPr>
+              <w:t>AI tu dong (SmartVision)</w:t>
+            </w:r>
+          </w:p>
+        </w:tc>
+      </w:tr>
+      <w:tr>
+        <w:tc>
+          <w:tcPr>
+            <w:tcW w:type="dxa" w:w="2929"/>
+            <w:shd w:fill="E8F0FE" w:val="clear"/>
+          </w:tcPr>
+          <w:p>
+            <w:pPr>
+              <w:jc w:val="left"/>
+            </w:pPr>
+            <w:r/>
+            <w:r>
+              <w:rPr>
+                <w:rFonts w:ascii="Times New Roman" w:hAnsi="Times New Roman" w:eastAsia="Times New Roman"/>
+                <w:b w:val="0"/>
+                <w:sz w:val="20"/>
+              </w:rPr>
+              <w:t>Boc tach</w:t>
+            </w:r>
+          </w:p>
+        </w:tc>
+        <w:tc>
+          <w:tcPr>
+            <w:tcW w:type="dxa" w:w="2929"/>
+            <w:shd w:fill="E8F0FE" w:val="clear"/>
+          </w:tcPr>
+          <w:p>
+            <w:pPr>
+              <w:jc w:val="left"/>
+            </w:pPr>
+            <w:r/>
+            <w:r>
+              <w:rPr>
+                <w:rFonts w:ascii="Times New Roman" w:hAnsi="Times New Roman" w:eastAsia="Times New Roman"/>
+                <w:b w:val="0"/>
+                <w:sz w:val="20"/>
+              </w:rPr>
+              <w:t>Nhap lieu thu cong</w:t>
+            </w:r>
+          </w:p>
+        </w:tc>
+        <w:tc>
+          <w:tcPr>
+            <w:tcW w:type="dxa" w:w="2929"/>
+            <w:shd w:fill="E8F0FE" w:val="clear"/>
+          </w:tcPr>
+          <w:p>
+            <w:pPr>
+              <w:jc w:val="left"/>
+            </w:pPr>
+            <w:r/>
+            <w:r>
+              <w:rPr>
+                <w:rFonts w:ascii="Times New Roman" w:hAnsi="Times New Roman" w:eastAsia="Times New Roman"/>
+                <w:b w:val="0"/>
+                <w:sz w:val="20"/>
+              </w:rPr>
+              <w:t>AI tu dong, co cau truc</w:t>
+            </w:r>
+          </w:p>
+        </w:tc>
+      </w:tr>
+      <w:tr>
+        <w:tc>
+          <w:tcPr>
+            <w:tcW w:type="dxa" w:w="2929"/>
+          </w:tcPr>
+          <w:p>
+            <w:pPr>
+              <w:jc w:val="left"/>
+            </w:pPr>
+            <w:r/>
+            <w:r>
+              <w:rPr>
+                <w:rFonts w:ascii="Times New Roman" w:hAnsi="Times New Roman" w:eastAsia="Times New Roman"/>
+                <w:b w:val="0"/>
+                <w:sz w:val="20"/>
+              </w:rPr>
+              <w:t>Doi chieu CSDL</w:t>
+            </w:r>
+          </w:p>
+        </w:tc>
+        <w:tc>
+          <w:tcPr>
+            <w:tcW w:type="dxa" w:w="2929"/>
+          </w:tcPr>
+          <w:p>
+            <w:pPr>
+              <w:jc w:val="left"/>
+            </w:pPr>
+            <w:r/>
+            <w:r>
+              <w:rPr>
+                <w:rFonts w:ascii="Times New Roman" w:hAnsi="Times New Roman" w:eastAsia="Times New Roman"/>
+                <w:b w:val="0"/>
+                <w:sz w:val="20"/>
+              </w:rPr>
+              <w:t>Tra cuu thu cong</w:t>
+            </w:r>
+          </w:p>
+        </w:tc>
+        <w:tc>
+          <w:tcPr>
+            <w:tcW w:type="dxa" w:w="2929"/>
+          </w:tcPr>
+          <w:p>
+            <w:pPr>
+              <w:jc w:val="left"/>
+            </w:pPr>
+            <w:r/>
+            <w:r>
+              <w:rPr>
+                <w:rFonts w:ascii="Times New Roman" w:hAnsi="Times New Roman" w:eastAsia="Times New Roman"/>
+                <w:b w:val="0"/>
+                <w:sz w:val="20"/>
+              </w:rPr>
+              <w:t>AI tu dong, real-time</w:t>
+            </w:r>
+          </w:p>
+        </w:tc>
+      </w:tr>
+      <w:tr>
+        <w:tc>
+          <w:tcPr>
+            <w:tcW w:type="dxa" w:w="2929"/>
+            <w:shd w:fill="E8F0FE" w:val="clear"/>
+          </w:tcPr>
+          <w:p>
+            <w:pPr>
+              <w:jc w:val="left"/>
+            </w:pPr>
+            <w:r/>
+            <w:r>
+              <w:rPr>
+                <w:rFonts w:ascii="Times New Roman" w:hAnsi="Times New Roman" w:eastAsia="Times New Roman"/>
+                <w:b w:val="0"/>
+                <w:sz w:val="20"/>
+              </w:rPr>
+              <w:t>Phat hien sai lech</w:t>
+            </w:r>
+          </w:p>
+        </w:tc>
+        <w:tc>
+          <w:tcPr>
+            <w:tcW w:type="dxa" w:w="2929"/>
+            <w:shd w:fill="E8F0FE" w:val="clear"/>
+          </w:tcPr>
+          <w:p>
+            <w:pPr>
+              <w:jc w:val="left"/>
+            </w:pPr>
+            <w:r/>
+            <w:r>
+              <w:rPr>
+                <w:rFonts w:ascii="Times New Roman" w:hAnsi="Times New Roman" w:eastAsia="Times New Roman"/>
+                <w:b w:val="0"/>
+                <w:sz w:val="20"/>
+              </w:rPr>
+              <w:t>Mat thuong</w:t>
+            </w:r>
+          </w:p>
+        </w:tc>
+        <w:tc>
+          <w:tcPr>
+            <w:tcW w:type="dxa" w:w="2929"/>
+            <w:shd w:fill="E8F0FE" w:val="clear"/>
+          </w:tcPr>
+          <w:p>
+            <w:pPr>
+              <w:jc w:val="left"/>
+            </w:pPr>
+            <w:r/>
+            <w:r>
+              <w:rPr>
+                <w:rFonts w:ascii="Times New Roman" w:hAnsi="Times New Roman" w:eastAsia="Times New Roman"/>
+                <w:b w:val="0"/>
+                <w:sz w:val="20"/>
+              </w:rPr>
+              <w:t>AI tu dong + canh bao</w:t>
+            </w:r>
+          </w:p>
+        </w:tc>
+      </w:tr>
+      <w:tr>
+        <w:tc>
+          <w:tcPr>
+            <w:tcW w:type="dxa" w:w="2929"/>
+          </w:tcPr>
+          <w:p>
+            <w:pPr>
+              <w:jc w:val="left"/>
+            </w:pPr>
+            <w:r/>
+            <w:r>
+              <w:rPr>
+                <w:rFonts w:ascii="Times New Roman" w:hAnsi="Times New Roman" w:eastAsia="Times New Roman"/>
+                <w:b w:val="0"/>
+                <w:sz w:val="20"/>
+              </w:rPr>
+              <w:t>Luu tru</w:t>
+            </w:r>
+          </w:p>
+        </w:tc>
+        <w:tc>
+          <w:tcPr>
+            <w:tcW w:type="dxa" w:w="2929"/>
+          </w:tcPr>
+          <w:p>
+            <w:pPr>
+              <w:jc w:val="left"/>
+            </w:pPr>
+            <w:r/>
+            <w:r>
+              <w:rPr>
+                <w:rFonts w:ascii="Times New Roman" w:hAnsi="Times New Roman" w:eastAsia="Times New Roman"/>
+                <w:b w:val="0"/>
+                <w:sz w:val="20"/>
+              </w:rPr>
+              <w:t>Kho giay</w:t>
+            </w:r>
+          </w:p>
+        </w:tc>
+        <w:tc>
+          <w:tcPr>
+            <w:tcW w:type="dxa" w:w="2929"/>
+          </w:tcPr>
+          <w:p>
+            <w:pPr>
+              <w:jc w:val="left"/>
+            </w:pPr>
+            <w:r/>
+            <w:r>
+              <w:rPr>
+                <w:rFonts w:ascii="Times New Roman" w:hAnsi="Times New Roman" w:eastAsia="Times New Roman"/>
+                <w:b w:val="0"/>
+                <w:sz w:val="20"/>
+              </w:rPr>
+              <w:t>So hoa, backup, tim kiem nhanh</w:t>
+            </w:r>
+          </w:p>
+        </w:tc>
+      </w:tr>
+    </w:tbl>
+    <w:p>
+      <w:pPr>
+        <w:spacing w:line="360" w:lineRule="auto"/>
+        <w:ind w:firstLine="720"/>
+        <w:jc w:val="both"/>
+      </w:pPr>
+      <w:r>
+        <w:rPr>
+          <w:rFonts w:ascii="Times New Roman" w:hAnsi="Times New Roman" w:eastAsia="Times New Roman"/>
+          <w:b w:val="0"/>
+          <w:sz w:val="28"/>
+        </w:rPr>
+        <w:t>AutoCheck vuot troi 7/7 tieu chi (~100% khac biet), vuot xa nguong 30% yeu cau.</w:t>
+      </w:r>
+    </w:p>
+    <w:p>
+      <w:pPr>
+        <w:jc w:val="left"/>
+      </w:pPr>
+      <w:r>
+        <w:rPr>
+          <w:rFonts w:ascii="Times New Roman" w:hAnsi="Times New Roman" w:eastAsia="Times New Roman"/>
+          <w:b/>
+          <w:color w:val="0066CC"/>
+          <w:sz w:val="32"/>
+        </w:rPr>
+        <w:t>5.2 Bon diem doi moi cot loi</w:t>
+      </w:r>
+    </w:p>
+    <w:p>
+      <w:pPr>
+        <w:jc w:val="left"/>
+      </w:pPr>
+      <w:r>
+        <w:rPr>
+          <w:rFonts w:ascii="Times New Roman" w:hAnsi="Times New Roman" w:eastAsia="Times New Roman"/>
+          <w:b/>
+          <w:color w:val="0066CC"/>
+          <w:sz w:val="28"/>
+        </w:rPr>
+        <w:t>5.2.1 AI OCR hieu ngu canh giay to</w:t>
+      </w:r>
+    </w:p>
+    <w:p>
+      <w:pPr>
+        <w:spacing w:line="360" w:lineRule="auto"/>
+        <w:ind w:firstLine="720"/>
+        <w:jc w:val="both"/>
+      </w:pPr>
+      <w:r>
+        <w:rPr>
+          <w:rFonts w:ascii="Times New Roman" w:hAnsi="Times New Roman" w:eastAsia="Times New Roman"/>
+          <w:b w:val="0"/>
+          <w:sz w:val="28"/>
+        </w:rPr>
+        <w:t>SmartReader Doc AI hieu cau truc tung loai giay to, trich xuat co cau truc.</w:t>
+      </w:r>
+    </w:p>
+    <w:p>
+      <w:pPr>
+        <w:jc w:val="left"/>
+      </w:pPr>
+      <w:r>
+        <w:rPr>
+          <w:rFonts w:ascii="Times New Roman" w:hAnsi="Times New Roman" w:eastAsia="Times New Roman"/>
+          <w:b/>
+          <w:color w:val="0066CC"/>
+          <w:sz w:val="28"/>
+        </w:rPr>
+        <w:t>5.2.2 Tu dong phan loai &amp; dinh tuyen</w:t>
+      </w:r>
+    </w:p>
+    <w:p>
+      <w:pPr>
+        <w:spacing w:line="360" w:lineRule="auto"/>
+        <w:ind w:firstLine="720"/>
+        <w:jc w:val="both"/>
+      </w:pPr>
+      <w:r>
+        <w:rPr>
+          <w:rFonts w:ascii="Times New Roman" w:hAnsi="Times New Roman" w:eastAsia="Times New Roman"/>
+          <w:b w:val="0"/>
+          <w:sz w:val="28"/>
+        </w:rPr>
+        <w:t>SmartVision phan loai giay to ngay sau scan, dinh tuyen quy trinh rieng.</w:t>
+      </w:r>
+    </w:p>
+    <w:p>
+      <w:pPr>
+        <w:jc w:val="left"/>
+      </w:pPr>
+      <w:r>
+        <w:rPr>
+          <w:rFonts w:ascii="Times New Roman" w:hAnsi="Times New Roman" w:eastAsia="Times New Roman"/>
+          <w:b/>
+          <w:color w:val="0066CC"/>
+          <w:sz w:val="28"/>
+        </w:rPr>
+        <w:t>5.2.3 Doi chieu thong minh &amp; phat hien sai lech</w:t>
+      </w:r>
+    </w:p>
+    <w:p>
+      <w:pPr>
+        <w:spacing w:line="360" w:lineRule="auto"/>
+        <w:ind w:firstLine="720"/>
+        <w:jc w:val="both"/>
+      </w:pPr>
+      <w:r>
+        <w:rPr>
+          <w:rFonts w:ascii="Times New Roman" w:hAnsi="Times New Roman" w:eastAsia="Times New Roman"/>
+          <w:b w:val="0"/>
+          <w:sz w:val="28"/>
+        </w:rPr>
+        <w:t>Doi chieu tu dong voi CSDL, canh bao tung truong sai lech.</w:t>
+      </w:r>
+    </w:p>
+    <w:p>
+      <w:pPr>
+        <w:jc w:val="left"/>
+      </w:pPr>
+      <w:r>
+        <w:rPr>
+          <w:rFonts w:ascii="Times New Roman" w:hAnsi="Times New Roman" w:eastAsia="Times New Roman"/>
+          <w:b/>
+          <w:color w:val="0066CC"/>
+          <w:sz w:val="28"/>
+        </w:rPr>
+        <w:t>5.2.4 Pipeline xu ly hang loat</w:t>
+      </w:r>
+    </w:p>
+    <w:p>
+      <w:pPr>
+        <w:spacing w:line="360" w:lineRule="auto"/>
+        <w:ind w:firstLine="720"/>
+        <w:jc w:val="both"/>
+      </w:pPr>
+      <w:r>
+        <w:rPr>
+          <w:rFonts w:ascii="Times New Roman" w:hAnsi="Times New Roman" w:eastAsia="Times New Roman"/>
+          <w:b w:val="0"/>
+          <w:sz w:val="28"/>
+        </w:rPr>
+        <w:t>Kien truc queue-based, xu ly den 10.000 ho so/ngay.</w:t>
+      </w:r>
+    </w:p>
+    <w:p>
+      <w:r>
+        <w:br w:type="page"/>
+      </w:r>
+    </w:p>
+    <w:p>
+      <w:pPr>
+        <w:jc w:val="left"/>
+        <w:pBdr>
+          <w:bottom w:val="single" w:sz="8" w:space="1" w:color="0066CC"/>
+        </w:pBdr>
+      </w:pPr>
+      <w:r>
+        <w:rPr>
+          <w:rFonts w:ascii="Times New Roman" w:hAnsi="Times New Roman" w:eastAsia="Times New Roman"/>
+          <w:b/>
+          <w:color w:val="0066CC"/>
+          <w:sz w:val="36"/>
+        </w:rPr>
+        <w:t>6. TAC DONG DU KIEN</w:t>
+      </w:r>
+    </w:p>
+    <w:p>
+      <w:pPr>
+        <w:jc w:val="left"/>
+      </w:pPr>
+      <w:r>
+        <w:rPr>
+          <w:rFonts w:ascii="Times New Roman" w:hAnsi="Times New Roman" w:eastAsia="Times New Roman"/>
+          <w:b/>
+          <w:color w:val="0066CC"/>
+          <w:sz w:val="32"/>
+        </w:rPr>
+        <w:t>6.1 Phan tich thi truong (TAM-SAM-SOM)</w:t>
+      </w:r>
+    </w:p>
+    <w:tbl>
+      <w:tblPr>
+        <w:tblStyle w:val="TableGrid"/>
+        <w:tblW w:type="auto" w:w="0"/>
+        <w:jc w:val="center"/>
+        <w:tblLook w:firstColumn="1" w:firstRow="1" w:lastColumn="0" w:lastRow="0" w:noHBand="0" w:noVBand="1" w:val="04A0"/>
+      </w:tblPr>
+      <w:tblGrid>
+        <w:gridCol w:w="2197"/>
+        <w:gridCol w:w="2197"/>
+        <w:gridCol w:w="2197"/>
+        <w:gridCol w:w="2197"/>
+      </w:tblGrid>
+      <w:tr>
+        <w:tc>
+          <w:tcPr>
+            <w:tcW w:type="dxa" w:w="2197"/>
+            <w:shd w:fill="0066CC" w:val="clear"/>
+          </w:tcPr>
+          <w:p>
+            <w:pPr>
+              <w:jc w:val="center"/>
+            </w:pPr>
+            <w:r/>
+            <w:r>
+              <w:rPr>
+                <w:rFonts w:ascii="Times New Roman" w:hAnsi="Times New Roman" w:eastAsia="Times New Roman"/>
+                <w:b/>
+                <w:color w:val="FFFFFF"/>
+                <w:sz w:val="22"/>
+              </w:rPr>
+              <w:t>Chi so</w:t>
+            </w:r>
+          </w:p>
+        </w:tc>
+        <w:tc>
+          <w:tcPr>
+            <w:tcW w:type="dxa" w:w="2197"/>
+            <w:shd w:fill="0066CC" w:val="clear"/>
+          </w:tcPr>
+          <w:p>
+            <w:pPr>
+              <w:jc w:val="center"/>
+            </w:pPr>
+            <w:r/>
+            <w:r>
+              <w:rPr>
+                <w:rFonts w:ascii="Times New Roman" w:hAnsi="Times New Roman" w:eastAsia="Times New Roman"/>
+                <w:b/>
+                <w:color w:val="FFFFFF"/>
+                <w:sz w:val="22"/>
+              </w:rPr>
+              <w:t>Gia tri</w:t>
+            </w:r>
+          </w:p>
+        </w:tc>
+        <w:tc>
+          <w:tcPr>
+            <w:tcW w:type="dxa" w:w="2197"/>
+            <w:shd w:fill="0066CC" w:val="clear"/>
+          </w:tcPr>
+          <w:p>
+            <w:pPr>
+              <w:jc w:val="center"/>
+            </w:pPr>
+            <w:r/>
+            <w:r>
+              <w:rPr>
+                <w:rFonts w:ascii="Times New Roman" w:hAnsi="Times New Roman" w:eastAsia="Times New Roman"/>
+                <w:b/>
+                <w:color w:val="FFFFFF"/>
+                <w:sz w:val="22"/>
+              </w:rPr>
+              <w:t>Cach tinh</w:t>
+            </w:r>
+          </w:p>
+        </w:tc>
+        <w:tc>
+          <w:tcPr>
+            <w:tcW w:type="dxa" w:w="2197"/>
+            <w:shd w:fill="0066CC" w:val="clear"/>
+          </w:tcPr>
+          <w:p>
+            <w:pPr>
+              <w:jc w:val="center"/>
+            </w:pPr>
+            <w:r/>
+            <w:r>
+              <w:rPr>
+                <w:rFonts w:ascii="Times New Roman" w:hAnsi="Times New Roman" w:eastAsia="Times New Roman"/>
+                <w:b/>
+                <w:color w:val="FFFFFF"/>
+                <w:sz w:val="22"/>
+              </w:rPr>
+              <w:t>Nguon</w:t>
+            </w:r>
+          </w:p>
+        </w:tc>
+      </w:tr>
+      <w:tr>
+        <w:tc>
+          <w:tcPr>
+            <w:tcW w:type="dxa" w:w="2197"/>
+          </w:tcPr>
+          <w:p>
+            <w:pPr>
+              <w:jc w:val="left"/>
+            </w:pPr>
+            <w:r/>
+            <w:r>
+              <w:rPr>
+                <w:rFonts w:ascii="Times New Roman" w:hAnsi="Times New Roman" w:eastAsia="Times New Roman"/>
+                <w:b w:val="0"/>
+                <w:sz w:val="20"/>
+              </w:rPr>
+              <w:t>TAM</w:t>
+            </w:r>
+          </w:p>
+        </w:tc>
+        <w:tc>
+          <w:tcPr>
+            <w:tcW w:type="dxa" w:w="2197"/>
+          </w:tcPr>
+          <w:p>
+            <w:pPr>
+              <w:jc w:val="left"/>
+            </w:pPr>
+            <w:r/>
+            <w:r>
+              <w:rPr>
+                <w:rFonts w:ascii="Times New Roman" w:hAnsi="Times New Roman" w:eastAsia="Times New Roman"/>
+                <w:b w:val="0"/>
+                <w:sz w:val="20"/>
+              </w:rPr>
+              <w:t>~5.000 ty VND</w:t>
+            </w:r>
+          </w:p>
+        </w:tc>
+        <w:tc>
+          <w:tcPr>
+            <w:tcW w:type="dxa" w:w="2197"/>
+          </w:tcPr>
+          <w:p>
+            <w:pPr>
+              <w:jc w:val="left"/>
+            </w:pPr>
+            <w:r/>
+            <w:r>
+              <w:rPr>
+                <w:rFonts w:ascii="Times New Roman" w:hAnsi="Times New Roman" w:eastAsia="Times New Roman"/>
+                <w:b w:val="0"/>
+                <w:sz w:val="20"/>
+              </w:rPr>
+              <w:t>So hoa tai lieu HC 63 tinh, ~80 ty/tinh/nam</w:t>
+            </w:r>
+          </w:p>
+        </w:tc>
+        <w:tc>
+          <w:tcPr>
+            <w:tcW w:type="dxa" w:w="2197"/>
+          </w:tcPr>
+          <w:p>
+            <w:pPr>
+              <w:jc w:val="left"/>
+            </w:pPr>
+            <w:r/>
+            <w:r>
+              <w:rPr>
+                <w:rFonts w:ascii="Times New Roman" w:hAnsi="Times New Roman" w:eastAsia="Times New Roman"/>
+                <w:b w:val="0"/>
+                <w:sz w:val="20"/>
+              </w:rPr>
+              <w:t>Bo TT&amp;TT 2025</w:t>
+            </w:r>
+          </w:p>
+        </w:tc>
+      </w:tr>
+      <w:tr>
+        <w:tc>
+          <w:tcPr>
+            <w:tcW w:type="dxa" w:w="2197"/>
+            <w:shd w:fill="E8F0FE" w:val="clear"/>
+          </w:tcPr>
+          <w:p>
+            <w:pPr>
+              <w:jc w:val="left"/>
+            </w:pPr>
+            <w:r/>
+            <w:r>
+              <w:rPr>
+                <w:rFonts w:ascii="Times New Roman" w:hAnsi="Times New Roman" w:eastAsia="Times New Roman"/>
+                <w:b w:val="0"/>
+                <w:sz w:val="20"/>
+              </w:rPr>
+              <w:t>SAM</w:t>
+            </w:r>
+          </w:p>
+        </w:tc>
+        <w:tc>
+          <w:tcPr>
+            <w:tcW w:type="dxa" w:w="2197"/>
+            <w:shd w:fill="E8F0FE" w:val="clear"/>
+          </w:tcPr>
+          <w:p>
+            <w:pPr>
+              <w:jc w:val="left"/>
+            </w:pPr>
+            <w:r/>
+            <w:r>
+              <w:rPr>
+                <w:rFonts w:ascii="Times New Roman" w:hAnsi="Times New Roman" w:eastAsia="Times New Roman"/>
+                <w:b w:val="0"/>
+                <w:sz w:val="20"/>
+              </w:rPr>
+              <w:t>~300 ty VND</w:t>
+            </w:r>
+          </w:p>
+        </w:tc>
+        <w:tc>
+          <w:tcPr>
+            <w:tcW w:type="dxa" w:w="2197"/>
+            <w:shd w:fill="E8F0FE" w:val="clear"/>
+          </w:tcPr>
+          <w:p>
+            <w:pPr>
+              <w:jc w:val="left"/>
+            </w:pPr>
+            <w:r/>
+            <w:r>
+              <w:rPr>
+                <w:rFonts w:ascii="Times New Roman" w:hAnsi="Times New Roman" w:eastAsia="Times New Roman"/>
+                <w:b w:val="0"/>
+                <w:sz w:val="20"/>
+              </w:rPr>
+              <w:t>OCR+AI cho ho so luu tru cap phuong (6% TAM)</w:t>
+            </w:r>
+          </w:p>
+        </w:tc>
+        <w:tc>
+          <w:tcPr>
+            <w:tcW w:type="dxa" w:w="2197"/>
+            <w:shd w:fill="E8F0FE" w:val="clear"/>
+          </w:tcPr>
+          <w:p>
+            <w:pPr>
+              <w:jc w:val="left"/>
+            </w:pPr>
+            <w:r/>
+            <w:r>
+              <w:rPr>
+                <w:rFonts w:ascii="Times New Roman" w:hAnsi="Times New Roman" w:eastAsia="Times New Roman"/>
+                <w:b w:val="0"/>
+                <w:sz w:val="20"/>
+              </w:rPr>
+              <w:t>Phan tich noi bo</w:t>
+            </w:r>
+          </w:p>
+        </w:tc>
+      </w:tr>
+      <w:tr>
+        <w:tc>
+          <w:tcPr>
+            <w:tcW w:type="dxa" w:w="2197"/>
+          </w:tcPr>
+          <w:p>
+            <w:pPr>
+              <w:jc w:val="left"/>
+            </w:pPr>
+            <w:r/>
+            <w:r>
+              <w:rPr>
+                <w:rFonts w:ascii="Times New Roman" w:hAnsi="Times New Roman" w:eastAsia="Times New Roman"/>
+                <w:b w:val="0"/>
+                <w:sz w:val="20"/>
+              </w:rPr>
+              <w:t>SOM</w:t>
+            </w:r>
+          </w:p>
+        </w:tc>
+        <w:tc>
+          <w:tcPr>
+            <w:tcW w:type="dxa" w:w="2197"/>
+          </w:tcPr>
+          <w:p>
+            <w:pPr>
+              <w:jc w:val="left"/>
+            </w:pPr>
+            <w:r/>
+            <w:r>
+              <w:rPr>
+                <w:rFonts w:ascii="Times New Roman" w:hAnsi="Times New Roman" w:eastAsia="Times New Roman"/>
+                <w:b w:val="0"/>
+                <w:sz w:val="20"/>
+              </w:rPr>
+              <w:t>~15 ty VND</w:t>
+            </w:r>
+          </w:p>
+        </w:tc>
+        <w:tc>
+          <w:tcPr>
+            <w:tcW w:type="dxa" w:w="2197"/>
+          </w:tcPr>
+          <w:p>
+            <w:pPr>
+              <w:jc w:val="left"/>
+            </w:pPr>
+            <w:r/>
+            <w:r>
+              <w:rPr>
+                <w:rFonts w:ascii="Times New Roman" w:hAnsi="Times New Roman" w:eastAsia="Times New Roman"/>
+                <w:b w:val="0"/>
+                <w:sz w:val="20"/>
+              </w:rPr>
+              <w:t>5% SAM trong 2 nam (~50-100 UBND)</w:t>
+            </w:r>
+          </w:p>
+        </w:tc>
+        <w:tc>
+          <w:tcPr>
+            <w:tcW w:type="dxa" w:w="2197"/>
+          </w:tcPr>
+          <w:p>
+            <w:pPr>
+              <w:jc w:val="left"/>
+            </w:pPr>
+            <w:r/>
+            <w:r>
+              <w:rPr>
+                <w:rFonts w:ascii="Times New Roman" w:hAnsi="Times New Roman" w:eastAsia="Times New Roman"/>
+                <w:b w:val="0"/>
+                <w:sz w:val="20"/>
+              </w:rPr>
+              <w:t>Du bao than trong</w:t>
+            </w:r>
+          </w:p>
+        </w:tc>
+      </w:tr>
+    </w:tbl>
+    <w:p>
+      <w:r>
+        <w:rPr>
+          <w:rFonts w:ascii="Times New Roman" w:hAnsi="Times New Roman" w:eastAsia="Times New Roman"/>
+          <w:b w:val="0"/>
+          <w:sz w:val="12"/>
+        </w:rPr>
+      </w:r>
+    </w:p>
+    <w:p>
+      <w:pPr>
+        <w:jc w:val="left"/>
+      </w:pPr>
+      <w:r>
+        <w:rPr>
+          <w:rFonts w:ascii="Times New Roman" w:hAnsi="Times New Roman" w:eastAsia="Times New Roman"/>
+          <w:b/>
+          <w:color w:val="0066CC"/>
+          <w:sz w:val="32"/>
+        </w:rPr>
+        <w:t>6.2 Loi ich xa hoi</w:t>
+      </w:r>
+    </w:p>
+    <w:tbl>
+      <w:tblPr>
+        <w:tblStyle w:val="TableGrid"/>
+        <w:tblW w:type="auto" w:w="0"/>
+        <w:jc w:val="center"/>
+        <w:tblLook w:firstColumn="1" w:firstRow="1" w:lastColumn="0" w:lastRow="0" w:noHBand="0" w:noVBand="1" w:val="04A0"/>
+      </w:tblPr>
+      <w:tblGrid>
+        <w:gridCol w:w="2929"/>
+        <w:gridCol w:w="2929"/>
+        <w:gridCol w:w="2929"/>
+      </w:tblGrid>
+      <w:tr>
+        <w:tc>
+          <w:tcPr>
+            <w:tcW w:type="dxa" w:w="2929"/>
+            <w:shd w:fill="0066CC" w:val="clear"/>
+          </w:tcPr>
+          <w:p>
+            <w:pPr>
+              <w:jc w:val="center"/>
+            </w:pPr>
+            <w:r/>
+            <w:r>
+              <w:rPr>
+                <w:rFonts w:ascii="Times New Roman" w:hAnsi="Times New Roman" w:eastAsia="Times New Roman"/>
+                <w:b/>
+                <w:color w:val="FFFFFF"/>
+                <w:sz w:val="22"/>
+              </w:rPr>
+              <w:t>Loi ich</w:t>
+            </w:r>
+          </w:p>
+        </w:tc>
+        <w:tc>
+          <w:tcPr>
+            <w:tcW w:type="dxa" w:w="2929"/>
+            <w:shd w:fill="0066CC" w:val="clear"/>
+          </w:tcPr>
+          <w:p>
+            <w:pPr>
+              <w:jc w:val="center"/>
+            </w:pPr>
+            <w:r/>
+            <w:r>
+              <w:rPr>
+                <w:rFonts w:ascii="Times New Roman" w:hAnsi="Times New Roman" w:eastAsia="Times New Roman"/>
+                <w:b/>
+                <w:color w:val="FFFFFF"/>
+                <w:sz w:val="22"/>
+              </w:rPr>
+              <w:t>Chi so</w:t>
+            </w:r>
+          </w:p>
+        </w:tc>
+        <w:tc>
+          <w:tcPr>
+            <w:tcW w:type="dxa" w:w="2929"/>
+            <w:shd w:fill="0066CC" w:val="clear"/>
+          </w:tcPr>
+          <w:p>
+            <w:pPr>
+              <w:jc w:val="center"/>
+            </w:pPr>
+            <w:r/>
+            <w:r>
+              <w:rPr>
+                <w:rFonts w:ascii="Times New Roman" w:hAnsi="Times New Roman" w:eastAsia="Times New Roman"/>
+                <w:b/>
+                <w:color w:val="FFFFFF"/>
+                <w:sz w:val="22"/>
+              </w:rPr>
+              <w:t>Giai thich</w:t>
+            </w:r>
+          </w:p>
+        </w:tc>
+      </w:tr>
+      <w:tr>
+        <w:tc>
+          <w:tcPr>
+            <w:tcW w:type="dxa" w:w="2929"/>
+          </w:tcPr>
+          <w:p>
+            <w:pPr>
+              <w:jc w:val="left"/>
+            </w:pPr>
+            <w:r/>
+            <w:r>
+              <w:rPr>
+                <w:rFonts w:ascii="Times New Roman" w:hAnsi="Times New Roman" w:eastAsia="Times New Roman"/>
+                <w:b w:val="0"/>
+                <w:sz w:val="20"/>
+              </w:rPr>
+              <w:t>Tang toc xu ly ho so</w:t>
+            </w:r>
+          </w:p>
+        </w:tc>
+        <w:tc>
+          <w:tcPr>
+            <w:tcW w:type="dxa" w:w="2929"/>
+          </w:tcPr>
+          <w:p>
+            <w:pPr>
+              <w:jc w:val="left"/>
+            </w:pPr>
+            <w:r/>
+            <w:r>
+              <w:rPr>
+                <w:rFonts w:ascii="Times New Roman" w:hAnsi="Times New Roman" w:eastAsia="Times New Roman"/>
+                <w:b w:val="0"/>
+                <w:sz w:val="20"/>
+              </w:rPr>
+              <w:t>Nhanh 10-15x</w:t>
+            </w:r>
+          </w:p>
+        </w:tc>
+        <w:tc>
+          <w:tcPr>
+            <w:tcW w:type="dxa" w:w="2929"/>
+          </w:tcPr>
+          <w:p>
+            <w:pPr>
+              <w:jc w:val="left"/>
+            </w:pPr>
+            <w:r/>
+            <w:r>
+              <w:rPr>
+                <w:rFonts w:ascii="Times New Roman" w:hAnsi="Times New Roman" w:eastAsia="Times New Roman"/>
+                <w:b w:val="0"/>
+                <w:sz w:val="20"/>
+              </w:rPr>
+              <w:t>30-60 phut -&gt; 2-5 phut/ho so</w:t>
+            </w:r>
+          </w:p>
+        </w:tc>
+      </w:tr>
+      <w:tr>
+        <w:tc>
+          <w:tcPr>
+            <w:tcW w:type="dxa" w:w="2929"/>
+            <w:shd w:fill="E8F0FE" w:val="clear"/>
+          </w:tcPr>
+          <w:p>
+            <w:pPr>
+              <w:jc w:val="left"/>
+            </w:pPr>
+            <w:r/>
+            <w:r>
+              <w:rPr>
+                <w:rFonts w:ascii="Times New Roman" w:hAnsi="Times New Roman" w:eastAsia="Times New Roman"/>
+                <w:b w:val="0"/>
+                <w:sz w:val="20"/>
+              </w:rPr>
+              <w:t>Tiet kiem nhan cong</w:t>
+            </w:r>
+          </w:p>
+        </w:tc>
+        <w:tc>
+          <w:tcPr>
+            <w:tcW w:type="dxa" w:w="2929"/>
+            <w:shd w:fill="E8F0FE" w:val="clear"/>
+          </w:tcPr>
+          <w:p>
+            <w:pPr>
+              <w:jc w:val="left"/>
+            </w:pPr>
+            <w:r/>
+            <w:r>
+              <w:rPr>
+                <w:rFonts w:ascii="Times New Roman" w:hAnsi="Times New Roman" w:eastAsia="Times New Roman"/>
+                <w:b w:val="0"/>
+                <w:sz w:val="20"/>
+              </w:rPr>
+              <w:t>Giam 60%</w:t>
+            </w:r>
+          </w:p>
+        </w:tc>
+        <w:tc>
+          <w:tcPr>
+            <w:tcW w:type="dxa" w:w="2929"/>
+            <w:shd w:fill="E8F0FE" w:val="clear"/>
+          </w:tcPr>
+          <w:p>
+            <w:pPr>
+              <w:jc w:val="left"/>
+            </w:pPr>
+            <w:r/>
+            <w:r>
+              <w:rPr>
+                <w:rFonts w:ascii="Times New Roman" w:hAnsi="Times New Roman" w:eastAsia="Times New Roman"/>
+                <w:b w:val="0"/>
+                <w:sz w:val="20"/>
+              </w:rPr>
+              <w:t>1 he thong = 3-5 nhan vien</w:t>
+            </w:r>
+          </w:p>
+        </w:tc>
+      </w:tr>
+      <w:tr>
+        <w:tc>
+          <w:tcPr>
+            <w:tcW w:type="dxa" w:w="2929"/>
+          </w:tcPr>
+          <w:p>
+            <w:pPr>
+              <w:jc w:val="left"/>
+            </w:pPr>
+            <w:r/>
+            <w:r>
+              <w:rPr>
+                <w:rFonts w:ascii="Times New Roman" w:hAnsi="Times New Roman" w:eastAsia="Times New Roman"/>
+                <w:b w:val="0"/>
+                <w:sz w:val="20"/>
+              </w:rPr>
+              <w:t>Giam sai sot</w:t>
+            </w:r>
+          </w:p>
+        </w:tc>
+        <w:tc>
+          <w:tcPr>
+            <w:tcW w:type="dxa" w:w="2929"/>
+          </w:tcPr>
+          <w:p>
+            <w:pPr>
+              <w:jc w:val="left"/>
+            </w:pPr>
+            <w:r/>
+            <w:r>
+              <w:rPr>
+                <w:rFonts w:ascii="Times New Roman" w:hAnsi="Times New Roman" w:eastAsia="Times New Roman"/>
+                <w:b w:val="0"/>
+                <w:sz w:val="20"/>
+              </w:rPr>
+              <w:t>Giam 90%</w:t>
+            </w:r>
+          </w:p>
+        </w:tc>
+        <w:tc>
+          <w:tcPr>
+            <w:tcW w:type="dxa" w:w="2929"/>
+          </w:tcPr>
+          <w:p>
+            <w:pPr>
+              <w:jc w:val="left"/>
+            </w:pPr>
+            <w:r/>
+            <w:r>
+              <w:rPr>
+                <w:rFonts w:ascii="Times New Roman" w:hAnsi="Times New Roman" w:eastAsia="Times New Roman"/>
+                <w:b w:val="0"/>
+                <w:sz w:val="20"/>
+              </w:rPr>
+              <w:t>AI tu dong kiem tra + canh bao</w:t>
+            </w:r>
+          </w:p>
+        </w:tc>
+      </w:tr>
+      <w:tr>
+        <w:tc>
+          <w:tcPr>
+            <w:tcW w:type="dxa" w:w="2929"/>
+            <w:shd w:fill="E8F0FE" w:val="clear"/>
+          </w:tcPr>
+          <w:p>
+            <w:pPr>
+              <w:jc w:val="left"/>
+            </w:pPr>
+            <w:r/>
+            <w:r>
+              <w:rPr>
+                <w:rFonts w:ascii="Times New Roman" w:hAnsi="Times New Roman" w:eastAsia="Times New Roman"/>
+                <w:b w:val="0"/>
+                <w:sz w:val="20"/>
+              </w:rPr>
+              <w:t>Tiet kiem khong gian</w:t>
+            </w:r>
+          </w:p>
+        </w:tc>
+        <w:tc>
+          <w:tcPr>
+            <w:tcW w:type="dxa" w:w="2929"/>
+            <w:shd w:fill="E8F0FE" w:val="clear"/>
+          </w:tcPr>
+          <w:p>
+            <w:pPr>
+              <w:jc w:val="left"/>
+            </w:pPr>
+            <w:r/>
+            <w:r>
+              <w:rPr>
+                <w:rFonts w:ascii="Times New Roman" w:hAnsi="Times New Roman" w:eastAsia="Times New Roman"/>
+                <w:b w:val="0"/>
+                <w:sz w:val="20"/>
+              </w:rPr>
+              <w:t>Giam 95%</w:t>
+            </w:r>
+          </w:p>
+        </w:tc>
+        <w:tc>
+          <w:tcPr>
+            <w:tcW w:type="dxa" w:w="2929"/>
+            <w:shd w:fill="E8F0FE" w:val="clear"/>
+          </w:tcPr>
+          <w:p>
+            <w:pPr>
+              <w:jc w:val="left"/>
+            </w:pPr>
+            <w:r/>
+            <w:r>
+              <w:rPr>
+                <w:rFonts w:ascii="Times New Roman" w:hAnsi="Times New Roman" w:eastAsia="Times New Roman"/>
+                <w:b w:val="0"/>
+                <w:sz w:val="20"/>
+              </w:rPr>
+              <w:t>Kho giay -&gt; o cung 1TB ~500.000 ho so</w:t>
+            </w:r>
+          </w:p>
+        </w:tc>
+      </w:tr>
+      <w:tr>
+        <w:tc>
+          <w:tcPr>
+            <w:tcW w:type="dxa" w:w="2929"/>
+          </w:tcPr>
+          <w:p>
+            <w:pPr>
+              <w:jc w:val="left"/>
+            </w:pPr>
+            <w:r/>
+            <w:r>
+              <w:rPr>
+                <w:rFonts w:ascii="Times New Roman" w:hAnsi="Times New Roman" w:eastAsia="Times New Roman"/>
+                <w:b w:val="0"/>
+                <w:sz w:val="20"/>
+              </w:rPr>
+              <w:t>Tra cuu tuc thi</w:t>
+            </w:r>
+          </w:p>
+        </w:tc>
+        <w:tc>
+          <w:tcPr>
+            <w:tcW w:type="dxa" w:w="2929"/>
+          </w:tcPr>
+          <w:p>
+            <w:pPr>
+              <w:jc w:val="left"/>
+            </w:pPr>
+            <w:r/>
+            <w:r>
+              <w:rPr>
+                <w:rFonts w:ascii="Times New Roman" w:hAnsi="Times New Roman" w:eastAsia="Times New Roman"/>
+                <w:b w:val="0"/>
+                <w:sz w:val="20"/>
+              </w:rPr>
+              <w:t>&lt; 5 giay</w:t>
+            </w:r>
+          </w:p>
+        </w:tc>
+        <w:tc>
+          <w:tcPr>
+            <w:tcW w:type="dxa" w:w="2929"/>
+          </w:tcPr>
+          <w:p>
+            <w:pPr>
+              <w:jc w:val="left"/>
+            </w:pPr>
+            <w:r/>
+            <w:r>
+              <w:rPr>
+                <w:rFonts w:ascii="Times New Roman" w:hAnsi="Times New Roman" w:eastAsia="Times New Roman"/>
+                <w:b w:val="0"/>
+                <w:sz w:val="20"/>
+              </w:rPr>
+              <w:t>Full-text search tu CSDL so hoa</w:t>
+            </w:r>
+          </w:p>
+        </w:tc>
+      </w:tr>
+      <w:tr>
+        <w:tc>
+          <w:tcPr>
+            <w:tcW w:type="dxa" w:w="2929"/>
+            <w:shd w:fill="E8F0FE" w:val="clear"/>
+          </w:tcPr>
+          <w:p>
+            <w:pPr>
+              <w:jc w:val="left"/>
+            </w:pPr>
+            <w:r/>
+            <w:r>
+              <w:rPr>
+                <w:rFonts w:ascii="Times New Roman" w:hAnsi="Times New Roman" w:eastAsia="Times New Roman"/>
+                <w:b w:val="0"/>
+                <w:sz w:val="20"/>
+              </w:rPr>
+              <w:t>Bao ton du lieu</w:t>
+            </w:r>
+          </w:p>
+        </w:tc>
+        <w:tc>
+          <w:tcPr>
+            <w:tcW w:type="dxa" w:w="2929"/>
+            <w:shd w:fill="E8F0FE" w:val="clear"/>
+          </w:tcPr>
+          <w:p>
+            <w:pPr>
+              <w:jc w:val="left"/>
+            </w:pPr>
+            <w:r/>
+            <w:r>
+              <w:rPr>
+                <w:rFonts w:ascii="Times New Roman" w:hAnsi="Times New Roman" w:eastAsia="Times New Roman"/>
+                <w:b w:val="0"/>
+                <w:sz w:val="20"/>
+              </w:rPr>
+              <w:t>Vinh vien</w:t>
+            </w:r>
+          </w:p>
+        </w:tc>
+        <w:tc>
+          <w:tcPr>
+            <w:tcW w:type="dxa" w:w="2929"/>
+            <w:shd w:fill="E8F0FE" w:val="clear"/>
+          </w:tcPr>
+          <w:p>
+            <w:pPr>
+              <w:jc w:val="left"/>
+            </w:pPr>
+            <w:r/>
+            <w:r>
+              <w:rPr>
+                <w:rFonts w:ascii="Times New Roman" w:hAnsi="Times New Roman" w:eastAsia="Times New Roman"/>
+                <w:b w:val="0"/>
+                <w:sz w:val="20"/>
+              </w:rPr>
+              <w:t>Backup tu dong, khong lo hu hong</w:t>
+            </w:r>
+          </w:p>
+        </w:tc>
+      </w:tr>
+    </w:tbl>
+    <w:p>
+      <w:r>
+        <w:rPr>
+          <w:rFonts w:ascii="Times New Roman" w:hAnsi="Times New Roman" w:eastAsia="Times New Roman"/>
+          <w:b w:val="0"/>
+          <w:sz w:val="12"/>
+        </w:rPr>
+      </w:r>
+    </w:p>
+    <w:p>
+      <w:pPr>
+        <w:jc w:val="left"/>
+      </w:pPr>
+      <w:r>
+        <w:rPr>
+          <w:rFonts w:ascii="Times New Roman" w:hAnsi="Times New Roman" w:eastAsia="Times New Roman"/>
+          <w:b/>
+          <w:color w:val="0066CC"/>
+          <w:sz w:val="32"/>
+        </w:rPr>
+        <w:t>6.3 Mo hinh doanh thu (B2G)</w:t>
+      </w:r>
+    </w:p>
+    <w:tbl>
+      <w:tblPr>
+        <w:tblStyle w:val="TableGrid"/>
+        <w:tblW w:type="auto" w:w="0"/>
+        <w:jc w:val="center"/>
+        <w:tblLook w:firstColumn="1" w:firstRow="1" w:lastColumn="0" w:lastRow="0" w:noHBand="0" w:noVBand="1" w:val="04A0"/>
+      </w:tblPr>
+      <w:tblGrid>
+        <w:gridCol w:w="2929"/>
+        <w:gridCol w:w="2929"/>
+        <w:gridCol w:w="2929"/>
+      </w:tblGrid>
+      <w:tr>
+        <w:tc>
+          <w:tcPr>
+            <w:tcW w:type="dxa" w:w="2929"/>
+            <w:shd w:fill="0066CC" w:val="clear"/>
+          </w:tcPr>
+          <w:p>
+            <w:pPr>
+              <w:jc w:val="center"/>
+            </w:pPr>
+            <w:r/>
+            <w:r>
+              <w:rPr>
+                <w:rFonts w:ascii="Times New Roman" w:hAnsi="Times New Roman" w:eastAsia="Times New Roman"/>
+                <w:b/>
+                <w:color w:val="FFFFFF"/>
+                <w:sz w:val="22"/>
+              </w:rPr>
+              <w:t>Goi</w:t>
+            </w:r>
+          </w:p>
+        </w:tc>
+        <w:tc>
+          <w:tcPr>
+            <w:tcW w:type="dxa" w:w="2929"/>
+            <w:shd w:fill="0066CC" w:val="clear"/>
+          </w:tcPr>
+          <w:p>
+            <w:pPr>
+              <w:jc w:val="center"/>
+            </w:pPr>
+            <w:r/>
+            <w:r>
+              <w:rPr>
+                <w:rFonts w:ascii="Times New Roman" w:hAnsi="Times New Roman" w:eastAsia="Times New Roman"/>
+                <w:b/>
+                <w:color w:val="FFFFFF"/>
+                <w:sz w:val="22"/>
+              </w:rPr>
+              <w:t>Gia</w:t>
+            </w:r>
+          </w:p>
+        </w:tc>
+        <w:tc>
+          <w:tcPr>
+            <w:tcW w:type="dxa" w:w="2929"/>
+            <w:shd w:fill="0066CC" w:val="clear"/>
+          </w:tcPr>
+          <w:p>
+            <w:pPr>
+              <w:jc w:val="center"/>
+            </w:pPr>
+            <w:r/>
+            <w:r>
+              <w:rPr>
+                <w:rFonts w:ascii="Times New Roman" w:hAnsi="Times New Roman" w:eastAsia="Times New Roman"/>
+                <w:b/>
+                <w:color w:val="FFFFFF"/>
+                <w:sz w:val="22"/>
+              </w:rPr>
+              <w:t>Dich vu</w:t>
+            </w:r>
+          </w:p>
+        </w:tc>
+      </w:tr>
+      <w:tr>
+        <w:tc>
+          <w:tcPr>
+            <w:tcW w:type="dxa" w:w="2929"/>
+          </w:tcPr>
+          <w:p>
+            <w:pPr>
+              <w:jc w:val="left"/>
+            </w:pPr>
+            <w:r/>
+            <w:r>
+              <w:rPr>
+                <w:rFonts w:ascii="Times New Roman" w:hAnsi="Times New Roman" w:eastAsia="Times New Roman"/>
+                <w:b w:val="0"/>
+                <w:sz w:val="20"/>
+              </w:rPr>
+              <w:t>Basic</w:t>
+            </w:r>
+          </w:p>
+        </w:tc>
+        <w:tc>
+          <w:tcPr>
+            <w:tcW w:type="dxa" w:w="2929"/>
+          </w:tcPr>
+          <w:p>
+            <w:pPr>
+              <w:jc w:val="left"/>
+            </w:pPr>
+            <w:r/>
+            <w:r>
+              <w:rPr>
+                <w:rFonts w:ascii="Times New Roman" w:hAnsi="Times New Roman" w:eastAsia="Times New Roman"/>
+                <w:b w:val="0"/>
+                <w:sz w:val="20"/>
+              </w:rPr>
+              <w:t>8.000.000/thang</w:t>
+            </w:r>
+          </w:p>
+        </w:tc>
+        <w:tc>
+          <w:tcPr>
+            <w:tcW w:type="dxa" w:w="2929"/>
+          </w:tcPr>
+          <w:p>
+            <w:pPr>
+              <w:jc w:val="left"/>
+            </w:pPr>
+            <w:r/>
+            <w:r>
+              <w:rPr>
+                <w:rFonts w:ascii="Times New Roman" w:hAnsi="Times New Roman" w:eastAsia="Times New Roman"/>
+                <w:b w:val="0"/>
+                <w:sz w:val="20"/>
+              </w:rPr>
+              <w:t>1 may scan, 1.000 ho so/thang, ho tro 8h</w:t>
+            </w:r>
+          </w:p>
+        </w:tc>
+      </w:tr>
+      <w:tr>
+        <w:tc>
+          <w:tcPr>
+            <w:tcW w:type="dxa" w:w="2929"/>
+            <w:shd w:fill="E8F0FE" w:val="clear"/>
+          </w:tcPr>
+          <w:p>
+            <w:pPr>
+              <w:jc w:val="left"/>
+            </w:pPr>
+            <w:r/>
+            <w:r>
+              <w:rPr>
+                <w:rFonts w:ascii="Times New Roman" w:hAnsi="Times New Roman" w:eastAsia="Times New Roman"/>
+                <w:b w:val="0"/>
+                <w:sz w:val="20"/>
+              </w:rPr>
+              <w:t>Pro</w:t>
+            </w:r>
+          </w:p>
+        </w:tc>
+        <w:tc>
+          <w:tcPr>
+            <w:tcW w:type="dxa" w:w="2929"/>
+            <w:shd w:fill="E8F0FE" w:val="clear"/>
+          </w:tcPr>
+          <w:p>
+            <w:pPr>
+              <w:jc w:val="left"/>
+            </w:pPr>
+            <w:r/>
+            <w:r>
+              <w:rPr>
+                <w:rFonts w:ascii="Times New Roman" w:hAnsi="Times New Roman" w:eastAsia="Times New Roman"/>
+                <w:b w:val="0"/>
+                <w:sz w:val="20"/>
+              </w:rPr>
+              <w:t>20.000.000/thang</w:t>
+            </w:r>
+          </w:p>
+        </w:tc>
+        <w:tc>
+          <w:tcPr>
+            <w:tcW w:type="dxa" w:w="2929"/>
+            <w:shd w:fill="E8F0FE" w:val="clear"/>
+          </w:tcPr>
+          <w:p>
+            <w:pPr>
+              <w:jc w:val="left"/>
+            </w:pPr>
+            <w:r/>
+            <w:r>
+              <w:rPr>
+                <w:rFonts w:ascii="Times New Roman" w:hAnsi="Times New Roman" w:eastAsia="Times New Roman"/>
+                <w:b w:val="0"/>
+                <w:sz w:val="20"/>
+              </w:rPr>
+              <w:t>Da may scan, 5.000 ho so/thang, 24/7</w:t>
+            </w:r>
+          </w:p>
+        </w:tc>
+      </w:tr>
+      <w:tr>
+        <w:tc>
+          <w:tcPr>
+            <w:tcW w:type="dxa" w:w="2929"/>
+          </w:tcPr>
+          <w:p>
+            <w:pPr>
+              <w:jc w:val="left"/>
+            </w:pPr>
+            <w:r/>
+            <w:r>
+              <w:rPr>
+                <w:rFonts w:ascii="Times New Roman" w:hAnsi="Times New Roman" w:eastAsia="Times New Roman"/>
+                <w:b w:val="0"/>
+                <w:sz w:val="20"/>
+              </w:rPr>
+              <w:t>Enterprise</w:t>
+            </w:r>
+          </w:p>
+        </w:tc>
+        <w:tc>
+          <w:tcPr>
+            <w:tcW w:type="dxa" w:w="2929"/>
+          </w:tcPr>
+          <w:p>
+            <w:pPr>
+              <w:jc w:val="left"/>
+            </w:pPr>
+            <w:r/>
+            <w:r>
+              <w:rPr>
+                <w:rFonts w:ascii="Times New Roman" w:hAnsi="Times New Roman" w:eastAsia="Times New Roman"/>
+                <w:b w:val="0"/>
+                <w:sz w:val="20"/>
+              </w:rPr>
+              <w:t>Theo yeu cau</w:t>
+            </w:r>
+          </w:p>
+        </w:tc>
+        <w:tc>
+          <w:tcPr>
+            <w:tcW w:type="dxa" w:w="2929"/>
+          </w:tcPr>
+          <w:p>
+            <w:pPr>
+              <w:jc w:val="left"/>
+            </w:pPr>
+            <w:r/>
+            <w:r>
+              <w:rPr>
+                <w:rFonts w:ascii="Times New Roman" w:hAnsi="Times New Roman" w:eastAsia="Times New Roman"/>
+                <w:b w:val="0"/>
+                <w:sz w:val="20"/>
+              </w:rPr>
+              <w:t>Khong gioi han, tich hop CSDL rieng, SLA</w:t>
+            </w:r>
+          </w:p>
+        </w:tc>
+      </w:tr>
+    </w:tbl>
+    <w:p>
+      <w:pPr>
+        <w:spacing w:line="360" w:lineRule="auto"/>
+        <w:ind w:firstLine="720"/>
+        <w:jc w:val="both"/>
+      </w:pPr>
+      <w:r>
+        <w:rPr>
+          <w:rFonts w:ascii="Times New Roman" w:hAnsi="Times New Roman" w:eastAsia="Times New Roman"/>
+          <w:b w:val="0"/>
+          <w:sz w:val="28"/>
+        </w:rPr>
+        <w:t>Phi trien khai: 40-60 trieu. Hoa von 12 thang voi 15 KH Basic (~120 trieu/thang). ROI 3 nam: ~250%.</w:t>
+      </w:r>
+    </w:p>
+    <w:p>
+      <w:pPr>
+        <w:jc w:val="left"/>
+      </w:pPr>
+      <w:r>
+        <w:rPr>
+          <w:rFonts w:ascii="Times New Roman" w:hAnsi="Times New Roman" w:eastAsia="Times New Roman"/>
+          <w:b/>
+          <w:color w:val="0066CC"/>
+          <w:sz w:val="32"/>
+        </w:rPr>
+        <w:t>6.4 Phan tich canh tranh</w:t>
+      </w:r>
+    </w:p>
+    <w:p>
+      <w:pPr>
+        <w:spacing w:line="360" w:lineRule="auto"/>
+        <w:ind w:firstLine="720"/>
+        <w:jc w:val="both"/>
+      </w:pPr>
+      <w:r>
+        <w:rPr>
+          <w:rFonts w:ascii="Times New Roman" w:hAnsi="Times New Roman" w:eastAsia="Times New Roman"/>
+          <w:b w:val="0"/>
+          <w:sz w:val="28"/>
+        </w:rPr>
+        <w:t>Doi thu tren thi truong so hoa tai lieu:</w:t>
+      </w:r>
+    </w:p>
+    <w:p>
+      <w:pPr>
+        <w:spacing w:line="360" w:lineRule="auto"/>
+        <w:ind w:left="850"/>
+        <w:jc w:val="both"/>
+      </w:pPr>
+      <w:r>
+        <w:rPr>
+          <w:rFonts w:ascii="Times New Roman" w:hAnsi="Times New Roman" w:eastAsia="Times New Roman"/>
+          <w:b w:val="0"/>
+          <w:sz w:val="26"/>
+        </w:rPr>
+        <w:t xml:space="preserve">* </w:t>
+      </w:r>
+      <w:r>
+        <w:rPr>
+          <w:rFonts w:ascii="Times New Roman" w:hAnsi="Times New Roman" w:eastAsia="Times New Roman"/>
+          <w:b w:val="0"/>
+          <w:sz w:val="26"/>
+        </w:rPr>
+        <w:t>FPT.eDoc: OCR co ban, khong AI phan loai. Gia 15-30 trieu/thang.</w:t>
+      </w:r>
+    </w:p>
+    <w:p>
+      <w:pPr>
+        <w:spacing w:line="360" w:lineRule="auto"/>
+        <w:ind w:left="850"/>
+        <w:jc w:val="both"/>
+      </w:pPr>
+      <w:r>
+        <w:rPr>
+          <w:rFonts w:ascii="Times New Roman" w:hAnsi="Times New Roman" w:eastAsia="Times New Roman"/>
+          <w:b w:val="0"/>
+          <w:sz w:val="26"/>
+        </w:rPr>
+        <w:t xml:space="preserve">* </w:t>
+      </w:r>
+      <w:r>
+        <w:rPr>
+          <w:rFonts w:ascii="Times New Roman" w:hAnsi="Times New Roman" w:eastAsia="Times New Roman"/>
+          <w:b w:val="0"/>
+          <w:sz w:val="26"/>
+        </w:rPr>
+        <w:t>VNPT eDoc: OCR co ban, chua tich hop SmartReader Doc AI.</w:t>
+      </w:r>
+    </w:p>
+    <w:p>
+      <w:pPr>
+        <w:spacing w:line="360" w:lineRule="auto"/>
+        <w:ind w:left="850"/>
+        <w:jc w:val="both"/>
+      </w:pPr>
+      <w:r>
+        <w:rPr>
+          <w:rFonts w:ascii="Times New Roman" w:hAnsi="Times New Roman" w:eastAsia="Times New Roman"/>
+          <w:b w:val="0"/>
+          <w:sz w:val="26"/>
+        </w:rPr>
+        <w:t xml:space="preserve">* </w:t>
+      </w:r>
+      <w:r>
+        <w:rPr>
+          <w:rFonts w:ascii="Times New Roman" w:hAnsi="Times New Roman" w:eastAsia="Times New Roman"/>
+          <w:b w:val="0"/>
+          <w:sz w:val="26"/>
+        </w:rPr>
+        <w:t>Google Doc AI: OCR manh nhung chua toi uu tieng Viet, khong dat chuan VN.</w:t>
+      </w:r>
+    </w:p>
+    <w:p>
+      <w:pPr>
+        <w:spacing w:line="360" w:lineRule="auto"/>
+        <w:ind w:left="850"/>
+        <w:jc w:val="both"/>
+      </w:pPr>
+      <w:r>
+        <w:rPr>
+          <w:rFonts w:ascii="Times New Roman" w:hAnsi="Times New Roman" w:eastAsia="Times New Roman"/>
+          <w:b w:val="0"/>
+          <w:sz w:val="26"/>
+        </w:rPr>
+        <w:t xml:space="preserve">* </w:t>
+      </w:r>
+      <w:r>
+        <w:rPr>
+          <w:rFonts w:ascii="Times New Roman" w:hAnsi="Times New Roman" w:eastAsia="Times New Roman"/>
+          <w:b w:val="0"/>
+          <w:sz w:val="26"/>
+        </w:rPr>
+        <w:t>Nhan cong thu cong: 10-15 trieu/thang/nguoi, cham, sai sot.</w:t>
+      </w:r>
+    </w:p>
     <w:sectPr>
       <w:pgSz w:w="11906" w:h="16838"/>
       <w:pgMar w:top="1417" w:right="1417" w:bottom="1417" w:left="1701" w:header="720" w:footer="720" w:gutter="0"/>

</xml_diff>

<commit_message>
task-8: finalize AutoCheck proposal, add conclusion and export PDF
</commit_message>
<xml_diff>
--- a/hackaithon-de-tai-6-autocheck/proposal.docx
+++ b/hackaithon-de-tai-6-autocheck/proposal.docx
@@ -5982,7 +5982,142 @@
         <w:t>Nhan cong thu cong: 10-15 trieu/thang/nguoi, cham, sai sot.</w:t>
       </w:r>
     </w:p>
+    <w:p>
+      <w:pPr>
+        <w:jc w:val="left"/>
+        <w:pBdr>
+          <w:bottom w:val="single" w:sz="8" w:space="1" w:color="0066CC"/>
+        </w:pBdr>
+      </w:pPr>
+      <w:r>
+        <w:rPr>
+          <w:rFonts w:ascii="Times New Roman" w:hAnsi="Times New Roman" w:eastAsia="Times New Roman"/>
+          <w:b/>
+          <w:color w:val="0066CC"/>
+          <w:sz w:val="36"/>
+        </w:rPr>
+        <w:t>7. KET LUAN</w:t>
+      </w:r>
+    </w:p>
+    <w:p>
+      <w:pPr>
+        <w:spacing w:line="360" w:lineRule="auto"/>
+        <w:ind w:firstLine="720"/>
+        <w:jc w:val="both"/>
+      </w:pPr>
+      <w:r>
+        <w:rPr>
+          <w:rFonts w:ascii="Times New Roman" w:hAnsi="Times New Roman" w:eastAsia="Times New Roman"/>
+          <w:b w:val="0"/>
+          <w:sz w:val="28"/>
+        </w:rPr>
+        <w:t>AutoCheck la he thong OCR thong minh dau tien tai Viet Nam ket hop 3 cong nghe AI cot loi cua VNPT - SmartReader, SmartVision va eKYC - trong mot pipeline xu ly ho so luu tru tu dong.</w:t>
+      </w:r>
+    </w:p>
+    <w:p>
+      <w:pPr>
+        <w:spacing w:line="360" w:lineRule="auto"/>
+        <w:ind w:left="567"/>
+        <w:jc w:val="both"/>
+      </w:pPr>
+      <w:r>
+        <w:rPr>
+          <w:rFonts w:ascii="Times New Roman" w:hAnsi="Times New Roman" w:eastAsia="Times New Roman"/>
+          <w:b/>
+          <w:sz w:val="28"/>
+        </w:rPr>
+        <w:t>1. Giai quyet 3 pain-point:</w:t>
+      </w:r>
+      <w:r>
+        <w:rPr>
+          <w:rFonts w:ascii="Times New Roman" w:hAnsi="Times New Roman" w:eastAsia="Times New Roman"/>
+          <w:b w:val="0"/>
+          <w:sz w:val="28"/>
+        </w:rPr>
+        <w:t xml:space="preserve"> So hoa ho so ton dong, tu dong boc tach &amp; doi chieu.</w:t>
+      </w:r>
+    </w:p>
+    <w:p>
+      <w:pPr>
+        <w:spacing w:line="360" w:lineRule="auto"/>
+        <w:ind w:left="567"/>
+        <w:jc w:val="both"/>
+      </w:pPr>
+      <w:r>
+        <w:rPr>
+          <w:rFonts w:ascii="Times New Roman" w:hAnsi="Times New Roman" w:eastAsia="Times New Roman"/>
+          <w:b/>
+          <w:sz w:val="28"/>
+        </w:rPr>
+        <w:t>2. Khac biet 100%:</w:t>
+      </w:r>
+      <w:r>
+        <w:rPr>
+          <w:rFonts w:ascii="Times New Roman" w:hAnsi="Times New Roman" w:eastAsia="Times New Roman"/>
+          <w:b w:val="0"/>
+          <w:sz w:val="28"/>
+        </w:rPr>
+        <w:t xml:space="preserve"> AI OCR hieu ngu canh, phan loai, doi chieu thong minh.</w:t>
+      </w:r>
+    </w:p>
+    <w:p>
+      <w:pPr>
+        <w:spacing w:line="360" w:lineRule="auto"/>
+        <w:ind w:left="567"/>
+        <w:jc w:val="both"/>
+      </w:pPr>
+      <w:r>
+        <w:rPr>
+          <w:rFonts w:ascii="Times New Roman" w:hAnsi="Times New Roman" w:eastAsia="Times New Roman"/>
+          <w:b/>
+          <w:sz w:val="28"/>
+        </w:rPr>
+        <w:t>3. Tinh kha thi cao:</w:t>
+      </w:r>
+      <w:r>
+        <w:rPr>
+          <w:rFonts w:ascii="Times New Roman" w:hAnsi="Times New Roman" w:eastAsia="Times New Roman"/>
+          <w:b w:val="0"/>
+          <w:sz w:val="28"/>
+        </w:rPr>
+        <w:t xml:space="preserve"> Chi phi tu 8 trieu/thang, MVP 7 ngay, TAM ~5.000 ty.</w:t>
+      </w:r>
+    </w:p>
+    <w:p>
+      <w:pPr>
+        <w:spacing w:line="360" w:lineRule="auto"/>
+        <w:ind w:firstLine="720"/>
+        <w:jc w:val="both"/>
+      </w:pPr>
+      <w:r>
+        <w:rPr>
+          <w:rFonts w:ascii="Times New Roman" w:hAnsi="Times New Roman" w:eastAsia="Times New Roman"/>
+          <w:b w:val="0"/>
+          <w:sz w:val="28"/>
+        </w:rPr>
+        <w:t>Chung toi keu goi su hop tac cua VNPT de dua AutoCheck den moi bo phan mot cua.</w:t>
+      </w:r>
+    </w:p>
+    <w:p>
+      <w:pPr>
+        <w:jc w:val="right"/>
+      </w:pPr>
+      <w:r>
+        <w:rPr>
+          <w:rFonts w:ascii="Times New Roman" w:hAnsi="Times New Roman" w:eastAsia="Times New Roman"/>
+          <w:b w:val="0"/>
+          <w:color w:val="0066CC"/>
+          <w:sz w:val="26"/>
+        </w:rPr>
+        <w:br/>
+        <w:t>AutoCheck</w:t>
+        <w:br/>
+        <w:t>"So hoa hom nay - Gia tri ngay mai."</w:t>
+      </w:r>
+    </w:p>
     <w:sectPr>
+      <w:headerReference w:type="default" r:id="rId14"/>
+      <w:footerReference w:type="default" r:id="rId15"/>
       <w:pgSz w:w="11906" w:h="16838"/>
       <w:pgMar w:top="1417" w:right="1417" w:bottom="1417" w:left="1701" w:header="720" w:footer="720" w:gutter="0"/>
       <w:cols w:space="720"/>
@@ -5990,6 +6125,73 @@
     </w:sectPr>
   </w:body>
 </w:document>
+</file>
+
+<file path=word/footer1.xml><?xml version="1.0" encoding="utf-8"?>
+<w:ftr xmlns:m="http://schemas.openxmlformats.org/officeDocument/2006/math" xmlns:mc="http://schemas.openxmlformats.org/markup-compatibility/2006" xmlns:mo="http://schemas.microsoft.com/office/mac/office/2008/main" xmlns:mv="urn:schemas-microsoft-com:mac:vml" xmlns:o="urn:schemas-microsoft-com:office:office" xmlns:r="http://schemas.openxmlformats.org/officeDocument/2006/relationships" xmlns:v="urn:schemas-microsoft-com:vml" xmlns:w10="urn:schemas-microsoft-com:office:word" xmlns:w14="http://schemas.microsoft.com/office/word/2010/wordml" xmlns:w="http://schemas.openxmlformats.org/wordprocessingml/2006/main" xmlns:wne="http://schemas.microsoft.com/office/word/2006/wordml" xmlns:wp14="http://schemas.microsoft.com/office/word/2010/wordprocessingDrawing" xmlns:wp="http://schemas.openxmlformats.org/drawingml/2006/wordprocessingDrawing" xmlns:wpc="http://schemas.microsoft.com/office/word/2010/wordprocessingCanvas" xmlns:wpg="http://schemas.microsoft.com/office/word/2010/wordprocessingGroup" xmlns:wpi="http://schemas.microsoft.com/office/word/2010/wordprocessingInk" xmlns:wps="http://schemas.microsoft.com/office/word/2010/wordprocessingShape" mc:Ignorable="w14 wp14">
+  <w:p>
+    <w:pPr>
+      <w:pStyle w:val="Footer"/>
+      <w:jc w:val="center"/>
+    </w:pPr>
+    <w:r>
+      <w:rPr>
+        <w:rFonts w:ascii="Times New Roman" w:hAnsi="Times New Roman" w:eastAsia="Times New Roman"/>
+        <w:b w:val="0"/>
+        <w:color w:val="666666"/>
+        <w:sz w:val="20"/>
+      </w:rPr>
+      <w:t xml:space="preserve">Trang </w:t>
+    </w:r>
+    <w:r>
+      <w:fldChar w:fldCharType="begin"/>
+    </w:r>
+    <w:r>
+      <w:instrText xml:space="preserve"> PAGE </w:instrText>
+    </w:r>
+    <w:r>
+      <w:fldChar w:fldCharType="end"/>
+    </w:r>
+    <w:r>
+      <w:rPr>
+        <w:rFonts w:ascii="Times New Roman" w:hAnsi="Times New Roman" w:eastAsia="Times New Roman"/>
+        <w:b w:val="0"/>
+        <w:color w:val="666666"/>
+        <w:sz w:val="20"/>
+      </w:rPr>
+      <w:t xml:space="preserve"> / Tong </w:t>
+    </w:r>
+    <w:r>
+      <w:fldChar w:fldCharType="begin"/>
+    </w:r>
+    <w:r>
+      <w:instrText xml:space="preserve"> NUMPAGES </w:instrText>
+    </w:r>
+    <w:r>
+      <w:fldChar w:fldCharType="end"/>
+    </w:r>
+  </w:p>
+</w:ftr>
+</file>
+
+<file path=word/header1.xml><?xml version="1.0" encoding="utf-8"?>
+<w:hdr xmlns:m="http://schemas.openxmlformats.org/officeDocument/2006/math" xmlns:mc="http://schemas.openxmlformats.org/markup-compatibility/2006" xmlns:mo="http://schemas.microsoft.com/office/mac/office/2008/main" xmlns:mv="urn:schemas-microsoft-com:mac:vml" xmlns:o="urn:schemas-microsoft-com:office:office" xmlns:r="http://schemas.openxmlformats.org/officeDocument/2006/relationships" xmlns:v="urn:schemas-microsoft-com:vml" xmlns:w10="urn:schemas-microsoft-com:office:word" xmlns:w14="http://schemas.microsoft.com/office/word/2010/wordml" xmlns:w="http://schemas.openxmlformats.org/wordprocessingml/2006/main" xmlns:wne="http://schemas.microsoft.com/office/word/2006/wordml" xmlns:wp14="http://schemas.microsoft.com/office/word/2010/wordprocessingDrawing" xmlns:wp="http://schemas.openxmlformats.org/drawingml/2006/wordprocessingDrawing" xmlns:wpc="http://schemas.microsoft.com/office/word/2010/wordprocessingCanvas" xmlns:wpg="http://schemas.microsoft.com/office/word/2010/wordprocessingGroup" xmlns:wpi="http://schemas.microsoft.com/office/word/2010/wordprocessingInk" xmlns:wps="http://schemas.microsoft.com/office/word/2010/wordprocessingShape" mc:Ignorable="w14 wp14">
+  <w:p>
+    <w:pPr>
+      <w:pStyle w:val="Header"/>
+      <w:jc w:val="center"/>
+    </w:pPr>
+    <w:r>
+      <w:rPr>
+        <w:rFonts w:ascii="Times New Roman" w:hAnsi="Times New Roman" w:eastAsia="Times New Roman"/>
+        <w:b w:val="0"/>
+        <w:color w:val="666666"/>
+        <w:sz w:val="20"/>
+      </w:rPr>
+      <w:t>AutoCheck - Doi thi [Ten doi] - Hackathon DMST 2026</w:t>
+    </w:r>
+  </w:p>
+</w:hdr>
 </file>
 
 <file path=word/numbering.xml><?xml version="1.0" encoding="utf-8"?>

</xml_diff>